<commit_message>
Docs: Update Word and text presentation guides to complete 7-chapter structure mapped to MedTrack
</commit_message>
<xml_diff>
--- a/Poin Poin dan Pemahaman Untuk Presentasi (Hasil Edit).docx
+++ b/Poin Poin dan Pemahaman Untuk Presentasi (Hasil Edit).docx
@@ -11,14 +11,14 @@
         <w:rPr>
           <w:b/>
           <w:color w:val="0A3A60"/>
-          <w:sz w:val="44"/>
+          <w:sz w:val="40"/>
         </w:rPr>
-        <w:t>🏥 PANDUAN PENDALAMAN TEKNIS PROJEK MEDTRACK</w:t>
+        <w:t>🏥 PANDUAN DETAIL PEMAHAMAN TEKNIS PROJEK AKHIR (MEDTRACK)</w:t>
       </w:r>
     </w:p>
     <w:p>
       <w:pPr>
-        <w:spacing w:after="480"/>
+        <w:spacing w:after="400"/>
         <w:jc w:val="center"/>
       </w:pPr>
       <w:r>
@@ -27,7 +27,7 @@
           <w:color w:val="64748B"/>
           <w:sz w:val="22"/>
         </w:rPr>
-        <w:t>Materi Pendalaman Struktur Kode, Alur Data, Otorisasi Peran, dan Integrasi Laravel + React Inertia Khusus untuk Menjawab Pertanyaan Dosen Penguji</w:t>
+        <w:t>Materi Pendalaman Struktur Kode, Alur Data, Otorisasi Peran, dan Integrasi Laravel + React Inertia Khusus untuk Menjawab Pertanyaan Dosen Penguji secara Rinci</w:t>
       </w:r>
     </w:p>
     <w:p>
@@ -40,9 +40,9 @@
         <w:rPr>
           <w:b/>
           <w:color w:val="0A3A60"/>
-          <w:sz w:val="32"/>
+          <w:sz w:val="28"/>
         </w:rPr>
-        <w:t>BAB I: Bedah Struktur Direktori Proyek (Laravel + React Inertia)</w:t>
+        <w:t>BAB I: BEDAH STRUKTUR DIREKTORI PROYEK (LARAVEL + REACT INERTIA)</w:t>
       </w:r>
     </w:p>
     <w:p>
@@ -50,20 +50,20 @@
         <w:spacing w:after="120" w:line="276" w:lineRule="auto"/>
       </w:pPr>
       <w:r>
-        <w:t>Proyek MedTrack ini menggunakan arsitektur Hybrid Monolith dengan Inertia.js sebagai jembatan. Logika bisnis backend menggunakan PHP (Laravel 10) dan tampilan frontend menggunakan Javascript/React.js.</w:t>
+        <w:t>Dosen sering menanyakan di mana letak logika bisnis, di mana letak rute, dan bagaimana kode frontend bisa menyatu dengan backend. Berikut adalah rincian fungsional struktur folder proyek:</w:t>
       </w:r>
     </w:p>
     <w:p>
       <w:pPr>
         <w:pStyle w:val="Heading2"/>
         <w:keepNext/>
-        <w:spacing w:before="280" w:after="120"/>
+        <w:spacing w:before="240" w:after="120"/>
       </w:pPr>
       <w:r>
         <w:rPr>
           <w:b/>
           <w:color w:val="1A5685"/>
-          <w:sz w:val="26"/>
+          <w:sz w:val="24"/>
         </w:rPr>
         <w:t>Sisi Backend (Laravel 10)</w:t>
       </w:r>
@@ -81,7 +81,23 @@
         <w:t>app/Http/Controllers/Web/</w:t>
       </w:r>
       <w:r>
-        <w:t xml:space="preserve"> - Tempat menyimpan kelas logika kontroler web. Menghubungkan Model ke React Page via Inertia rendering.</w:t>
+        <w:t xml:space="preserve"> - Tempat menyimpan kelas kontroler. Controller bertugas mengambil data dari Model dan merendernya ke tampilan menggunakan Inertia.</w:t>
+      </w:r>
+    </w:p>
+    <w:p>
+      <w:pPr>
+        <w:pStyle w:val="ListBullet"/>
+        <w:spacing w:after="80" w:line="276" w:lineRule="auto"/>
+        <w:ind w:left="360"/>
+      </w:pPr>
+      <w:r>
+        <w:rPr>
+          <w:b/>
+        </w:rPr>
+        <w:t>app/Http/Controllers/Api/</w:t>
+      </w:r>
+      <w:r>
+        <w:t xml:space="preserve"> - Berisi file AuthController, AsetController, RuanganController, MutasiController, dll. untuk melayani request mobile Android dalam format JSON.</w:t>
       </w:r>
     </w:p>
     <w:p>
@@ -97,7 +113,7 @@
         <w:t>app/Models/</w:t>
       </w:r>
       <w:r>
-        <w:t xml:space="preserve"> - Berisi file model Eloquent (User.php, Aset.php, Ruangan.php, Troubleshoot.php, TroubleshootLog.php, Mutasi.php, Pemeliharaan.php, PemeliharaanLog.php, DokumenMutu.php) yang memetakan tabel MySQL secara relasional.</w:t>
+        <w:t xml:space="preserve"> - Berisi Model Eloquent (User.php, Aset.php, Ruangan.php, Mutasi.php, Troubleshoot.php, TroubleshootLog.php, Pemeliharaan.php, PemeliharaanLog.php, DokumenMutu.php) yang memetakan tabel database MySQL secara objek ORM.</w:t>
       </w:r>
     </w:p>
     <w:p>
@@ -110,10 +126,26 @@
         <w:rPr>
           <w:b/>
         </w:rPr>
-        <w:t>app/Http/Middleware/HandleInertiaRequests.php</w:t>
+        <w:t>database/migrations/</w:t>
       </w:r>
       <w:r>
-        <w:t xml:space="preserve"> - Berkas konfigurasi shared props global, digunakan untuk mengirim data dinamis (seperti data notifikasi header dan upcoming agenda) agar terakses di seluruh halaman.</w:t>
+        <w:t xml:space="preserve"> - Skema pembuatan tabel database beserta relasi foreign key.</w:t>
+      </w:r>
+    </w:p>
+    <w:p>
+      <w:pPr>
+        <w:pStyle w:val="ListBullet"/>
+        <w:spacing w:after="80" w:line="276" w:lineRule="auto"/>
+        <w:ind w:left="360"/>
+      </w:pPr>
+      <w:r>
+        <w:rPr>
+          <w:b/>
+        </w:rPr>
+        <w:t>database/seeders/</w:t>
+      </w:r>
+      <w:r>
+        <w:t xml:space="preserve"> - Menyimpan data awal bawaan (akun user dengan role berbeda, ruangan, dan data aset dummy).</w:t>
       </w:r>
     </w:p>
     <w:p>
@@ -129,7 +161,7 @@
         <w:t>routes/web.php</w:t>
       </w:r>
       <w:r>
-        <w:t xml:space="preserve"> - Rute akses web terproteksi authentication session.</w:t>
+        <w:t xml:space="preserve"> - Menyimpan rute akses web client yang dilindungi oleh middleware 'auth' (mengharuskan login session). Rute mengarah ke controller Inertia.</w:t>
       </w:r>
     </w:p>
     <w:p>
@@ -145,22 +177,22 @@
         <w:t>routes/api.php</w:t>
       </w:r>
       <w:r>
-        <w:t xml:space="preserve"> - Rute REST API terproteksi token Laravel Sanctum untuk integrasi aplikasi GPS tracker Android.</w:t>
+        <w:t xml:space="preserve"> - Menyimpan rute REST API untuk Android. Rute login bersifat publik, sedangkan rute lainnya dilindungi middleware 'auth:sanctum' (wajib menyertakan token).</w:t>
       </w:r>
     </w:p>
     <w:p>
       <w:pPr>
         <w:pStyle w:val="Heading2"/>
         <w:keepNext/>
-        <w:spacing w:before="280" w:after="120"/>
+        <w:spacing w:before="240" w:after="120"/>
       </w:pPr>
       <w:r>
         <w:rPr>
           <w:b/>
           <w:color w:val="1A5685"/>
-          <w:sz w:val="26"/>
+          <w:sz w:val="24"/>
         </w:rPr>
-        <w:t>Sisi Frontend (React.js + Tailwind CSS)</w:t>
+        <w:t>Sisi Frontend (React.js + Tailwind)</w:t>
       </w:r>
     </w:p>
     <w:p>
@@ -176,7 +208,7 @@
         <w:t>resources/js/Pages/</w:t>
       </w:r>
       <w:r>
-        <w:t xml:space="preserve"> - Folder halaman tampilan utama. Setiap file (seperti Aset/Index.jsx, WorkOrder/Index.jsx, Mutasi/Index.jsx) merender antarmuka halaman web secara dinamis.</w:t>
+        <w:t xml:space="preserve"> - Halaman antarmuka pengguna (Views). Setiap berkas di sini (seperti Dashboard.jsx, Aset/Index.jsx, WorkOrder/Index.jsx, Mutasi/Index.jsx) adalah komponen React utuh yang merender UI halaman web.</w:t>
       </w:r>
     </w:p>
     <w:p>
@@ -192,7 +224,7 @@
         <w:t>resources/js/Layouts/AuthenticatedLayout.jsx</w:t>
       </w:r>
       <w:r>
-        <w:t xml:space="preserve"> - Komponen Layout utama pembungkus seluruh halaman setelah login. Mengatur sidebar, header, lonceng notifikasi dinamis, modal scan QR Code, dan kalender harian.</w:t>
+        <w:t xml:space="preserve"> - Kerangka halaman utama (Sidebar, Topbar, Profile Info, Lonceng Notifikasi, Kalender Agenda) yang membungkus semua halaman setelah login.</w:t>
       </w:r>
     </w:p>
     <w:p>
@@ -205,10 +237,10 @@
         <w:rPr>
           <w:b/>
         </w:rPr>
-        <w:t>resources/js/Components/</w:t>
+        <w:t>resources/js/app.jsx</w:t>
       </w:r>
       <w:r>
-        <w:t xml:space="preserve"> - Folder komponen UI kecil yang dapat dipanggil berulang (reusable components) seperti Dropdown.jsx, Modal.jsx, TextInput.jsx.</w:t>
+        <w:t xml:space="preserve"> - Entri utama JavaScript tempat Inertia dikonfigurasi untuk memuat komponen React dari folder Pages secara dinamis.</w:t>
       </w:r>
     </w:p>
     <w:p>
@@ -221,24 +253,24 @@
         <w:rPr>
           <w:b/>
           <w:color w:val="0A3A60"/>
-          <w:sz w:val="32"/>
+          <w:sz w:val="28"/>
         </w:rPr>
-        <w:t>BAB II: Alur Pertukaran Data dan Siklus Request-Response</w:t>
+        <w:t>BAB II: ALUR DATA DAN REQUEST-RESPONSE LIFECYCLE (BAGAIMANA APLIKASI BEKERJA)</w:t>
       </w:r>
     </w:p>
     <w:p>
       <w:pPr>
         <w:pStyle w:val="Heading2"/>
         <w:keepNext/>
-        <w:spacing w:before="280" w:after="120"/>
+        <w:spacing w:before="240" w:after="120"/>
       </w:pPr>
       <w:r>
         <w:rPr>
           <w:b/>
           <w:color w:val="1A5685"/>
-          <w:sz w:val="26"/>
+          <w:sz w:val="24"/>
         </w:rPr>
-        <w:t>Siklus Web Request (Inertia.js)</w:t>
+        <w:t>Siklus Request Web (Menggunakan Protokol Inertia.js)</w:t>
       </w:r>
     </w:p>
     <w:p>
@@ -246,7 +278,7 @@
         <w:spacing w:after="120" w:line="276" w:lineRule="auto"/>
       </w:pPr>
       <w:r>
-        <w:t>Inertia meniadakan kebutuhan REST API internal untuk web client. Alur kerjanya:</w:t>
+        <w:t>Inertia bertindak sebagai jembatan. Alur kerja ketika pengguna mengakses halaman Aset Medis adalah sebagai berikut:</w:t>
       </w:r>
     </w:p>
     <w:p>
@@ -256,7 +288,7 @@
         <w:ind w:left="360"/>
       </w:pPr>
       <w:r>
-        <w:t>Pengguna mengklik tombol menu 'Aset Medis' di sidebar.</w:t>
+        <w:t>Pengguna mengklik menu 'Aset Medis' di Sidebar.</w:t>
       </w:r>
     </w:p>
     <w:p>
@@ -266,7 +298,7 @@
         <w:ind w:left="360"/>
       </w:pPr>
       <w:r>
-        <w:t>Inertia mengirimkan request XHR/AJAX di latar belakang ke URL /aset.</w:t>
+        <w:t>Browser mengirimkan request internal (Inertia request) ke rute /aset.</w:t>
       </w:r>
     </w:p>
     <w:p>
@@ -276,17 +308,17 @@
         <w:ind w:left="360"/>
       </w:pPr>
       <w:r>
-        <w:t>Laravel memproses di AsetController@index, melakukan query database via Eloquent model, lalu mengembalikan Inertia rendering:</w:t>
+        <w:t>Laravel mencocokkan rute di web.php dan memanggil AsetController@index.</w:t>
       </w:r>
     </w:p>
     <w:p>
       <w:pPr>
         <w:pStyle w:val="ListBullet"/>
         <w:spacing w:after="80" w:line="276" w:lineRule="auto"/>
-        <w:ind w:left="720"/>
+        <w:ind w:left="360"/>
       </w:pPr>
       <w:r>
-        <w:t>return Inertia::render('Aset/Index', ['asets' =&gt; $asets]);</w:t>
+        <w:t>AsetController melakukan query database melalui Eloquent: Aset::with('ruangan')-&gt;get().</w:t>
       </w:r>
     </w:p>
     <w:p>
@@ -296,22 +328,42 @@
         <w:ind w:left="360"/>
       </w:pPr>
       <w:r>
-        <w:t>Inertia menangkap data payload JSON tersebut, lalu me-render komponen React terkait (Aset/Index.jsx) secara dinamis tanpa refresh halaman penuh (Single Page Application experience).</w:t>
+        <w:t>Controller mengembalikan respon: return Inertia::render('Aset/Index', ['asets' =&gt; $asets]);</w:t>
       </w:r>
     </w:p>
     <w:p>
       <w:pPr>
+        <w:pStyle w:val="ListBullet"/>
+        <w:spacing w:after="80" w:line="276" w:lineRule="auto"/>
+        <w:ind w:left="360"/>
+      </w:pPr>
+      <w:r>
+        <w:t>Inertia menangkap kembalian tersebut, lalu mengirimkan payload berupa data JSON (bukan HTML mentah) ke frontend.</w:t>
+      </w:r>
+    </w:p>
+    <w:p>
+      <w:pPr>
+        <w:pStyle w:val="ListBullet"/>
+        <w:spacing w:after="80" w:line="276" w:lineRule="auto"/>
+        <w:ind w:left="360"/>
+      </w:pPr>
+      <w:r>
+        <w:t>Komponen React di resources/js/Pages/Aset/Index.jsx menerima data tersebut melalui props (asets) lalu merendernya secara dinamis di browser tanpa refresh halaman penuh.</w:t>
+      </w:r>
+    </w:p>
+    <w:p>
+      <w:pPr>
         <w:pStyle w:val="Heading2"/>
         <w:keepNext/>
-        <w:spacing w:before="280" w:after="120"/>
+        <w:spacing w:before="240" w:after="120"/>
       </w:pPr>
       <w:r>
         <w:rPr>
           <w:b/>
           <w:color w:val="1A5685"/>
-          <w:sz w:val="26"/>
+          <w:sz w:val="24"/>
         </w:rPr>
-        <w:t>Siklus REST API Mobile (Laravel Sanctum)</w:t>
+        <w:t>Siklus Request API Mobile (Laravel Sanctum)</w:t>
       </w:r>
     </w:p>
     <w:p>
@@ -319,7 +371,7 @@
         <w:spacing w:after="120" w:line="276" w:lineRule="auto"/>
       </w:pPr>
       <w:r>
-        <w:t>Digunakan khusus untuk mengintegrasikan database server web dengan aplikasi pelacak lokasi Android:</w:t>
+        <w:t>Alur kerja ketika aplikasi Android pelacak lokasi mengirim data ke server:</w:t>
       </w:r>
     </w:p>
     <w:p>
@@ -329,7 +381,7 @@
         <w:ind w:left="360"/>
       </w:pPr>
       <w:r>
-        <w:t>Aplikasi Android mengirim request POST ke /api/login dengan parameter email dan password.</w:t>
+        <w:t>Aplikasi Android mengirim HTTP POST request ke http://alamat-server/api/tracking.</w:t>
       </w:r>
     </w:p>
     <w:p>
@@ -339,7 +391,7 @@
         <w:ind w:left="360"/>
       </w:pPr>
       <w:r>
-        <w:t>Laravel mencocokkan kredensial. Jika sukses, Sanctum mengembalikan token string acak.</w:t>
+        <w:t>Android menyertakan header Authorization: Bearer {token} yang diperoleh saat login.</w:t>
       </w:r>
     </w:p>
     <w:p>
@@ -349,7 +401,27 @@
         <w:ind w:left="360"/>
       </w:pPr>
       <w:r>
-        <w:t>Android menyimpan token secara lokal. Setiap kali mengirim koordinat GPS baru ke server, Android menyertakan header 'Authorization: Bearer &lt;token&gt;' untuk divalidasi oleh Sanctum.</w:t>
+        <w:t>Laravel mencocokkan rute di routes/api.php dan memprosesnya melalui middleware auth:sanctum.</w:t>
+      </w:r>
+    </w:p>
+    <w:p>
+      <w:pPr>
+        <w:pStyle w:val="ListBullet"/>
+        <w:spacing w:after="80" w:line="276" w:lineRule="auto"/>
+        <w:ind w:left="360"/>
+      </w:pPr>
+      <w:r>
+        <w:t>Middleware memverifikasi keaslian token pada tabel personal_access_tokens di database.</w:t>
+      </w:r>
+    </w:p>
+    <w:p>
+      <w:pPr>
+        <w:pStyle w:val="ListBullet"/>
+        <w:spacing w:after="80" w:line="276" w:lineRule="auto"/>
+        <w:ind w:left="360"/>
+      </w:pPr>
+      <w:r>
+        <w:t>Jika valid, request diteruskan ke Api\AsetController@updateTracking yang menyimpan koordinat GPS terbaru ke database.</w:t>
       </w:r>
     </w:p>
     <w:p>
@@ -362,65 +434,123 @@
         <w:rPr>
           <w:b/>
           <w:color w:val="0A3A60"/>
-          <w:sz w:val="32"/>
+          <w:sz w:val="28"/>
         </w:rPr>
-        <w:t>BAB III: Kebijakan Otorisasi Peran (Role-Based Access Control)</w:t>
+        <w:t>BAB III: BEDAH LOGIKA DAN KODE CRITICAL (PERTANYAAN KHUSUS DOSEN)</w:t>
       </w:r>
     </w:p>
     <w:p>
       <w:pPr>
-        <w:spacing w:after="120" w:line="276" w:lineRule="auto"/>
+        <w:pStyle w:val="Heading2"/>
+        <w:keepNext/>
+        <w:spacing w:before="240" w:after="120"/>
       </w:pPr>
       <w:r>
-        <w:t>MedTrack membagi kewenangan pengguna ke dalam 3 role utama demi menjaga integritas data rumah sakit:</w:t>
+        <w:rPr>
+          <w:b/>
+          <w:color w:val="1A5685"/>
+          <w:sz w:val="24"/>
+        </w:rPr>
+        <w:t>Logika Mutasi Aset &amp; Keamanan Database Transactions</w:t>
       </w:r>
     </w:p>
     <w:p>
       <w:pPr>
+        <w:spacing w:after="120" w:line="276" w:lineRule="auto"/>
+      </w:pPr>
+      <w:r>
+        <w:t>Fokus Pembahasan: Pertanyaan Dosen: 'Bagaimana logika mutasi alat medis dan bagaimana Anda menjamin konsistensi?'</w:t>
+      </w:r>
+    </w:p>
+    <w:p>
+      <w:pPr>
+        <w:spacing w:after="120" w:line="276" w:lineRule="auto"/>
+      </w:pPr>
+      <w:r>
+        <w:t>Di dalam file MutasiController.php, transaksi dilakukan di dalam blok DB::transaction(). Hal ini penting untuk memastikan sifat Atomicity (semua berhasil atau tidak sama sekali):</w:t>
+      </w:r>
+    </w:p>
+    <w:p>
+      <w:pPr>
         <w:pStyle w:val="ListBullet"/>
         <w:spacing w:after="80" w:line="276" w:lineRule="auto"/>
         <w:ind w:left="360"/>
       </w:pPr>
       <w:r>
-        <w:rPr>
-          <w:b/>
-        </w:rPr>
-        <w:t xml:space="preserve">1. IPSRS (Admin_IPSRS / Staf_IPSRS): </w:t>
-      </w:r>
-      <w:r>
-        <w:t>Memiliki wewenang penuh atas kelayakan aset, kalender reschedule, alur verifikasi mutasi, dan penunjukan teknisi perbaikan.</w:t>
+        <w:t>Sistem memverifikasi status aset dan ruangan tujuan.</w:t>
       </w:r>
     </w:p>
     <w:p>
       <w:pPr>
         <w:pStyle w:val="ListBullet"/>
         <w:spacing w:after="80" w:line="276" w:lineRule="auto"/>
-        <w:ind w:left="720"/>
+        <w:ind w:left="360"/>
+      </w:pPr>
+      <w:r>
+        <w:t>Jika validasi lolos, jalankan DB::transaction(function() { ... })</w:t>
+      </w:r>
+    </w:p>
+    <w:p>
+      <w:pPr>
+        <w:pStyle w:val="ListBullet"/>
+        <w:spacing w:after="80" w:line="276" w:lineRule="auto"/>
+        <w:ind w:left="360"/>
+      </w:pPr>
+      <w:r>
+        <w:t>Sistem memperbarui kolom id_ruang_saat_ini pada tabel t_aset.</w:t>
+      </w:r>
+    </w:p>
+    <w:p>
+      <w:pPr>
+        <w:pStyle w:val="ListBullet"/>
+        <w:spacing w:after="80" w:line="276" w:lineRule="auto"/>
+        <w:ind w:left="360"/>
+      </w:pPr>
+      <w:r>
+        <w:t>Sistem mencatat riwayat log mutasi ke tabel t_mutasi.</w:t>
+      </w:r>
+    </w:p>
+    <w:p>
+      <w:pPr>
+        <w:pStyle w:val="ListBullet"/>
+        <w:spacing w:after="80" w:line="276" w:lineRule="auto"/>
+        <w:ind w:left="360"/>
+      </w:pPr>
+      <w:r>
+        <w:t>Jika terjadi error di tengah proses (misalnya koneksi putus saat menyimpan log mutasi), Laravel otomatis membatalkan pembaruan ruangan pada aset (Rollback) agar data tetap konsisten.</w:t>
+      </w:r>
+    </w:p>
+    <w:p>
+      <w:pPr>
+        <w:pStyle w:val="Heading2"/>
+        <w:keepNext/>
+        <w:spacing w:before="240" w:after="120"/>
       </w:pPr>
       <w:r>
         <w:rPr>
           <w:b/>
+          <w:color w:val="1A5685"/>
+          <w:sz w:val="24"/>
         </w:rPr>
-        <w:t xml:space="preserve">Khusus Teknisi Lapangan (Budi, Hendra, Agus): </w:t>
-      </w:r>
-      <w:r>
-        <w:t>Username budi_ipsrs, hendra_ipsrs, dan agus_ipsrs otomatis dibatasi di controller. Mereka tidak boleh melakukan CRUD aset/ruangan/SDM dan tidak bisa assign teknisi. Mereka hanya diperbolehkan meng-update status progres Work Order (seperti mengubah Open -&gt; Dikerjakan -&gt; Selesai).</w:t>
+        <w:t>Logika Work Order (Alur Pelaporan Kerusakan)</w:t>
       </w:r>
     </w:p>
     <w:p>
       <w:pPr>
+        <w:spacing w:after="120" w:line="276" w:lineRule="auto"/>
+      </w:pPr>
+      <w:r>
+        <w:t>Fokus Pembahasan: Pertanyaan Dosen: 'Bagaimana alur pelaporan kerusakan dan penugasan teknisi?'</w:t>
+      </w:r>
+    </w:p>
+    <w:p>
+      <w:pPr>
         <w:pStyle w:val="ListBullet"/>
         <w:spacing w:after="80" w:line="276" w:lineRule="auto"/>
         <w:ind w:left="360"/>
       </w:pPr>
       <w:r>
-        <w:rPr>
-          <w:b/>
-        </w:rPr>
-        <w:t xml:space="preserve">2. Staf_Logistik: </w:t>
-      </w:r>
-      <w:r>
-        <w:t>Membantu mencatat pengadaan aset baru dan dokumen mutu. Staf Logistik tidak diizinkan mengedit atau menghapus aset, serta tidak berwenang menyetujui mutasi.</w:t>
+        <w:t>Pengguna dengan peran 'Unit_RS' mengirimkan laporan kerusakan alat dari unitnya. Status awal diset default ke 'Open'.</w:t>
       </w:r>
     </w:p>
     <w:p>
@@ -430,29 +560,88 @@
         <w:ind w:left="360"/>
       </w:pPr>
       <w:r>
-        <w:rPr>
-          <w:b/>
-        </w:rPr>
-        <w:t xml:space="preserve">3. Unit_RS (Kepala/Staf Ruangan Medis): </w:t>
-      </w:r>
-      <w:r>
-        <w:t>Halaman dasbor dan aset terfilter otomatis hanya menampilkan data di unit/ruangan tempat mereka bertugas (misal staf ICU hanya melihat alat ICU). Staf Unit dapat membuat laporan kerusakan (Work Order) dan mengajukan mutasi alat keluar ruangan.</w:t>
+        <w:t>Pengguna dengan peran 'Admin_IPSRS' masuk ke menu Work Order, melihat tiket 'Open' tersebut, lalu menunjuk teknisi penanggungjawab.</w:t>
       </w:r>
     </w:p>
     <w:p>
       <w:pPr>
         <w:pStyle w:val="ListBullet"/>
         <w:spacing w:after="80" w:line="276" w:lineRule="auto"/>
-        <w:ind w:left="720"/>
+        <w:ind w:left="360"/>
+      </w:pPr>
+      <w:r>
+        <w:t>Teknisi lapangan (Budi, Hendra, Agus) masuk dengan akun mereka. Mereka hanya bisa melihat daftar tugas mereka dan memperbarui progres status (Open -&gt; Dikerjakan -&gt; Menunggu Sign-Off).</w:t>
+      </w:r>
+    </w:p>
+    <w:p>
+      <w:pPr>
+        <w:pStyle w:val="ListBullet"/>
+        <w:spacing w:after="80" w:line="276" w:lineRule="auto"/>
+        <w:ind w:left="360"/>
+      </w:pPr>
+      <w:r>
+        <w:t>Setelah selesai, status diset menjadi 'Closed' setelah divalidasi.</w:t>
+      </w:r>
+    </w:p>
+    <w:p>
+      <w:pPr>
+        <w:pStyle w:val="Heading2"/>
+        <w:keepNext/>
+        <w:spacing w:before="240" w:after="120"/>
       </w:pPr>
       <w:r>
         <w:rPr>
           <w:b/>
+          <w:color w:val="1A5685"/>
+          <w:sz w:val="24"/>
         </w:rPr>
-        <w:t xml:space="preserve">Pengecualian Scan QR Global: </w:t>
+        <w:t>Pengelolaan Laporan Cetak PDF (Print-Friendly CSS)</w:t>
       </w:r>
+    </w:p>
+    <w:p>
+      <w:pPr>
+        <w:spacing w:after="120" w:line="276" w:lineRule="auto"/>
+      </w:pPr>
       <w:r>
-        <w:t>Saat melakukan pencarian atau pemindaian QR Code label, filter ruangan dimatikan sementara agar staf unit tetap dapat melihat informasi detail alat milik unit lainnya.</w:t>
+        <w:t>Fokus Pembahasan: Pertanyaan Dosen: 'Bagaimana laporan dicetak menjadi PDF?'</w:t>
+      </w:r>
+    </w:p>
+    <w:p>
+      <w:pPr>
+        <w:spacing w:after="120" w:line="276" w:lineRule="auto"/>
+      </w:pPr>
+      <w:r>
+        <w:t>Di halaman resources/js/Pages/Aset/Index.jsx, tombol 'Cetak' memicu window.print(). Kita menggunakan utility class Tailwind CSS khusus cetak:</w:t>
+      </w:r>
+    </w:p>
+    <w:p>
+      <w:pPr>
+        <w:pStyle w:val="ListBullet"/>
+        <w:spacing w:after="80" w:line="276" w:lineRule="auto"/>
+        <w:ind w:left="360"/>
+      </w:pPr>
+      <w:r>
+        <w:t>print:hidden -&gt; Menyembunyikan sidebar, topbar, dan tombol aksi cetak saat proses print PDF berlangsung.</w:t>
+      </w:r>
+    </w:p>
+    <w:p>
+      <w:pPr>
+        <w:pStyle w:val="ListBullet"/>
+        <w:spacing w:after="80" w:line="276" w:lineRule="auto"/>
+        <w:ind w:left="360"/>
+      </w:pPr>
+      <w:r>
+        <w:t>print:block -&gt; Memunculkan Kop Laporan resmi yang disembunyikan di layar monitor biasa.</w:t>
+      </w:r>
+    </w:p>
+    <w:p>
+      <w:pPr>
+        <w:pStyle w:val="ListBullet"/>
+        <w:spacing w:after="80" w:line="276" w:lineRule="auto"/>
+        <w:ind w:left="360"/>
+      </w:pPr>
+      <w:r>
+        <w:t>print:shadow-none &amp; print:border-none -&gt; Menghilangkan bayangan dan border dekoratif agar hasil cetak PDF bersih.</w:t>
       </w:r>
     </w:p>
     <w:p>
@@ -465,24 +654,24 @@
         <w:rPr>
           <w:b/>
           <w:color w:val="0A3A60"/>
-          <w:sz w:val="32"/>
+          <w:sz w:val="28"/>
         </w:rPr>
-        <w:t>BAB IV: Bedah Logika Kodingan Kritis</w:t>
+        <w:t>BAB IV: BEDAH DETAIL FILE KODE PROGRAM (FUNGSI DAN PENJELASAN KODE)</w:t>
       </w:r>
     </w:p>
     <w:p>
       <w:pPr>
         <w:pStyle w:val="Heading2"/>
         <w:keepNext/>
-        <w:spacing w:before="280" w:after="120"/>
+        <w:spacing w:before="240" w:after="120"/>
       </w:pPr>
       <w:r>
         <w:rPr>
           <w:b/>
           <w:color w:val="1A5685"/>
-          <w:sz w:val="26"/>
+          <w:sz w:val="24"/>
         </w:rPr>
-        <w:t>Notifikasi Lonceng Dinamis di Layout Header</w:t>
+        <w:t>File Migrasi Database</w:t>
       </w:r>
     </w:p>
     <w:p>
@@ -490,7 +679,7 @@
         <w:spacing w:after="120" w:line="276" w:lineRule="auto"/>
       </w:pPr>
       <w:r>
-        <w:t>Notifikasi dikumpulkan secara global di HandleInertiaRequests.php berdasarkan role pengguna:</w:t>
+        <w:t>Mendefinisikan skema tabel database MySQL secara relasional:</w:t>
       </w:r>
     </w:p>
     <w:p>
@@ -500,7 +689,7 @@
         <w:ind w:left="360"/>
       </w:pPr>
       <w:r>
-        <w:t>IPSRS: Notifikasi permohonan mutasi pending, laporan kerusakan baru (Open WO), dan PM terjadwal.</w:t>
+        <w:t>Tabel m_ruangan: Dibuat dengan kolom nama_ruang ber-constraint unique() agar tidak ada ruangan ganda.</w:t>
       </w:r>
     </w:p>
     <w:p>
@@ -510,7 +699,7 @@
         <w:ind w:left="360"/>
       </w:pPr>
       <w:r>
-        <w:t>Logistik: Notifikasi alat medis yang masa sertifikat kalibrasinya sudah kadaluarsa (expired).</w:t>
+        <w:t>Tabel t_aset: Memiliki kolom id_ruang sebagai foreign key yang dihubungkan ke m_ruangan menggunakan constrained('m_ruangan')-&gt;nullOnDelete().</w:t>
       </w:r>
     </w:p>
     <w:p>
@@ -520,32 +709,32 @@
         <w:ind w:left="360"/>
       </w:pPr>
       <w:r>
-        <w:t>Unit_RS: Notifikasi tiket laporan kerusakan aktif di ruangan unitnya yang sedang diproses.</w:t>
+        <w:t>Tabel t_mutasi: Melacak log perpindahan aset (id_aset, id_ruang_asal, id_ruang_tujuan).</w:t>
       </w:r>
     </w:p>
     <w:p>
       <w:pPr>
         <w:pStyle w:val="ListBullet"/>
         <w:spacing w:after="80" w:line="276" w:lineRule="auto"/>
-        <w:ind w:left="720"/>
+        <w:ind w:left="360"/>
       </w:pPr>
       <w:r>
-        <w:t>Fungsi Dismiss (Klik Hilang): Di frontend AuthenticatedLayout.jsx, saat notifikasi diklik, ID item disimpan ke localStorage. Notifikasi tersebut langsung hilang dari lonceng secara real-time dan browser mengarahkan pengguna ke halaman form tujuan.</w:t>
+        <w:t>Tabel t_troubleshoot: Melacak tiket kerusakan (id_aset, id_user_pelapor, id_teknisi_penanggungjawab, status_ticket).</w:t>
       </w:r>
     </w:p>
     <w:p>
       <w:pPr>
         <w:pStyle w:val="Heading2"/>
         <w:keepNext/>
-        <w:spacing w:before="280" w:after="120"/>
+        <w:spacing w:before="240" w:after="120"/>
       </w:pPr>
       <w:r>
         <w:rPr>
           <w:b/>
           <w:color w:val="1A5685"/>
-          <w:sz w:val="26"/>
+          <w:sz w:val="24"/>
         </w:rPr>
-        <w:t>Reschedule &amp; Sinkronisasi Kalibrasi Aset</w:t>
+        <w:t>File Model (app/Models/Aset.php)</w:t>
       </w:r>
     </w:p>
     <w:p>
@@ -553,22 +742,52 @@
         <w:spacing w:after="120" w:line="276" w:lineRule="auto"/>
       </w:pPr>
       <w:r>
-        <w:t>Saat admin mengubah tanggal kalibrasi melalui widget kalender agenda harian di sidebar, controller otomatis menyinkronkan tanggal kadaluarsa sertifikat kalibrasi (tgl_kadaluarsa_sertif) agar bernilai sama dengan tgl_kalibrasi_terakhir.</w:t>
+        <w:t>Model Eloquent bertindak sebagai perwakilan tabel database di pemrograman PHP berbasis objek:</w:t>
       </w:r>
     </w:p>
     <w:p>
       <w:pPr>
+        <w:pStyle w:val="ListBullet"/>
+        <w:spacing w:after="80" w:line="276" w:lineRule="auto"/>
+        <w:ind w:left="360"/>
+      </w:pPr>
+      <w:r>
+        <w:t>protected $fillable: Daftar kolom yang diizinkan untuk diisi secara massal (mass assignment).</w:t>
+      </w:r>
+    </w:p>
+    <w:p>
+      <w:pPr>
+        <w:pStyle w:val="ListBullet"/>
+        <w:spacing w:after="80" w:line="276" w:lineRule="auto"/>
+        <w:ind w:left="360"/>
+      </w:pPr>
+      <w:r>
+        <w:t>public function ruangan(): Mendefinisikan relasi belongsTo(Ruangan::class) untuk mendapatkan nama ruangan asal aset.</w:t>
+      </w:r>
+    </w:p>
+    <w:p>
+      <w:pPr>
+        <w:pStyle w:val="ListBullet"/>
+        <w:spacing w:after="80" w:line="276" w:lineRule="auto"/>
+        <w:ind w:left="360"/>
+      </w:pPr>
+      <w:r>
+        <w:t>public function troubleshoot(): Mendefinisikan relasi hasMany(Troubleshoot::class) untuk menarik riwayat kerusakan alat.</w:t>
+      </w:r>
+    </w:p>
+    <w:p>
+      <w:pPr>
         <w:pStyle w:val="Heading2"/>
         <w:keepNext/>
-        <w:spacing w:before="280" w:after="120"/>
+        <w:spacing w:before="240" w:after="120"/>
       </w:pPr>
       <w:r>
         <w:rPr>
           <w:b/>
           <w:color w:val="1A5685"/>
-          <w:sz w:val="26"/>
+          <w:sz w:val="24"/>
         </w:rPr>
-        <w:t>Mutasi Lintas Ruangan yang Fleksibel</w:t>
+        <w:t>File Controller Aset (app/Http/Controllers/Web/AsetController.php)</w:t>
       </w:r>
     </w:p>
     <w:p>
@@ -576,7 +795,119 @@
         <w:spacing w:after="120" w:line="276" w:lineRule="auto"/>
       </w:pPr>
       <w:r>
-        <w:t>Di MutasiController, filter ruangan asal Unit_RS dilepas, memungkinkan unit medis untuk memilih dan mengajukan mutasi/pemindahan bagi seluruh aset medis di rumah sakit (tidak dibatasi di ruangannya saja).</w:t>
+        <w:t>Melayani CRUD aset medis dan pencarian global scan QR Code:</w:t>
+      </w:r>
+    </w:p>
+    <w:p>
+      <w:pPr>
+        <w:pStyle w:val="ListBullet"/>
+        <w:spacing w:after="80" w:line="276" w:lineRule="auto"/>
+        <w:ind w:left="360"/>
+      </w:pPr>
+      <w:r>
+        <w:t>Proteksi Peran (Role Checking): Menggunakan method checkCanCreate() dan checkCanEditOrDelete() untuk memblokir Staf_Logistik dari aksi Edit/Hapus, memblokir Unit_RS sepenuhnya, serta memblokir teknisi budi_ipsrs, hendra_ipsrs, dan agus_ipsrs dari operasi CRUD.</w:t>
+      </w:r>
+    </w:p>
+    <w:p>
+      <w:pPr>
+        <w:pStyle w:val="ListBullet"/>
+        <w:spacing w:after="80" w:line="276" w:lineRule="auto"/>
+        <w:ind w:left="360"/>
+      </w:pPr>
+      <w:r>
+        <w:t>Pencarian Global: Menggunakan query search global yang mengabaikan filter unit jika ada input parameter search (scan QR Code).</w:t>
+      </w:r>
+    </w:p>
+    <w:p>
+      <w:pPr>
+        <w:pStyle w:val="Heading2"/>
+        <w:keepNext/>
+        <w:spacing w:before="240" w:after="120"/>
+      </w:pPr>
+      <w:r>
+        <w:rPr>
+          <w:b/>
+          <w:color w:val="1A5685"/>
+          <w:sz w:val="24"/>
+        </w:rPr>
+        <w:t>File Controller Mutasi (app/Http/Controllers/Web/MutasiController.php)</w:t>
+      </w:r>
+    </w:p>
+    <w:p>
+      <w:pPr>
+        <w:spacing w:after="120" w:line="276" w:lineRule="auto"/>
+      </w:pPr>
+      <w:r>
+        <w:t>Menangani pengajuan mutasi dan persetujuan (approval) oleh IPSRS menggunakan DB::transaction() untuk menjaga integritas data.</w:t>
+      </w:r>
+    </w:p>
+    <w:p>
+      <w:pPr>
+        <w:pStyle w:val="Heading2"/>
+        <w:keepNext/>
+        <w:spacing w:before="240" w:after="120"/>
+      </w:pPr>
+      <w:r>
+        <w:rPr>
+          <w:b/>
+          <w:color w:val="1A5685"/>
+          <w:sz w:val="24"/>
+        </w:rPr>
+        <w:t>File API Auth Controller (app/Http/Controllers/Api/AuthController.php)</w:t>
+      </w:r>
+    </w:p>
+    <w:p>
+      <w:pPr>
+        <w:spacing w:after="120" w:line="276" w:lineRule="auto"/>
+      </w:pPr>
+      <w:r>
+        <w:t>Menangani login dan pembuatan token khusus aplikasi Android Kotlin menggunakan Sanctum via method $user-&gt;createToken('device_name')-&gt;plainTextToken.</w:t>
+      </w:r>
+    </w:p>
+    <w:p>
+      <w:pPr>
+        <w:pStyle w:val="Heading2"/>
+        <w:keepNext/>
+        <w:spacing w:before="240" w:after="120"/>
+      </w:pPr>
+      <w:r>
+        <w:rPr>
+          <w:b/>
+          <w:color w:val="1A5685"/>
+          <w:sz w:val="24"/>
+        </w:rPr>
+        <w:t>File Page Aset (resources/js/Pages/Aset/Index.jsx)</w:t>
+      </w:r>
+    </w:p>
+    <w:p>
+      <w:pPr>
+        <w:spacing w:after="120" w:line="276" w:lineRule="auto"/>
+      </w:pPr>
+      <w:r>
+        <w:t>Komponen React utama untuk menampilkan aset medis. Dilengkapi filter pencarian, list kartu, scan QR Code terintegrasi webcam, dan detail pelacakan posisi peta.</w:t>
+      </w:r>
+    </w:p>
+    <w:p>
+      <w:pPr>
+        <w:pStyle w:val="Heading2"/>
+        <w:keepNext/>
+        <w:spacing w:before="240" w:after="120"/>
+      </w:pPr>
+      <w:r>
+        <w:rPr>
+          <w:b/>
+          <w:color w:val="1A5685"/>
+          <w:sz w:val="24"/>
+        </w:rPr>
+        <w:t>File Layout (resources/js/Layouts/AuthenticatedLayout.jsx)</w:t>
+      </w:r>
+    </w:p>
+    <w:p>
+      <w:pPr>
+        <w:spacing w:after="120" w:line="276" w:lineRule="auto"/>
+      </w:pPr>
+      <w:r>
+        <w:t>Menyediakan kerangka tampilan konsisten (sidebar dan header). Menampung widget notifikasi lonceng dinamis yang didistribusikan dari shared props, serta modal kamera scan QR Code.</w:t>
       </w:r>
     </w:p>
     <w:p>
@@ -589,25 +920,34 @@
         <w:rPr>
           <w:b/>
           <w:color w:val="0A3A60"/>
-          <w:sz w:val="32"/>
+          <w:sz w:val="28"/>
         </w:rPr>
-        <w:t>BAB V: Strategi Sidang &amp; Menjawab Pertanyaan Dosen Penguji</w:t>
+        <w:t>BAB V: PEMAHAMAN MENDALAM KONSEP TEKNOLOGI (LARAVEL, REACT, &amp; REST API)</w:t>
       </w:r>
     </w:p>
     <w:p>
       <w:pPr>
+        <w:pStyle w:val="Heading2"/>
+        <w:keepNext/>
+        <w:spacing w:before="240" w:after="120"/>
+      </w:pPr>
+      <w:r>
+        <w:rPr>
+          <w:b/>
+          <w:color w:val="1A5685"/>
+          <w:sz w:val="24"/>
+        </w:rPr>
+        <w:t>Laravel: Framework Backend PHP Modern</w:t>
+      </w:r>
+    </w:p>
+    <w:p>
+      <w:pPr>
         <w:pStyle w:val="ListBullet"/>
         <w:spacing w:after="80" w:line="276" w:lineRule="auto"/>
         <w:ind w:left="360"/>
       </w:pPr>
       <w:r>
-        <w:rPr>
-          <w:b/>
-        </w:rPr>
-        <w:t>Tanya: 'Apakah integrasi dengan aplikasi mobile Android menggunakan Session?'</w:t>
-      </w:r>
-      <w:r>
-        <w:t>Jawab: 'Tidak, Pak. Untuk integrasi web kami memakai Session Stateful, sedangkan untuk integrasi mobile Android kami menggunakan REST API Stateless yang diamankan oleh Laravel Sanctum Token demi fleksibilitas dan keamanan.'</w:t>
+        <w:t>Model-View-Controller (MVC): Pola arsitektur yang memisahkan data (Model), tampilan antarmuka (View/React), dan logika kontrol (Controller).</w:t>
       </w:r>
     </w:p>
     <w:p>
@@ -617,13 +957,7 @@
         <w:ind w:left="360"/>
       </w:pPr>
       <w:r>
-        <w:rPr>
-          <w:b/>
-        </w:rPr>
-        <w:t>Tanya: 'Mengapa teknisi lapangan tidak bisa mengedit data aset?'</w:t>
-      </w:r>
-      <w:r>
-        <w:t>Jawab: 'Hak akses CRUD data master aset dibatasi hanya untuk admin atau logistik demi keamanan data aset. Teknisi lapangan (Budi, Hendra, Agus) dibatasi hak aksesnya agar fokus pada tugas perbaikan di lapangan dan pengisian progres status perbaikan saja.'</w:t>
+        <w:t>Eloquent ORM: Teknik pemrograman untuk memetakan tabel database ke objek PHP (misal Aset::all()).</w:t>
       </w:r>
     </w:p>
     <w:p>
@@ -633,13 +967,374 @@
         <w:ind w:left="360"/>
       </w:pPr>
       <w:r>
+        <w:t>Middleware: Lapisan filter keamanan HTTP request (seperti memverifikasi login session atau token API).</w:t>
+      </w:r>
+    </w:p>
+    <w:p>
+      <w:pPr>
+        <w:pStyle w:val="ListBullet"/>
+        <w:spacing w:after="80" w:line="276" w:lineRule="auto"/>
+        <w:ind w:left="360"/>
+      </w:pPr>
+      <w:r>
+        <w:t>Database Transactions: Pengelompokan beberapa perintah query (commit dan rollback) untuk menjamin integritas data.</w:t>
+      </w:r>
+    </w:p>
+    <w:p>
+      <w:pPr>
+        <w:pStyle w:val="Heading2"/>
+        <w:keepNext/>
+        <w:spacing w:before="240" w:after="120"/>
+      </w:pPr>
+      <w:r>
         <w:rPr>
           <w:b/>
+          <w:color w:val="1A5685"/>
+          <w:sz w:val="24"/>
         </w:rPr>
-        <w:t>Tanya: 'Bagaimana Anda mengirim data notifikasi lonceng ke seluruh halaman?'</w:t>
+        <w:t>React.js: Library Frontend Berbasis Komponen</w:t>
       </w:r>
+    </w:p>
+    <w:p>
+      <w:pPr>
+        <w:pStyle w:val="ListBullet"/>
+        <w:spacing w:after="80" w:line="276" w:lineRule="auto"/>
+        <w:ind w:left="360"/>
+      </w:pPr>
       <w:r>
-        <w:t>Jawab: 'Di middleware HandleInertiaRequests.php, Pak. Data notifikasi di-query secara real-time dari database lalu didistribusikan secara global ke komponen AuthenticatedLayout.jsx menggunakan shared props Inertia.'</w:t>
+        <w:t>Component-based Architecture: UI dipecah menjadi bagian mandiri yang reusable.</w:t>
+      </w:r>
+    </w:p>
+    <w:p>
+      <w:pPr>
+        <w:pStyle w:val="ListBullet"/>
+        <w:spacing w:after="80" w:line="276" w:lineRule="auto"/>
+        <w:ind w:left="360"/>
+      </w:pPr>
+      <w:r>
+        <w:t>Virtual DOM: Salinan DOM asli di memori. React hanya meng-update elemen HTML yang berubah saja (Diffing Algorithm) sehingga performa web sangat cepat.</w:t>
+      </w:r>
+    </w:p>
+    <w:p>
+      <w:pPr>
+        <w:pStyle w:val="ListBullet"/>
+        <w:spacing w:after="80" w:line="276" w:lineRule="auto"/>
+        <w:ind w:left="360"/>
+      </w:pPr>
+      <w:r>
+        <w:t>State vs Props: State adalah data internal komponen (dapat diubah), sedangkan Props adalah data dari komponen induk (read-only).</w:t>
+      </w:r>
+    </w:p>
+    <w:p>
+      <w:pPr>
+        <w:pStyle w:val="ListBullet"/>
+        <w:spacing w:after="80" w:line="276" w:lineRule="auto"/>
+        <w:ind w:left="360"/>
+      </w:pPr>
+      <w:r>
+        <w:t>React Hooks: Fungsi bawaan React seperti useState() untuk state lokal dan useEffect() untuk lifecycle side-effects.</w:t>
+      </w:r>
+    </w:p>
+    <w:p>
+      <w:pPr>
+        <w:pStyle w:val="Heading2"/>
+        <w:keepNext/>
+        <w:spacing w:before="240" w:after="120"/>
+      </w:pPr>
+      <w:r>
+        <w:rPr>
+          <w:b/>
+          <w:color w:val="1A5685"/>
+          <w:sz w:val="24"/>
+        </w:rPr>
+        <w:t>REST API &amp; Laravel Sanctum</w:t>
+      </w:r>
+    </w:p>
+    <w:p>
+      <w:pPr>
+        <w:pStyle w:val="ListBullet"/>
+        <w:spacing w:after="80" w:line="276" w:lineRule="auto"/>
+        <w:ind w:left="360"/>
+      </w:pPr>
+      <w:r>
+        <w:t>Statelessness: Server tidak menyimpan status session klien. Setiap HTTP request Android membawa token autentikasi.</w:t>
+      </w:r>
+    </w:p>
+    <w:p>
+      <w:pPr>
+        <w:pStyle w:val="ListBullet"/>
+        <w:spacing w:after="80" w:line="276" w:lineRule="auto"/>
+        <w:ind w:left="360"/>
+      </w:pPr>
+      <w:r>
+        <w:t>HTTP Methods: Aksi standar komunikasi: GET (ambil), POST (buat baru), PUT/PATCH (update), DELETE (hapus).</w:t>
+      </w:r>
+    </w:p>
+    <w:p>
+      <w:pPr>
+        <w:pStyle w:val="ListBullet"/>
+        <w:spacing w:after="80" w:line="276" w:lineRule="auto"/>
+        <w:ind w:left="360"/>
+      </w:pPr>
+      <w:r>
+        <w:t>Laravel Sanctum: Sistem autentikasi token ringan untuk mengamankan endpoint REST API.</w:t>
+      </w:r>
+    </w:p>
+    <w:p>
+      <w:pPr>
+        <w:pStyle w:val="Heading1"/>
+        <w:keepNext/>
+        <w:spacing w:before="360" w:after="160"/>
+      </w:pPr>
+      <w:r>
+        <w:rPr>
+          <w:b/>
+          <w:color w:val="0A3A60"/>
+          <w:sz w:val="28"/>
+        </w:rPr>
+        <w:t>BAB VI: FUNGSI DAN PENJELASAN BERKAS KONFIGURASI PROJEK</w:t>
+      </w:r>
+    </w:p>
+    <w:p>
+      <w:pPr>
+        <w:spacing w:after="120" w:line="276" w:lineRule="auto"/>
+      </w:pPr>
+      <w:r>
+        <w:t>Dosen sering menanyakan kegunaan berkas konfigurasi di root direktori proyek:</w:t>
+      </w:r>
+    </w:p>
+    <w:p>
+      <w:pPr>
+        <w:pStyle w:val="ListBullet"/>
+        <w:spacing w:after="80" w:line="276" w:lineRule="auto"/>
+        <w:ind w:left="360"/>
+      </w:pPr>
+      <w:r>
+        <w:t>.env &amp; .env.example: Menyimpan kredensial database lokal, app key, dan variabel lingkungan sensitif.</w:t>
+      </w:r>
+    </w:p>
+    <w:p>
+      <w:pPr>
+        <w:pStyle w:val="ListBullet"/>
+        <w:spacing w:after="80" w:line="276" w:lineRule="auto"/>
+        <w:ind w:left="360"/>
+      </w:pPr>
+      <w:r>
+        <w:t>.editorconfig &amp; .eslintrc.json: Menstandarkan gaya penulisan kode JavaScript dan deteksi error sintaks.</w:t>
+      </w:r>
+    </w:p>
+    <w:p>
+      <w:pPr>
+        <w:pStyle w:val="ListBullet"/>
+        <w:spacing w:after="80" w:line="276" w:lineRule="auto"/>
+        <w:ind w:left="360"/>
+      </w:pPr>
+      <w:r>
+        <w:t>.gitignore: Berkas instruksi agar Git mengabaikan folder dependensi vendor/ atau node_modules/ saat push ke GitHub.</w:t>
+      </w:r>
+    </w:p>
+    <w:p>
+      <w:pPr>
+        <w:pStyle w:val="ListBullet"/>
+        <w:spacing w:after="80" w:line="276" w:lineRule="auto"/>
+        <w:ind w:left="360"/>
+      </w:pPr>
+      <w:r>
+        <w:t>composer.json &amp; composer.lock: Package manager PHP untuk mendefinisikan library dependensi backend (Laravel, Sanctum, Inertia).</w:t>
+      </w:r>
+    </w:p>
+    <w:p>
+      <w:pPr>
+        <w:pStyle w:val="ListBullet"/>
+        <w:spacing w:after="80" w:line="276" w:lineRule="auto"/>
+        <w:ind w:left="360"/>
+      </w:pPr>
+      <w:r>
+        <w:t>package.json &amp; package-lock.json: Package manager Node.js untuk mendefinisikan library frontend (React, Axios, ChartJS).</w:t>
+      </w:r>
+    </w:p>
+    <w:p>
+      <w:pPr>
+        <w:pStyle w:val="ListBullet"/>
+        <w:spacing w:after="80" w:line="276" w:lineRule="auto"/>
+        <w:ind w:left="360"/>
+      </w:pPr>
+      <w:r>
+        <w:t>tailwind.config.js: Mengatur tema warna kustom, responsivitas, dan kelas CSS Tailwind.</w:t>
+      </w:r>
+    </w:p>
+    <w:p>
+      <w:pPr>
+        <w:pStyle w:val="ListBullet"/>
+        <w:spacing w:after="80" w:line="276" w:lineRule="auto"/>
+        <w:ind w:left="360"/>
+      </w:pPr>
+      <w:r>
+        <w:t>vite.config.js: Konfigurasi bundler Vite untuk kompilasi real-time aset React JSX dan Tailwind CSS.</w:t>
+      </w:r>
+    </w:p>
+    <w:p>
+      <w:pPr>
+        <w:pStyle w:val="Heading1"/>
+        <w:keepNext/>
+        <w:spacing w:before="360" w:after="160"/>
+      </w:pPr>
+      <w:r>
+        <w:rPr>
+          <w:b/>
+          <w:color w:val="0A3A60"/>
+          <w:sz w:val="28"/>
+        </w:rPr>
+        <w:t>BAB VII: DEEP DIVE: KONSEP SESSIONS, TOKENS, DAN DATABASE MIGRATIONS</w:t>
+      </w:r>
+    </w:p>
+    <w:p>
+      <w:pPr>
+        <w:pStyle w:val="Heading2"/>
+        <w:keepNext/>
+        <w:spacing w:before="240" w:after="120"/>
+      </w:pPr>
+      <w:r>
+        <w:rPr>
+          <w:b/>
+          <w:color w:val="1A5685"/>
+          <w:sz w:val="24"/>
+        </w:rPr>
+        <w:t>Web Sessions (Autentikasi Stateful)</w:t>
+      </w:r>
+    </w:p>
+    <w:p>
+      <w:pPr>
+        <w:spacing w:after="120" w:line="276" w:lineRule="auto"/>
+      </w:pPr>
+      <w:r>
+        <w:t>Session adalah mekanisme penyimpanan status login di sisi server:</w:t>
+      </w:r>
+    </w:p>
+    <w:p>
+      <w:pPr>
+        <w:pStyle w:val="ListBullet"/>
+        <w:spacing w:after="80" w:line="276" w:lineRule="auto"/>
+        <w:ind w:left="360"/>
+      </w:pPr>
+      <w:r>
+        <w:t>Pengguna memasukkan email/password -&gt; Laravel mencocokkannya -&gt; jika cocok, Laravel membuat file session unik di server dan mengirimkan Session ID (Cookie bernama laravel_session) ke browser.</w:t>
+      </w:r>
+    </w:p>
+    <w:p>
+      <w:pPr>
+        <w:pStyle w:val="ListBullet"/>
+        <w:spacing w:after="80" w:line="276" w:lineRule="auto"/>
+        <w:ind w:left="360"/>
+      </w:pPr>
+      <w:r>
+        <w:t>Web browser melampirkan cookie Session ID tersebut secara otomatis dalam setiap request HTTP selanjutnya.</w:t>
+      </w:r>
+    </w:p>
+    <w:p>
+      <w:pPr>
+        <w:pStyle w:val="Heading2"/>
+        <w:keepNext/>
+        <w:spacing w:before="240" w:after="120"/>
+      </w:pPr>
+      <w:r>
+        <w:rPr>
+          <w:b/>
+          <w:color w:val="1A5685"/>
+          <w:sz w:val="24"/>
+        </w:rPr>
+        <w:t>API Tokens (Autentikasi Stateless)</w:t>
+      </w:r>
+    </w:p>
+    <w:p>
+      <w:pPr>
+        <w:spacing w:after="120" w:line="276" w:lineRule="auto"/>
+      </w:pPr>
+      <w:r>
+        <w:t>Token adalah string acak unik yang digunakan untuk mengautentikasi REST API mobile:</w:t>
+      </w:r>
+    </w:p>
+    <w:p>
+      <w:pPr>
+        <w:pStyle w:val="ListBullet"/>
+        <w:spacing w:after="80" w:line="276" w:lineRule="auto"/>
+        <w:ind w:left="360"/>
+      </w:pPr>
+      <w:r>
+        <w:t>Aplikasi Android mengirim login request -&gt; Laravel Sanctum membuat baris token baru di tabel database personal_access_tokens dan mengirimkan token string tersebut ke Android.</w:t>
+      </w:r>
+    </w:p>
+    <w:p>
+      <w:pPr>
+        <w:pStyle w:val="ListBullet"/>
+        <w:spacing w:after="80" w:line="276" w:lineRule="auto"/>
+        <w:ind w:left="360"/>
+      </w:pPr>
+      <w:r>
+        <w:t>Android menyimpan token secara lokal dan melampirkannya secara manual di header HTTP: Authorization: Bearer {token} pada setiap request.</w:t>
+      </w:r>
+    </w:p>
+    <w:p>
+      <w:pPr>
+        <w:pStyle w:val="ListBullet"/>
+        <w:spacing w:after="80" w:line="276" w:lineRule="auto"/>
+        <w:ind w:left="360"/>
+      </w:pPr>
+      <w:r>
+        <w:t>Mengapa Android memakai Token?: Karena aplikasi mobile tidak memiliki mekanisme otomatisasi cookie session layaknya web browser.</w:t>
+      </w:r>
+    </w:p>
+    <w:p>
+      <w:pPr>
+        <w:pStyle w:val="Heading2"/>
+        <w:keepNext/>
+        <w:spacing w:before="240" w:after="120"/>
+      </w:pPr>
+      <w:r>
+        <w:rPr>
+          <w:b/>
+          <w:color w:val="1A5685"/>
+          <w:sz w:val="24"/>
+        </w:rPr>
+        <w:t>Database Migrations (Version Control untuk Database)</w:t>
+      </w:r>
+    </w:p>
+    <w:p>
+      <w:pPr>
+        <w:spacing w:after="120" w:line="276" w:lineRule="auto"/>
+      </w:pPr>
+      <w:r>
+        <w:t>Migrasi adalah version control untuk skema database. Struktur tabel didefinisikan menggunakan kode PHP sehingga tidak perlu ekspor-impor file SQL manual.</w:t>
+      </w:r>
+    </w:p>
+    <w:p>
+      <w:pPr>
+        <w:pStyle w:val="ListBullet"/>
+        <w:spacing w:after="80" w:line="276" w:lineRule="auto"/>
+        <w:ind w:left="360"/>
+      </w:pPr>
+      <w:r>
+        <w:t>php artisan migrate: Menjalankan semua berkas migrasi baru ke database.</w:t>
+      </w:r>
+    </w:p>
+    <w:p>
+      <w:pPr>
+        <w:pStyle w:val="ListBullet"/>
+        <w:spacing w:after="80" w:line="276" w:lineRule="auto"/>
+        <w:ind w:left="360"/>
+      </w:pPr>
+      <w:r>
+        <w:t>php artisan migrate:rollback: Membatalkan atau memundurkan migrasi yang terakhir dijalankan.</w:t>
+      </w:r>
+    </w:p>
+    <w:p>
+      <w:pPr>
+        <w:pStyle w:val="ListBullet"/>
+        <w:spacing w:after="80" w:line="276" w:lineRule="auto"/>
+        <w:ind w:left="360"/>
+      </w:pPr>
+      <w:r>
+        <w:t>php artisan migrate:fresh: Menghapus seluruh tabel di database lalu menjalankan ulang seluruh berkas migrasi dari awal.</w:t>
       </w:r>
     </w:p>
     <w:sectPr>

</xml_diff>

<commit_message>
Docs: Update Word presentation guide to include detailed 7-chapter analysis of MedTrack framework
</commit_message>
<xml_diff>
--- a/Poin Poin dan Pemahaman Untuk Presentasi (Hasil Edit).docx
+++ b/Poin Poin dan Pemahaman Untuk Presentasi (Hasil Edit).docx
@@ -50,7 +50,7 @@
         <w:spacing w:after="120" w:line="276" w:lineRule="auto"/>
       </w:pPr>
       <w:r>
-        <w:t>Dosen sering menanyakan di mana letak logika bisnis, di mana letak rute, dan bagaimana kode frontend bisa menyatu dengan backend. Berikut adalah rincian fungsional struktur folder proyek:</w:t>
+        <w:t>Dosen penguji sering kali menanyakan bagaimana backend dan frontend terhubung secara arsitektural. Proyek ini menggunakan arsitektur Hybrid Monolith dengan Inertia.js sebagai jembatan dinamis. Berikut adalah penjelasan struktur folder secara fungsional:</w:t>
       </w:r>
     </w:p>
     <w:p>
@@ -81,7 +81,7 @@
         <w:t>app/Http/Controllers/Web/</w:t>
       </w:r>
       <w:r>
-        <w:t xml:space="preserve"> - Tempat menyimpan kelas kontroler. Controller bertugas mengambil data dari Model dan merendernya ke tampilan menggunakan Inertia.</w:t>
+        <w:t xml:space="preserve"> - Folder ini menyimpan seluruh logika bisnis sistem. Controller bertugas mengambil data dari Model dan mengembalikannya ke frontend melalui Inertia::render.</w:t>
       </w:r>
     </w:p>
     <w:p>
@@ -97,7 +97,7 @@
         <w:t>app/Http/Controllers/Api/</w:t>
       </w:r>
       <w:r>
-        <w:t xml:space="preserve"> - Berisi file AuthController, AsetController, RuanganController, MutasiController, dll. untuk melayani request mobile Android dalam format JSON.</w:t>
+        <w:t xml:space="preserve"> - Berisi kontroler khusus API (seperti AuthController.php, TrackingController.php) untuk melayani pertukaran data koordinat GPS pelacak lokasi aset medis dari aplikasi mobile Android dalam bentuk JSON.</w:t>
       </w:r>
     </w:p>
     <w:p>
@@ -113,7 +113,7 @@
         <w:t>app/Models/</w:t>
       </w:r>
       <w:r>
-        <w:t xml:space="preserve"> - Berisi Model Eloquent (User.php, Aset.php, Ruangan.php, Mutasi.php, Troubleshoot.php, TroubleshootLog.php, Pemeliharaan.php, PemeliharaanLog.php, DokumenMutu.php) yang memetakan tabel database MySQL secara objek ORM.</w:t>
+        <w:t xml:space="preserve"> - Folder representasi tabel database MySQL berupa Model Eloquent ORM. Di dalamnya terdapat file Aset.php, User.php, Ruangan.php, Troubleshoot.php (Work Order), TroubleshootLog.php, Mutasi.php, Pemeliharaan.php, PemeliharaanLog.php, dan DokumenMutu.php.</w:t>
       </w:r>
     </w:p>
     <w:p>
@@ -129,7 +129,7 @@
         <w:t>database/migrations/</w:t>
       </w:r>
       <w:r>
-        <w:t xml:space="preserve"> - Skema pembuatan tabel database beserta relasi foreign key.</w:t>
+        <w:t xml:space="preserve"> - Menyimpan skema pembentukan tabel database beserta constraint relasi foreign key.</w:t>
       </w:r>
     </w:p>
     <w:p>
@@ -145,7 +145,7 @@
         <w:t>database/seeders/</w:t>
       </w:r>
       <w:r>
-        <w:t xml:space="preserve"> - Menyimpan data awal bawaan (akun user dengan role berbeda, ruangan, dan data aset dummy).</w:t>
+        <w:t xml:space="preserve"> - Menyimpan seeder data bawaan untuk keperluan demonstrasi akun pengujian default.</w:t>
       </w:r>
     </w:p>
     <w:p>
@@ -161,7 +161,7 @@
         <w:t>routes/web.php</w:t>
       </w:r>
       <w:r>
-        <w:t xml:space="preserve"> - Menyimpan rute akses web client yang dilindungi oleh middleware 'auth' (mengharuskan login session). Rute mengarah ke controller Inertia.</w:t>
+        <w:t xml:space="preserve"> - Tempat mendaftarkan rute akses web client yang dilindungi middleware 'auth' session.</w:t>
       </w:r>
     </w:p>
     <w:p>
@@ -177,7 +177,7 @@
         <w:t>routes/api.php</w:t>
       </w:r>
       <w:r>
-        <w:t xml:space="preserve"> - Menyimpan rute REST API untuk Android. Rute login bersifat publik, sedangkan rute lainnya dilindungi middleware 'auth:sanctum' (wajib menyertakan token).</w:t>
+        <w:t xml:space="preserve"> - Tempat mendaftarkan rute REST API untuk Android yang diamankan oleh middleware token 'auth:sanctum'.</w:t>
       </w:r>
     </w:p>
     <w:p>
@@ -192,7 +192,7 @@
           <w:color w:val="1A5685"/>
           <w:sz w:val="24"/>
         </w:rPr>
-        <w:t>Sisi Frontend (React.js + Tailwind)</w:t>
+        <w:t>Sisi Frontend (React.js + Tailwind CSS)</w:t>
       </w:r>
     </w:p>
     <w:p>
@@ -208,7 +208,7 @@
         <w:t>resources/js/Pages/</w:t>
       </w:r>
       <w:r>
-        <w:t xml:space="preserve"> - Halaman antarmuka pengguna (Views). Setiap berkas di sini (seperti Dashboard.jsx, Aset/Index.jsx, WorkOrder/Index.jsx, Mutasi/Index.jsx) adalah komponen React utuh yang merender UI halaman web.</w:t>
+        <w:t xml:space="preserve"> - Menyimpan file komponen halaman web. Setiap file React JSX di sini (seperti Dashboard.jsx, Aset/Index.jsx, WorkOrder/Index.jsx, Mutasi/Index.jsx) merender antarmuka pengguna halaman web secara dinamis.</w:t>
       </w:r>
     </w:p>
     <w:p>
@@ -224,7 +224,7 @@
         <w:t>resources/js/Layouts/AuthenticatedLayout.jsx</w:t>
       </w:r>
       <w:r>
-        <w:t xml:space="preserve"> - Kerangka halaman utama (Sidebar, Topbar, Profile Info, Lonceng Notifikasi, Kalender Agenda) yang membungkus semua halaman setelah login.</w:t>
+        <w:t xml:space="preserve"> - Kerangka tata letak halaman utama (Sidebar, Header, lonceng notifikasi dinamis, modal scan QR Code kamera, dan kalender agenda) yang membungkus semua halaman setelah login.</w:t>
       </w:r>
     </w:p>
     <w:p>
@@ -240,7 +240,7 @@
         <w:t>resources/js/app.jsx</w:t>
       </w:r>
       <w:r>
-        <w:t xml:space="preserve"> - Entri utama JavaScript tempat Inertia dikonfigurasi untuk memuat komponen React dari folder Pages secara dinamis.</w:t>
+        <w:t xml:space="preserve"> - Entri utama Javascript untuk menyetel dan mengonfigurasi rendering Inertia React.</w:t>
       </w:r>
     </w:p>
     <w:p>
@@ -298,7 +298,7 @@
         <w:ind w:left="360"/>
       </w:pPr>
       <w:r>
-        <w:t>Browser mengirimkan request internal (Inertia request) ke rute /aset.</w:t>
+        <w:t>Inertia mengirimkan request internal (Inertia request XHR/AJAX) ke rute /aset.</w:t>
       </w:r>
     </w:p>
     <w:p>

</xml_diff>

<commit_message>
Docs: Update Word and text guides with exhaustive file-by-file analyses for all models, controllers, and pages
</commit_message>
<xml_diff>
--- a/Poin Poin dan Pemahaman Untuk Presentasi (Hasil Edit).docx
+++ b/Poin Poin dan Pemahaman Untuk Presentasi (Hasil Edit).docx
@@ -13,7 +13,7 @@
           <w:color w:val="0A3A60"/>
           <w:sz w:val="40"/>
         </w:rPr>
-        <w:t>🏥 PANDUAN DETAIL PEMAHAMAN TEKNIS PROJEK AKHIR (MEDTRACK)</w:t>
+        <w:t>🏥 DOKUMENTASI &amp; BEDAH KODE STRUKTUR MEDTRACK</w:t>
       </w:r>
     </w:p>
     <w:p>
@@ -27,7 +27,7 @@
           <w:color w:val="64748B"/>
           <w:sz w:val="22"/>
         </w:rPr>
-        <w:t>Materi Pendalaman Struktur Kode, Alur Data, Otorisasi Peran, dan Integrasi Laravel + React Inertia Khusus untuk Menjawab Pertanyaan Dosen Penguji secara Rinci</w:t>
+        <w:t>Analisis Lengkap Setiap Folder dan Berkas Kode Program MedTrack (Laravel-React) untuk Keperluan Presentasi &amp; Sidang Projek Akhir</w:t>
       </w:r>
     </w:p>
     <w:p>
@@ -50,7 +50,7 @@
         <w:spacing w:after="120" w:line="276" w:lineRule="auto"/>
       </w:pPr>
       <w:r>
-        <w:t>Dosen penguji sering kali menanyakan bagaimana backend dan frontend terhubung secara arsitektural. Proyek ini menggunakan arsitektur Hybrid Monolith dengan Inertia.js sebagai jembatan dinamis. Berikut adalah penjelasan struktur folder secara fungsional:</w:t>
+        <w:t>Bagian ini memaparkan struktur folder secara keseluruhan, menjelaskan di mana letak berkas backend Laravel dan antarmuka frontend React.js:</w:t>
       </w:r>
     </w:p>
     <w:p>
@@ -75,13 +75,7 @@
         <w:ind w:left="360"/>
       </w:pPr>
       <w:r>
-        <w:rPr>
-          <w:b/>
-        </w:rPr>
-        <w:t>app/Http/Controllers/Web/</w:t>
-      </w:r>
-      <w:r>
-        <w:t xml:space="preserve"> - Folder ini menyimpan seluruh logika bisnis sistem. Controller bertugas mengambil data dari Model dan mengembalikannya ke frontend melalui Inertia::render.</w:t>
+        <w:t>app/Http/Controllers/Web/ - Berisi berkas-berkas pengolah logika web yang diakses pengguna melalui browser.</w:t>
       </w:r>
     </w:p>
     <w:p>
@@ -91,13 +85,7 @@
         <w:ind w:left="360"/>
       </w:pPr>
       <w:r>
-        <w:rPr>
-          <w:b/>
-        </w:rPr>
-        <w:t>app/Http/Controllers/Api/</w:t>
-      </w:r>
-      <w:r>
-        <w:t xml:space="preserve"> - Berisi kontroler khusus API (seperti AuthController.php, TrackingController.php) untuk melayani pertukaran data koordinat GPS pelacak lokasi aset medis dari aplikasi mobile Android dalam bentuk JSON.</w:t>
+        <w:t>app/Http/Controllers/Api/ - Menyimpan endpoint khusus pengiriman data JSON untuk aplikasi mobile tracker Android.</w:t>
       </w:r>
     </w:p>
     <w:p>
@@ -107,13 +95,7 @@
         <w:ind w:left="360"/>
       </w:pPr>
       <w:r>
-        <w:rPr>
-          <w:b/>
-        </w:rPr>
-        <w:t>app/Models/</w:t>
-      </w:r>
-      <w:r>
-        <w:t xml:space="preserve"> - Folder representasi tabel database MySQL berupa Model Eloquent ORM. Di dalamnya terdapat file Aset.php, User.php, Ruangan.php, Troubleshoot.php (Work Order), TroubleshootLog.php, Mutasi.php, Pemeliharaan.php, PemeliharaanLog.php, dan DokumenMutu.php.</w:t>
+        <w:t>app/Models/ - Folder representasi tabel database. Menggunakan ORM Eloquent sehingga kueri database direpresentasikan sebagai objek PHP.</w:t>
       </w:r>
     </w:p>
     <w:p>
@@ -123,13 +105,7 @@
         <w:ind w:left="360"/>
       </w:pPr>
       <w:r>
-        <w:rPr>
-          <w:b/>
-        </w:rPr>
-        <w:t>database/migrations/</w:t>
-      </w:r>
-      <w:r>
-        <w:t xml:space="preserve"> - Menyimpan skema pembentukan tabel database beserta constraint relasi foreign key.</w:t>
+        <w:t>app/Http/Middleware/HandleInertiaRequests.php - Mengatur peminjaman properti global (shared props) agar dapat diakses dari komponen React manapun.</w:t>
       </w:r>
     </w:p>
     <w:p>
@@ -139,13 +115,7 @@
         <w:ind w:left="360"/>
       </w:pPr>
       <w:r>
-        <w:rPr>
-          <w:b/>
-        </w:rPr>
-        <w:t>database/seeders/</w:t>
-      </w:r>
-      <w:r>
-        <w:t xml:space="preserve"> - Menyimpan seeder data bawaan untuk keperluan demonstrasi akun pengujian default.</w:t>
+        <w:t>database/migrations/ - File instruksi pembuatan skema tabel-tabel di database MySQL.</w:t>
       </w:r>
     </w:p>
     <w:p>
@@ -155,29 +125,7 @@
         <w:ind w:left="360"/>
       </w:pPr>
       <w:r>
-        <w:rPr>
-          <w:b/>
-        </w:rPr>
-        <w:t>routes/web.php</w:t>
-      </w:r>
-      <w:r>
-        <w:t xml:space="preserve"> - Tempat mendaftarkan rute akses web client yang dilindungi middleware 'auth' session.</w:t>
-      </w:r>
-    </w:p>
-    <w:p>
-      <w:pPr>
-        <w:pStyle w:val="ListBullet"/>
-        <w:spacing w:after="80" w:line="276" w:lineRule="auto"/>
-        <w:ind w:left="360"/>
-      </w:pPr>
-      <w:r>
-        <w:rPr>
-          <w:b/>
-        </w:rPr>
-        <w:t>routes/api.php</w:t>
-      </w:r>
-      <w:r>
-        <w:t xml:space="preserve"> - Tempat mendaftarkan rute REST API untuk Android yang diamankan oleh middleware token 'auth:sanctum'.</w:t>
+        <w:t>routes/web.php &amp; routes/api.php - Pendefinisian rute URL web client (stateful session) dan rute REST API Android (stateless token).</w:t>
       </w:r>
     </w:p>
     <w:p>
@@ -192,7 +140,7 @@
           <w:color w:val="1A5685"/>
           <w:sz w:val="24"/>
         </w:rPr>
-        <w:t>Sisi Frontend (React.js + Tailwind CSS)</w:t>
+        <w:t>Sisi Frontend (React.js)</w:t>
       </w:r>
     </w:p>
     <w:p>
@@ -202,13 +150,7 @@
         <w:ind w:left="360"/>
       </w:pPr>
       <w:r>
-        <w:rPr>
-          <w:b/>
-        </w:rPr>
-        <w:t>resources/js/Pages/</w:t>
-      </w:r>
-      <w:r>
-        <w:t xml:space="preserve"> - Menyimpan file komponen halaman web. Setiap file React JSX di sini (seperti Dashboard.jsx, Aset/Index.jsx, WorkOrder/Index.jsx, Mutasi/Index.jsx) merender antarmuka pengguna halaman web secara dinamis.</w:t>
+        <w:t>resources/js/Pages/ - Berisi berkas antarmuka utama pengguna (Views). Setiap berkas disini adalah halaman komponen React.</w:t>
       </w:r>
     </w:p>
     <w:p>
@@ -218,13 +160,7 @@
         <w:ind w:left="360"/>
       </w:pPr>
       <w:r>
-        <w:rPr>
-          <w:b/>
-        </w:rPr>
-        <w:t>resources/js/Layouts/AuthenticatedLayout.jsx</w:t>
-      </w:r>
-      <w:r>
-        <w:t xml:space="preserve"> - Kerangka tata letak halaman utama (Sidebar, Header, lonceng notifikasi dinamis, modal scan QR Code kamera, dan kalender agenda) yang membungkus semua halaman setelah login.</w:t>
+        <w:t>resources/js/Layouts/AuthenticatedLayout.jsx - Kerangka tata letak halaman dashboard (sidebar, header notifikasi, scanner QR code).</w:t>
       </w:r>
     </w:p>
     <w:p>
@@ -234,13 +170,7 @@
         <w:ind w:left="360"/>
       </w:pPr>
       <w:r>
-        <w:rPr>
-          <w:b/>
-        </w:rPr>
-        <w:t>resources/js/app.jsx</w:t>
-      </w:r>
-      <w:r>
-        <w:t xml:space="preserve"> - Entri utama Javascript untuk menyetel dan mengonfigurasi rendering Inertia React.</w:t>
+        <w:t>resources/js/Components/ - Menyimpan komponen UI kecil reusable (seperti Modal, Dropdown, Button).</w:t>
       </w:r>
     </w:p>
     <w:p>
@@ -255,7 +185,15 @@
           <w:color w:val="0A3A60"/>
           <w:sz w:val="28"/>
         </w:rPr>
-        <w:t>BAB II: ALUR DATA DAN REQUEST-RESPONSE LIFECYCLE (BAGAIMANA APLIKASI BEKERJA)</w:t>
+        <w:t>BAB II: PENJELASAN DETIL SETIAP FILE KODE PROGRAM</w:t>
+      </w:r>
+    </w:p>
+    <w:p>
+      <w:pPr>
+        <w:spacing w:after="120" w:line="276" w:lineRule="auto"/>
+      </w:pPr>
+      <w:r>
+        <w:t>Di bawah ini adalah rincian detail fungsi dan metode kunci untuk setiap file kode program di dalam proyek MedTrack:</w:t>
       </w:r>
     </w:p>
     <w:p>
@@ -270,7 +208,7 @@
           <w:color w:val="1A5685"/>
           <w:sz w:val="24"/>
         </w:rPr>
-        <w:t>Siklus Request Web (Menggunakan Protokol Inertia.js)</w:t>
+        <w:t>1. Model Eloquent (app/Models/)</w:t>
       </w:r>
     </w:p>
     <w:p>
@@ -278,7 +216,13 @@
         <w:spacing w:after="120" w:line="276" w:lineRule="auto"/>
       </w:pPr>
       <w:r>
-        <w:t>Inertia bertindak sebagai jembatan. Alur kerja ketika pengguna mengakses halaman Aset Medis adalah sebagai berikut:</w:t>
+        <w:rPr>
+          <w:b/>
+        </w:rPr>
+        <w:t xml:space="preserve">User.php: </w:t>
+      </w:r>
+      <w:r>
+        <w:t xml:space="preserve"> - Memetakan tabel m_user. Menyimpan informasi profil staff, peran (role), password, dan relasi ke unit/ruangan kerja.</w:t>
       </w:r>
     </w:p>
     <w:p>
@@ -288,7 +232,21 @@
         <w:ind w:left="360"/>
       </w:pPr>
       <w:r>
-        <w:t>Pengguna mengklik menu 'Aset Medis' di Sidebar.</w:t>
+        <w:t>Relasi ruangan(): belongsTo(Ruangan::class, 'id_ruang') untuk mendapatkan unit kerja user.</w:t>
+      </w:r>
+    </w:p>
+    <w:p>
+      <w:pPr>
+        <w:spacing w:after="120" w:line="276" w:lineRule="auto"/>
+      </w:pPr>
+      <w:r>
+        <w:rPr>
+          <w:b/>
+        </w:rPr>
+        <w:t xml:space="preserve">Aset.php: </w:t>
+      </w:r>
+      <w:r>
+        <w:t xml:space="preserve"> - Memetakan tabel t_aset. Menyimpan data inventaris alat medis, serial number, status operasional, koordinat lokasi GPS tracking, tanggal kalibrasi, dan file QR Code.</w:t>
       </w:r>
     </w:p>
     <w:p>
@@ -298,7 +256,7 @@
         <w:ind w:left="360"/>
       </w:pPr>
       <w:r>
-        <w:t>Inertia mengirimkan request internal (Inertia request XHR/AJAX) ke rute /aset.</w:t>
+        <w:t>Relasi ruangan(): belongsTo(Ruangan::class, 'id_ruang_saat_ini') untuk melacak lokasi ruang terkini alat.</w:t>
       </w:r>
     </w:p>
     <w:p>
@@ -308,7 +266,21 @@
         <w:ind w:left="360"/>
       </w:pPr>
       <w:r>
-        <w:t>Laravel mencocokkan rute di web.php dan memanggil AsetController@index.</w:t>
+        <w:t>Relasi troubleshoot(): hasMany(Troubleshoot::class, 'id_aset') untuk mendapatkan riwayat kerusakan alat.</w:t>
+      </w:r>
+    </w:p>
+    <w:p>
+      <w:pPr>
+        <w:spacing w:after="120" w:line="276" w:lineRule="auto"/>
+      </w:pPr>
+      <w:r>
+        <w:rPr>
+          <w:b/>
+        </w:rPr>
+        <w:t xml:space="preserve">Ruangan.php: </w:t>
+      </w:r>
+      <w:r>
+        <w:t xml:space="preserve"> - Memetakan tabel m_ruangan. Menyimpan data ruangan di rumah sakit.</w:t>
       </w:r>
     </w:p>
     <w:p>
@@ -318,7 +290,21 @@
         <w:ind w:left="360"/>
       </w:pPr>
       <w:r>
-        <w:t>AsetController melakukan query database melalui Eloquent: Aset::with('ruangan')-&gt;get().</w:t>
+        <w:t>Relasi asets(): hasMany(Aset::class, 'id_ruang_saat_ini') untuk mendapatkan semua inventaris di ruangan tersebut.</w:t>
+      </w:r>
+    </w:p>
+    <w:p>
+      <w:pPr>
+        <w:spacing w:after="120" w:line="276" w:lineRule="auto"/>
+      </w:pPr>
+      <w:r>
+        <w:rPr>
+          <w:b/>
+        </w:rPr>
+        <w:t xml:space="preserve">Mutasi.php: </w:t>
+      </w:r>
+      <w:r>
+        <w:t xml:space="preserve"> - Memetakan tabel t_mutasi. Menyimpan riwayat pengajuan pemindahan alat.</w:t>
       </w:r>
     </w:p>
     <w:p>
@@ -328,7 +314,7 @@
         <w:ind w:left="360"/>
       </w:pPr>
       <w:r>
-        <w:t>Controller mengembalikan respon: return Inertia::render('Aset/Index', ['asets' =&gt; $asets]);</w:t>
+        <w:t>Relasi aset(): belongsTo(Aset::class, 'id_aset')</w:t>
       </w:r>
     </w:p>
     <w:p>
@@ -338,7 +324,7 @@
         <w:ind w:left="360"/>
       </w:pPr>
       <w:r>
-        <w:t>Inertia menangkap kembalian tersebut, lalu mengirimkan payload berupa data JSON (bukan HTML mentah) ke frontend.</w:t>
+        <w:t>Relasi ruanganAsal(): belongsTo(Ruangan::class, 'id_ruang_asal')</w:t>
       </w:r>
     </w:p>
     <w:p>
@@ -348,7 +334,61 @@
         <w:ind w:left="360"/>
       </w:pPr>
       <w:r>
-        <w:t>Komponen React di resources/js/Pages/Aset/Index.jsx menerima data tersebut melalui props (asets) lalu merendernya secara dinamis di browser tanpa refresh halaman penuh.</w:t>
+        <w:t>Relasi ruanganTujuan(): belongsTo(Ruangan::class, 'id_ruang_tujuan')</w:t>
+      </w:r>
+    </w:p>
+    <w:p>
+      <w:pPr>
+        <w:spacing w:after="120" w:line="276" w:lineRule="auto"/>
+      </w:pPr>
+      <w:r>
+        <w:rPr>
+          <w:b/>
+        </w:rPr>
+        <w:t xml:space="preserve">Troubleshoot.php: </w:t>
+      </w:r>
+      <w:r>
+        <w:t xml:space="preserve"> - Memetakan tabel t_troubleshoot. Menyimpan tiket laporan kerusakan alat medis.</w:t>
+      </w:r>
+    </w:p>
+    <w:p>
+      <w:pPr>
+        <w:pStyle w:val="ListBullet"/>
+        <w:spacing w:after="80" w:line="276" w:lineRule="auto"/>
+        <w:ind w:left="360"/>
+      </w:pPr>
+      <w:r>
+        <w:t>Relasi pelapor(): belongsTo(User.class, 'id_user_pelapor')</w:t>
+      </w:r>
+    </w:p>
+    <w:p>
+      <w:pPr>
+        <w:pStyle w:val="ListBullet"/>
+        <w:spacing w:after="80" w:line="276" w:lineRule="auto"/>
+        <w:ind w:left="360"/>
+      </w:pPr>
+      <w:r>
+        <w:t>Relasi teknisi(): belongsTo(User.class, 'id_teknisi_penanggungjawab')</w:t>
+      </w:r>
+    </w:p>
+    <w:p>
+      <w:pPr>
+        <w:pStyle w:val="ListBullet"/>
+        <w:spacing w:after="80" w:line="276" w:lineRule="auto"/>
+        <w:ind w:left="360"/>
+      </w:pPr>
+      <w:r>
+        <w:t>Relasi aset(): belongsTo(Aset::class, 'id_aset')</w:t>
+      </w:r>
+    </w:p>
+    <w:p>
+      <w:pPr>
+        <w:pStyle w:val="ListBullet"/>
+        <w:spacing w:after="80" w:line="276" w:lineRule="auto"/>
+        <w:ind w:left="360"/>
+      </w:pPr>
+      <w:r>
+        <w:t>Relasi ticketLogs(): hasMany(TroubleshootLog::class, 'id_ticket')</w:t>
       </w:r>
     </w:p>
     <w:p>
@@ -363,7 +403,7 @@
           <w:color w:val="1A5685"/>
           <w:sz w:val="24"/>
         </w:rPr>
-        <w:t>Siklus Request API Mobile (Laravel Sanctum)</w:t>
+        <w:t>2. Web Controllers (app/Http/Controllers/Web/)</w:t>
       </w:r>
     </w:p>
     <w:p>
@@ -371,7 +411,13 @@
         <w:spacing w:after="120" w:line="276" w:lineRule="auto"/>
       </w:pPr>
       <w:r>
-        <w:t>Alur kerja ketika aplikasi Android pelacak lokasi mengirim data ke server:</w:t>
+        <w:rPr>
+          <w:b/>
+        </w:rPr>
+        <w:t xml:space="preserve">DashboardController.php: </w:t>
+      </w:r>
+      <w:r>
+        <w:t xml:space="preserve"> - Menyajikan dasbor overview. Menghitung ringkasan statistik (jumlah aset, total kerusakan, mutasi pending) dan memuat agenda kalibrasi harian.</w:t>
       </w:r>
     </w:p>
     <w:p>
@@ -381,7 +427,7 @@
         <w:ind w:left="360"/>
       </w:pPr>
       <w:r>
-        <w:t>Aplikasi Android mengirim HTTP POST request ke http://alamat-server/api/tracking.</w:t>
+        <w:t>index(): Mengambil data statistik kartu ringkasan dan kalender pemeliharaan.</w:t>
       </w:r>
     </w:p>
     <w:p>
@@ -391,7 +437,21 @@
         <w:ind w:left="360"/>
       </w:pPr>
       <w:r>
-        <w:t>Android menyertakan header Authorization: Bearer {token} yang diperoleh saat login.</w:t>
+        <w:t>reschedule(): Logika pembaruan tanggal kalibrasi alat secara interaktif dari kalender sidebar.</w:t>
+      </w:r>
+    </w:p>
+    <w:p>
+      <w:pPr>
+        <w:spacing w:after="120" w:line="276" w:lineRule="auto"/>
+      </w:pPr>
+      <w:r>
+        <w:rPr>
+          <w:b/>
+        </w:rPr>
+        <w:t xml:space="preserve">AsetController.php: </w:t>
+      </w:r>
+      <w:r>
+        <w:t xml:space="preserve"> - Menangani manajemen inventaris alat medis.</w:t>
       </w:r>
     </w:p>
     <w:p>
@@ -401,7 +461,7 @@
         <w:ind w:left="360"/>
       </w:pPr>
       <w:r>
-        <w:t>Laravel mencocokkan rute di routes/api.php dan memprosesnya melalui middleware auth:sanctum.</w:t>
+        <w:t>index(): Menampilkan katalog aset. Menyaring data otomatis per unit untuk Unit_RS, dan menonaktifkan filter jika ada parameter pencarian (scan QR).</w:t>
       </w:r>
     </w:p>
     <w:p>
@@ -411,7 +471,7 @@
         <w:ind w:left="360"/>
       </w:pPr>
       <w:r>
-        <w:t>Middleware memverifikasi keaslian token pada tabel personal_access_tokens di database.</w:t>
+        <w:t>checkCanCreate() &amp; checkCanEditOrDelete(): Membatasi hak akses CRUD aset agar tidak dapat diakses oleh Unit_RS, Staf_Logistik (hanya bisa create), serta teknisi budi_ipsrs, hendra_ipsrs, dan agus_ipsrs.</w:t>
       </w:r>
     </w:p>
     <w:p>
@@ -421,7 +481,237 @@
         <w:ind w:left="360"/>
       </w:pPr>
       <w:r>
-        <w:t>Jika valid, request diteruskan ke Api\AsetController@updateTracking yang menyimpan koordinat GPS terbaru ke database.</w:t>
+        <w:t>store() &amp; update(): Melakukan validasi pengisian data aset medis dan meng-generate file gambar QR Code secara dinamis.</w:t>
+      </w:r>
+    </w:p>
+    <w:p>
+      <w:pPr>
+        <w:spacing w:after="120" w:line="276" w:lineRule="auto"/>
+      </w:pPr>
+      <w:r>
+        <w:rPr>
+          <w:b/>
+        </w:rPr>
+        <w:t xml:space="preserve">WorkOrderController.php: </w:t>
+      </w:r>
+      <w:r>
+        <w:t xml:space="preserve"> - Menangani alur pelaporan kerusakan alat medis.</w:t>
+      </w:r>
+    </w:p>
+    <w:p>
+      <w:pPr>
+        <w:pStyle w:val="ListBullet"/>
+        <w:spacing w:after="80" w:line="276" w:lineRule="auto"/>
+        <w:ind w:left="360"/>
+      </w:pPr>
+      <w:r>
+        <w:t>store(): Menyimpan tiket kerusakan baru dari Unit_RS dengan status default 'Open'.</w:t>
+      </w:r>
+    </w:p>
+    <w:p>
+      <w:pPr>
+        <w:pStyle w:val="ListBullet"/>
+        <w:spacing w:after="80" w:line="276" w:lineRule="auto"/>
+        <w:ind w:left="360"/>
+      </w:pPr>
+      <w:r>
+        <w:t>assignTeknisi(): Meng-assign teknisi penanggungjawab (budi_ipsrs, hendra_ipsrs, atau agus_ipsrs) ke dalam tiket. Diblokir jika diakses oleh teknisi lapangan itu sendiri.</w:t>
+      </w:r>
+    </w:p>
+    <w:p>
+      <w:pPr>
+        <w:pStyle w:val="ListBullet"/>
+        <w:spacing w:after="80" w:line="276" w:lineRule="auto"/>
+        <w:ind w:left="360"/>
+      </w:pPr>
+      <w:r>
+        <w:t>updateStatus(): Mengubah status progres perbaikan alat (Open -&gt; Pengecekan -&gt; Dikerjakan -&gt; Menunggu Sign-Off) oleh teknisi penanggungjawab.</w:t>
+      </w:r>
+    </w:p>
+    <w:p>
+      <w:pPr>
+        <w:spacing w:after="120" w:line="276" w:lineRule="auto"/>
+      </w:pPr>
+      <w:r>
+        <w:rPr>
+          <w:b/>
+        </w:rPr>
+        <w:t xml:space="preserve">MutasiController.php: </w:t>
+      </w:r>
+      <w:r>
+        <w:t xml:space="preserve"> - Mengelola alur pemindahan/mutasi alat medis antar ruangan.</w:t>
+      </w:r>
+    </w:p>
+    <w:p>
+      <w:pPr>
+        <w:pStyle w:val="ListBullet"/>
+        <w:spacing w:after="80" w:line="276" w:lineRule="auto"/>
+        <w:ind w:left="360"/>
+      </w:pPr>
+      <w:r>
+        <w:t>store(): Mengajukan pemindahan alat medis dengan status 'Menunggu_Verifikasi'.</w:t>
+      </w:r>
+    </w:p>
+    <w:p>
+      <w:pPr>
+        <w:pStyle w:val="ListBullet"/>
+        <w:spacing w:after="80" w:line="276" w:lineRule="auto"/>
+        <w:ind w:left="360"/>
+      </w:pPr>
+      <w:r>
+        <w:t>verify(): Logika verifikasi persetujuan (Approve/Reject) mutasi oleh IPSRS yang menggunakan DB::transaction() untuk memperbarui kolom id_ruang_saat_ini pada aset sekaligus mencatat log mutasi.</w:t>
+      </w:r>
+    </w:p>
+    <w:p>
+      <w:pPr>
+        <w:spacing w:after="120" w:line="276" w:lineRule="auto"/>
+      </w:pPr>
+      <w:r>
+        <w:rPr>
+          <w:b/>
+        </w:rPr>
+        <w:t xml:space="preserve">DirektoriController.php: </w:t>
+      </w:r>
+      <w:r>
+        <w:t xml:space="preserve"> - Mengelola master data ruangan rumah sakit dan direktori staff/SDM.</w:t>
+      </w:r>
+    </w:p>
+    <w:p>
+      <w:pPr>
+        <w:pStyle w:val="ListBullet"/>
+        <w:spacing w:after="80" w:line="276" w:lineRule="auto"/>
+        <w:ind w:left="360"/>
+      </w:pPr>
+      <w:r>
+        <w:t>checkAccess(): Memproteksi CRUD ruangan dan profil staff agar menolak role Unit_RS, Staf_Logistik, dan teknisi lapangan (Budi/Hendra/Agus).</w:t>
+      </w:r>
+    </w:p>
+    <w:p>
+      <w:pPr>
+        <w:pStyle w:val="Heading2"/>
+        <w:keepNext/>
+        <w:spacing w:before="240" w:after="120"/>
+      </w:pPr>
+      <w:r>
+        <w:rPr>
+          <w:b/>
+          <w:color w:val="1A5685"/>
+          <w:sz w:val="24"/>
+        </w:rPr>
+        <w:t>3. API Controllers (app/Http/Controllers/Api/)</w:t>
+      </w:r>
+    </w:p>
+    <w:p>
+      <w:pPr>
+        <w:spacing w:after="120" w:line="276" w:lineRule="auto"/>
+      </w:pPr>
+      <w:r>
+        <w:rPr>
+          <w:b/>
+        </w:rPr>
+        <w:t xml:space="preserve">ApiAuthController.php: </w:t>
+      </w:r>
+      <w:r>
+        <w:t xml:space="preserve"> - Melayani proses autentikasi (login/logout) aplikasi mobile tracker Android Kotlin dan menghasilkan string plainTextToken Sanctum.</w:t>
+      </w:r>
+    </w:p>
+    <w:p>
+      <w:pPr>
+        <w:spacing w:after="120" w:line="276" w:lineRule="auto"/>
+      </w:pPr>
+      <w:r>
+        <w:rPr>
+          <w:b/>
+        </w:rPr>
+        <w:t xml:space="preserve">ApiAsetController.php: </w:t>
+      </w:r>
+      <w:r>
+        <w:t xml:space="preserve"> - Melayani kueri data inventaris aset dan menerima update data posisi koordinat GPS tracker dari aplikasi Android untuk disimpan ke tabel t_aset.</w:t>
+      </w:r>
+    </w:p>
+    <w:p>
+      <w:pPr>
+        <w:pStyle w:val="Heading2"/>
+        <w:keepNext/>
+        <w:spacing w:before="240" w:after="120"/>
+      </w:pPr>
+      <w:r>
+        <w:rPr>
+          <w:b/>
+          <w:color w:val="1A5685"/>
+          <w:sz w:val="24"/>
+        </w:rPr>
+        <w:t>4. Halaman React Pages (resources/js/Pages/)</w:t>
+      </w:r>
+    </w:p>
+    <w:p>
+      <w:pPr>
+        <w:pStyle w:val="ListBullet"/>
+        <w:spacing w:after="80" w:line="276" w:lineRule="auto"/>
+        <w:ind w:left="360"/>
+      </w:pPr>
+      <w:r>
+        <w:t>Dashboard.jsx - Merender visual statistik dasbor, chart grafik tingkat kerusakan, dan penampakan daftar notifikasi terkini.</w:t>
+      </w:r>
+    </w:p>
+    <w:p>
+      <w:pPr>
+        <w:pStyle w:val="ListBullet"/>
+        <w:spacing w:after="80" w:line="276" w:lineRule="auto"/>
+        <w:ind w:left="360"/>
+      </w:pPr>
+      <w:r>
+        <w:t>Aset/Index.jsx - Katalog data aset medis lengkap dengan kartu informasi, tombol tambah/edit/hapus (sesuai otorisasi), dan integrasi scan QR Code.</w:t>
+      </w:r>
+    </w:p>
+    <w:p>
+      <w:pPr>
+        <w:pStyle w:val="ListBullet"/>
+        <w:spacing w:after="80" w:line="276" w:lineRule="auto"/>
+        <w:ind w:left="360"/>
+      </w:pPr>
+      <w:r>
+        <w:t>Aset/Show.jsx - Detail spesifikasi aset medis dan visualisasi peta pelacakan posisi GPS real-time.</w:t>
+      </w:r>
+    </w:p>
+    <w:p>
+      <w:pPr>
+        <w:pStyle w:val="ListBullet"/>
+        <w:spacing w:after="80" w:line="276" w:lineRule="auto"/>
+        <w:ind w:left="360"/>
+      </w:pPr>
+      <w:r>
+        <w:t>WorkOrder/Index.jsx - Tiket pelaporan kerusakan, dilengkapi dropdown inline untuk mengubah status perbaikan (bagi teknisi) dan assign teknisi (bagi admin).</w:t>
+      </w:r>
+    </w:p>
+    <w:p>
+      <w:pPr>
+        <w:pStyle w:val="ListBullet"/>
+        <w:spacing w:after="80" w:line="276" w:lineRule="auto"/>
+        <w:ind w:left="360"/>
+      </w:pPr>
+      <w:r>
+        <w:t>Mutasi/Index.jsx - Daftar riwayat mutasi alat dilengkapi pill badge status verifikasi (Pending, Approved, Rejected).</w:t>
+      </w:r>
+    </w:p>
+    <w:p>
+      <w:pPr>
+        <w:pStyle w:val="ListBullet"/>
+        <w:spacing w:after="80" w:line="276" w:lineRule="auto"/>
+        <w:ind w:left="360"/>
+      </w:pPr>
+      <w:r>
+        <w:t>Direktori/Index.jsx - Grid data ruangan dan direktori staff rumah sakit.</w:t>
+      </w:r>
+    </w:p>
+    <w:p>
+      <w:pPr>
+        <w:pStyle w:val="ListBullet"/>
+        <w:spacing w:after="80" w:line="276" w:lineRule="auto"/>
+        <w:ind w:left="360"/>
+      </w:pPr>
+      <w:r>
+        <w:t>Layouts/AuthenticatedLayout.jsx - Layout utama pembungkus halaman. Di sini diletakkan menu navigasi sidebar, bell notifikasi dengan filter role, dan modal kamera scanner QR Code.</w:t>
       </w:r>
     </w:p>
     <w:p>
@@ -436,7 +726,118 @@
           <w:color w:val="0A3A60"/>
           <w:sz w:val="28"/>
         </w:rPr>
-        <w:t>BAB III: BEDAH LOGIKA DAN KODE CRITICAL (PERTANYAAN KHUSUS DOSEN)</w:t>
+        <w:t>BAB III: ALUR DATA DAN REQUEST-RESPONSE LIFECYCLE (BAGAIMANA APLIKASI BEKERJA)</w:t>
+      </w:r>
+    </w:p>
+    <w:p>
+      <w:pPr>
+        <w:spacing w:after="120" w:line="276" w:lineRule="auto"/>
+      </w:pPr>
+      <w:r>
+        <w:t>Siklus Web Client (Inertia.js):</w:t>
+      </w:r>
+    </w:p>
+    <w:p>
+      <w:pPr>
+        <w:pStyle w:val="ListBullet"/>
+        <w:spacing w:after="80" w:line="276" w:lineRule="auto"/>
+        <w:ind w:left="360"/>
+      </w:pPr>
+      <w:r>
+        <w:t>Pengguna mengklik tombol menu 'Aset Medis' di sidebar.</w:t>
+      </w:r>
+    </w:p>
+    <w:p>
+      <w:pPr>
+        <w:pStyle w:val="ListBullet"/>
+        <w:spacing w:after="80" w:line="276" w:lineRule="auto"/>
+        <w:ind w:left="360"/>
+      </w:pPr>
+      <w:r>
+        <w:t>Inertia mengirimkan request AJAX XHR di latar belakang ke URL /aset.</w:t>
+      </w:r>
+    </w:p>
+    <w:p>
+      <w:pPr>
+        <w:pStyle w:val="ListBullet"/>
+        <w:spacing w:after="80" w:line="276" w:lineRule="auto"/>
+        <w:ind w:left="360"/>
+      </w:pPr>
+      <w:r>
+        <w:t>Laravel memproses di AsetController@index, meng-query database via model Aset::with('ruangan')-&gt;get(), dan mengembalikan render:</w:t>
+      </w:r>
+    </w:p>
+    <w:p>
+      <w:pPr>
+        <w:pStyle w:val="ListBullet"/>
+        <w:spacing w:after="80" w:line="276" w:lineRule="auto"/>
+        <w:ind w:left="720"/>
+      </w:pPr>
+      <w:r>
+        <w:t>return Inertia::render('Aset/Index', ['asets' =&gt; $asets]);</w:t>
+      </w:r>
+    </w:p>
+    <w:p>
+      <w:pPr>
+        <w:pStyle w:val="ListBullet"/>
+        <w:spacing w:after="80" w:line="276" w:lineRule="auto"/>
+        <w:ind w:left="360"/>
+      </w:pPr>
+      <w:r>
+        <w:t>Inertia menangkap data payload JSON dan mengganti konten halaman React Aset/Index.jsx secara instan tanpa memicu reload browser penuh.</w:t>
+      </w:r>
+    </w:p>
+    <w:p>
+      <w:pPr>
+        <w:spacing w:after="120" w:line="276" w:lineRule="auto"/>
+      </w:pPr>
+      <w:r>
+        <w:t>Siklus REST API Android (Laravel Sanctum):</w:t>
+      </w:r>
+    </w:p>
+    <w:p>
+      <w:pPr>
+        <w:pStyle w:val="ListBullet"/>
+        <w:spacing w:after="80" w:line="276" w:lineRule="auto"/>
+        <w:ind w:left="360"/>
+      </w:pPr>
+      <w:r>
+        <w:t>Aplikasi Android mengirim request POST ke /api/login untuk mendapatkan Bearer Token.</w:t>
+      </w:r>
+    </w:p>
+    <w:p>
+      <w:pPr>
+        <w:pStyle w:val="ListBullet"/>
+        <w:spacing w:after="80" w:line="276" w:lineRule="auto"/>
+        <w:ind w:left="360"/>
+      </w:pPr>
+      <w:r>
+        <w:t>Android menyimpan token secara lokal dan melampirkannya di header 'Authorization: Bearer &lt;token&gt;' pada request POST /api/tracking.</w:t>
+      </w:r>
+    </w:p>
+    <w:p>
+      <w:pPr>
+        <w:pStyle w:val="ListBullet"/>
+        <w:spacing w:after="80" w:line="276" w:lineRule="auto"/>
+        <w:ind w:left="360"/>
+      </w:pPr>
+      <w:r>
+        <w:t>Laravel menyaring request melalui middleware auth:sanctum untuk mencocokkan ke database. Jika valid, koordinat GPS diperbarui.</w:t>
+      </w:r>
+    </w:p>
+    <w:p>
+      <w:pPr>
+        <w:pStyle w:val="Heading1"/>
+        <w:keepNext/>
+        <w:spacing w:before="360" w:after="160"/>
+      </w:pPr>
+      <w:r>
+        <w:rPr>
+          <w:b/>
+          <w:color w:val="0A3A60"/>
+          <w:sz w:val="28"/>
+        </w:rPr>
+        <w:t>BAB IV: BEDAH LOGIKA DAN KODE CRITICAL</w:t>
       </w:r>
     </w:p>
     <w:p>
@@ -451,7 +852,7 @@
           <w:color w:val="1A5685"/>
           <w:sz w:val="24"/>
         </w:rPr>
-        <w:t>Logika Mutasi Aset &amp; Keamanan Database Transactions</w:t>
+        <w:t>Notifikasi Lonceng Dinamis di Layout Header</w:t>
       </w:r>
     </w:p>
     <w:p>
@@ -459,15 +860,7 @@
         <w:spacing w:after="120" w:line="276" w:lineRule="auto"/>
       </w:pPr>
       <w:r>
-        <w:t>Fokus Pembahasan: Pertanyaan Dosen: 'Bagaimana logika mutasi alat medis dan bagaimana Anda menjamin konsistensi?'</w:t>
-      </w:r>
-    </w:p>
-    <w:p>
-      <w:pPr>
-        <w:spacing w:after="120" w:line="276" w:lineRule="auto"/>
-      </w:pPr>
-      <w:r>
-        <w:t>Di dalam file MutasiController.php, transaksi dilakukan di dalam blok DB::transaction(). Hal ini penting untuk memastikan sifat Atomicity (semua berhasil atau tidak sama sekali):</w:t>
+        <w:t>Notifikasi dikumpulkan secara terpusat di HandleInertiaRequests.php berdasarkan role pengguna yang login:</w:t>
       </w:r>
     </w:p>
     <w:p>
@@ -477,7 +870,7 @@
         <w:ind w:left="360"/>
       </w:pPr>
       <w:r>
-        <w:t>Sistem memverifikasi status aset dan ruangan tujuan.</w:t>
+        <w:t>IPSRS: Laporan kerusakan baru (Open WO), mutasi menunggu verifikasi, dan jadwal pemeliharaan (PM).</w:t>
       </w:r>
     </w:p>
     <w:p>
@@ -487,7 +880,7 @@
         <w:ind w:left="360"/>
       </w:pPr>
       <w:r>
-        <w:t>Jika validasi lolos, jalankan DB::transaction(function() { ... })</w:t>
+        <w:t>Logistik: Aset medis yang tanggal sertifikat kalibrasinya sudah kadaluarsa (expired).</w:t>
       </w:r>
     </w:p>
     <w:p>
@@ -497,7 +890,7 @@
         <w:ind w:left="360"/>
       </w:pPr>
       <w:r>
-        <w:t>Sistem memperbarui kolom id_ruang_saat_ini pada tabel t_aset.</w:t>
+        <w:t>Unit_RS: Status penanganan tiket kerusakan aktif di unit ruangan mereka.</w:t>
       </w:r>
     </w:p>
     <w:p>
@@ -507,17 +900,7 @@
         <w:ind w:left="360"/>
       </w:pPr>
       <w:r>
-        <w:t>Sistem mencatat riwayat log mutasi ke tabel t_mutasi.</w:t>
-      </w:r>
-    </w:p>
-    <w:p>
-      <w:pPr>
-        <w:pStyle w:val="ListBullet"/>
-        <w:spacing w:after="80" w:line="276" w:lineRule="auto"/>
-        <w:ind w:left="360"/>
-      </w:pPr>
-      <w:r>
-        <w:t>Jika terjadi error di tengah proses (misalnya koneksi putus saat menyimpan log mutasi), Laravel otomatis membatalkan pembaruan ruangan pada aset (Rollback) agar data tetap konsisten.</w:t>
+        <w:t>Fungsi Dismiss: Di frontend AuthenticatedLayout.jsx, saat notifikasi diklik, ID item disimpan ke localStorage. Notifikasi tersebut langsung hilang dari lonceng secara real-time dan browser mengarahkan pengguna ke halaman form tujuan.</w:t>
       </w:r>
     </w:p>
     <w:p>
@@ -532,7 +915,7 @@
           <w:color w:val="1A5685"/>
           <w:sz w:val="24"/>
         </w:rPr>
-        <w:t>Logika Work Order (Alur Pelaporan Kerusakan)</w:t>
+        <w:t>Keamanan Mutasi Aset (DB Transactions)</w:t>
       </w:r>
     </w:p>
     <w:p>
@@ -540,374 +923,7 @@
         <w:spacing w:after="120" w:line="276" w:lineRule="auto"/>
       </w:pPr>
       <w:r>
-        <w:t>Fokus Pembahasan: Pertanyaan Dosen: 'Bagaimana alur pelaporan kerusakan dan penugasan teknisi?'</w:t>
-      </w:r>
-    </w:p>
-    <w:p>
-      <w:pPr>
-        <w:pStyle w:val="ListBullet"/>
-        <w:spacing w:after="80" w:line="276" w:lineRule="auto"/>
-        <w:ind w:left="360"/>
-      </w:pPr>
-      <w:r>
-        <w:t>Pengguna dengan peran 'Unit_RS' mengirimkan laporan kerusakan alat dari unitnya. Status awal diset default ke 'Open'.</w:t>
-      </w:r>
-    </w:p>
-    <w:p>
-      <w:pPr>
-        <w:pStyle w:val="ListBullet"/>
-        <w:spacing w:after="80" w:line="276" w:lineRule="auto"/>
-        <w:ind w:left="360"/>
-      </w:pPr>
-      <w:r>
-        <w:t>Pengguna dengan peran 'Admin_IPSRS' masuk ke menu Work Order, melihat tiket 'Open' tersebut, lalu menunjuk teknisi penanggungjawab.</w:t>
-      </w:r>
-    </w:p>
-    <w:p>
-      <w:pPr>
-        <w:pStyle w:val="ListBullet"/>
-        <w:spacing w:after="80" w:line="276" w:lineRule="auto"/>
-        <w:ind w:left="360"/>
-      </w:pPr>
-      <w:r>
-        <w:t>Teknisi lapangan (Budi, Hendra, Agus) masuk dengan akun mereka. Mereka hanya bisa melihat daftar tugas mereka dan memperbarui progres status (Open -&gt; Dikerjakan -&gt; Menunggu Sign-Off).</w:t>
-      </w:r>
-    </w:p>
-    <w:p>
-      <w:pPr>
-        <w:pStyle w:val="ListBullet"/>
-        <w:spacing w:after="80" w:line="276" w:lineRule="auto"/>
-        <w:ind w:left="360"/>
-      </w:pPr>
-      <w:r>
-        <w:t>Setelah selesai, status diset menjadi 'Closed' setelah divalidasi.</w:t>
-      </w:r>
-    </w:p>
-    <w:p>
-      <w:pPr>
-        <w:pStyle w:val="Heading2"/>
-        <w:keepNext/>
-        <w:spacing w:before="240" w:after="120"/>
-      </w:pPr>
-      <w:r>
-        <w:rPr>
-          <w:b/>
-          <w:color w:val="1A5685"/>
-          <w:sz w:val="24"/>
-        </w:rPr>
-        <w:t>Pengelolaan Laporan Cetak PDF (Print-Friendly CSS)</w:t>
-      </w:r>
-    </w:p>
-    <w:p>
-      <w:pPr>
-        <w:spacing w:after="120" w:line="276" w:lineRule="auto"/>
-      </w:pPr>
-      <w:r>
-        <w:t>Fokus Pembahasan: Pertanyaan Dosen: 'Bagaimana laporan dicetak menjadi PDF?'</w:t>
-      </w:r>
-    </w:p>
-    <w:p>
-      <w:pPr>
-        <w:spacing w:after="120" w:line="276" w:lineRule="auto"/>
-      </w:pPr>
-      <w:r>
-        <w:t>Di halaman resources/js/Pages/Aset/Index.jsx, tombol 'Cetak' memicu window.print(). Kita menggunakan utility class Tailwind CSS khusus cetak:</w:t>
-      </w:r>
-    </w:p>
-    <w:p>
-      <w:pPr>
-        <w:pStyle w:val="ListBullet"/>
-        <w:spacing w:after="80" w:line="276" w:lineRule="auto"/>
-        <w:ind w:left="360"/>
-      </w:pPr>
-      <w:r>
-        <w:t>print:hidden -&gt; Menyembunyikan sidebar, topbar, dan tombol aksi cetak saat proses print PDF berlangsung.</w:t>
-      </w:r>
-    </w:p>
-    <w:p>
-      <w:pPr>
-        <w:pStyle w:val="ListBullet"/>
-        <w:spacing w:after="80" w:line="276" w:lineRule="auto"/>
-        <w:ind w:left="360"/>
-      </w:pPr>
-      <w:r>
-        <w:t>print:block -&gt; Memunculkan Kop Laporan resmi yang disembunyikan di layar monitor biasa.</w:t>
-      </w:r>
-    </w:p>
-    <w:p>
-      <w:pPr>
-        <w:pStyle w:val="ListBullet"/>
-        <w:spacing w:after="80" w:line="276" w:lineRule="auto"/>
-        <w:ind w:left="360"/>
-      </w:pPr>
-      <w:r>
-        <w:t>print:shadow-none &amp; print:border-none -&gt; Menghilangkan bayangan dan border dekoratif agar hasil cetak PDF bersih.</w:t>
-      </w:r>
-    </w:p>
-    <w:p>
-      <w:pPr>
-        <w:pStyle w:val="Heading1"/>
-        <w:keepNext/>
-        <w:spacing w:before="360" w:after="160"/>
-      </w:pPr>
-      <w:r>
-        <w:rPr>
-          <w:b/>
-          <w:color w:val="0A3A60"/>
-          <w:sz w:val="28"/>
-        </w:rPr>
-        <w:t>BAB IV: BEDAH DETAIL FILE KODE PROGRAM (FUNGSI DAN PENJELASAN KODE)</w:t>
-      </w:r>
-    </w:p>
-    <w:p>
-      <w:pPr>
-        <w:pStyle w:val="Heading2"/>
-        <w:keepNext/>
-        <w:spacing w:before="240" w:after="120"/>
-      </w:pPr>
-      <w:r>
-        <w:rPr>
-          <w:b/>
-          <w:color w:val="1A5685"/>
-          <w:sz w:val="24"/>
-        </w:rPr>
-        <w:t>File Migrasi Database</w:t>
-      </w:r>
-    </w:p>
-    <w:p>
-      <w:pPr>
-        <w:spacing w:after="120" w:line="276" w:lineRule="auto"/>
-      </w:pPr>
-      <w:r>
-        <w:t>Mendefinisikan skema tabel database MySQL secara relasional:</w:t>
-      </w:r>
-    </w:p>
-    <w:p>
-      <w:pPr>
-        <w:pStyle w:val="ListBullet"/>
-        <w:spacing w:after="80" w:line="276" w:lineRule="auto"/>
-        <w:ind w:left="360"/>
-      </w:pPr>
-      <w:r>
-        <w:t>Tabel m_ruangan: Dibuat dengan kolom nama_ruang ber-constraint unique() agar tidak ada ruangan ganda.</w:t>
-      </w:r>
-    </w:p>
-    <w:p>
-      <w:pPr>
-        <w:pStyle w:val="ListBullet"/>
-        <w:spacing w:after="80" w:line="276" w:lineRule="auto"/>
-        <w:ind w:left="360"/>
-      </w:pPr>
-      <w:r>
-        <w:t>Tabel t_aset: Memiliki kolom id_ruang sebagai foreign key yang dihubungkan ke m_ruangan menggunakan constrained('m_ruangan')-&gt;nullOnDelete().</w:t>
-      </w:r>
-    </w:p>
-    <w:p>
-      <w:pPr>
-        <w:pStyle w:val="ListBullet"/>
-        <w:spacing w:after="80" w:line="276" w:lineRule="auto"/>
-        <w:ind w:left="360"/>
-      </w:pPr>
-      <w:r>
-        <w:t>Tabel t_mutasi: Melacak log perpindahan aset (id_aset, id_ruang_asal, id_ruang_tujuan).</w:t>
-      </w:r>
-    </w:p>
-    <w:p>
-      <w:pPr>
-        <w:pStyle w:val="ListBullet"/>
-        <w:spacing w:after="80" w:line="276" w:lineRule="auto"/>
-        <w:ind w:left="360"/>
-      </w:pPr>
-      <w:r>
-        <w:t>Tabel t_troubleshoot: Melacak tiket kerusakan (id_aset, id_user_pelapor, id_teknisi_penanggungjawab, status_ticket).</w:t>
-      </w:r>
-    </w:p>
-    <w:p>
-      <w:pPr>
-        <w:pStyle w:val="Heading2"/>
-        <w:keepNext/>
-        <w:spacing w:before="240" w:after="120"/>
-      </w:pPr>
-      <w:r>
-        <w:rPr>
-          <w:b/>
-          <w:color w:val="1A5685"/>
-          <w:sz w:val="24"/>
-        </w:rPr>
-        <w:t>File Model (app/Models/Aset.php)</w:t>
-      </w:r>
-    </w:p>
-    <w:p>
-      <w:pPr>
-        <w:spacing w:after="120" w:line="276" w:lineRule="auto"/>
-      </w:pPr>
-      <w:r>
-        <w:t>Model Eloquent bertindak sebagai perwakilan tabel database di pemrograman PHP berbasis objek:</w:t>
-      </w:r>
-    </w:p>
-    <w:p>
-      <w:pPr>
-        <w:pStyle w:val="ListBullet"/>
-        <w:spacing w:after="80" w:line="276" w:lineRule="auto"/>
-        <w:ind w:left="360"/>
-      </w:pPr>
-      <w:r>
-        <w:t>protected $fillable: Daftar kolom yang diizinkan untuk diisi secara massal (mass assignment).</w:t>
-      </w:r>
-    </w:p>
-    <w:p>
-      <w:pPr>
-        <w:pStyle w:val="ListBullet"/>
-        <w:spacing w:after="80" w:line="276" w:lineRule="auto"/>
-        <w:ind w:left="360"/>
-      </w:pPr>
-      <w:r>
-        <w:t>public function ruangan(): Mendefinisikan relasi belongsTo(Ruangan::class) untuk mendapatkan nama ruangan asal aset.</w:t>
-      </w:r>
-    </w:p>
-    <w:p>
-      <w:pPr>
-        <w:pStyle w:val="ListBullet"/>
-        <w:spacing w:after="80" w:line="276" w:lineRule="auto"/>
-        <w:ind w:left="360"/>
-      </w:pPr>
-      <w:r>
-        <w:t>public function troubleshoot(): Mendefinisikan relasi hasMany(Troubleshoot::class) untuk menarik riwayat kerusakan alat.</w:t>
-      </w:r>
-    </w:p>
-    <w:p>
-      <w:pPr>
-        <w:pStyle w:val="Heading2"/>
-        <w:keepNext/>
-        <w:spacing w:before="240" w:after="120"/>
-      </w:pPr>
-      <w:r>
-        <w:rPr>
-          <w:b/>
-          <w:color w:val="1A5685"/>
-          <w:sz w:val="24"/>
-        </w:rPr>
-        <w:t>File Controller Aset (app/Http/Controllers/Web/AsetController.php)</w:t>
-      </w:r>
-    </w:p>
-    <w:p>
-      <w:pPr>
-        <w:spacing w:after="120" w:line="276" w:lineRule="auto"/>
-      </w:pPr>
-      <w:r>
-        <w:t>Melayani CRUD aset medis dan pencarian global scan QR Code:</w:t>
-      </w:r>
-    </w:p>
-    <w:p>
-      <w:pPr>
-        <w:pStyle w:val="ListBullet"/>
-        <w:spacing w:after="80" w:line="276" w:lineRule="auto"/>
-        <w:ind w:left="360"/>
-      </w:pPr>
-      <w:r>
-        <w:t>Proteksi Peran (Role Checking): Menggunakan method checkCanCreate() dan checkCanEditOrDelete() untuk memblokir Staf_Logistik dari aksi Edit/Hapus, memblokir Unit_RS sepenuhnya, serta memblokir teknisi budi_ipsrs, hendra_ipsrs, dan agus_ipsrs dari operasi CRUD.</w:t>
-      </w:r>
-    </w:p>
-    <w:p>
-      <w:pPr>
-        <w:pStyle w:val="ListBullet"/>
-        <w:spacing w:after="80" w:line="276" w:lineRule="auto"/>
-        <w:ind w:left="360"/>
-      </w:pPr>
-      <w:r>
-        <w:t>Pencarian Global: Menggunakan query search global yang mengabaikan filter unit jika ada input parameter search (scan QR Code).</w:t>
-      </w:r>
-    </w:p>
-    <w:p>
-      <w:pPr>
-        <w:pStyle w:val="Heading2"/>
-        <w:keepNext/>
-        <w:spacing w:before="240" w:after="120"/>
-      </w:pPr>
-      <w:r>
-        <w:rPr>
-          <w:b/>
-          <w:color w:val="1A5685"/>
-          <w:sz w:val="24"/>
-        </w:rPr>
-        <w:t>File Controller Mutasi (app/Http/Controllers/Web/MutasiController.php)</w:t>
-      </w:r>
-    </w:p>
-    <w:p>
-      <w:pPr>
-        <w:spacing w:after="120" w:line="276" w:lineRule="auto"/>
-      </w:pPr>
-      <w:r>
-        <w:t>Menangani pengajuan mutasi dan persetujuan (approval) oleh IPSRS menggunakan DB::transaction() untuk menjaga integritas data.</w:t>
-      </w:r>
-    </w:p>
-    <w:p>
-      <w:pPr>
-        <w:pStyle w:val="Heading2"/>
-        <w:keepNext/>
-        <w:spacing w:before="240" w:after="120"/>
-      </w:pPr>
-      <w:r>
-        <w:rPr>
-          <w:b/>
-          <w:color w:val="1A5685"/>
-          <w:sz w:val="24"/>
-        </w:rPr>
-        <w:t>File API Auth Controller (app/Http/Controllers/Api/AuthController.php)</w:t>
-      </w:r>
-    </w:p>
-    <w:p>
-      <w:pPr>
-        <w:spacing w:after="120" w:line="276" w:lineRule="auto"/>
-      </w:pPr>
-      <w:r>
-        <w:t>Menangani login dan pembuatan token khusus aplikasi Android Kotlin menggunakan Sanctum via method $user-&gt;createToken('device_name')-&gt;plainTextToken.</w:t>
-      </w:r>
-    </w:p>
-    <w:p>
-      <w:pPr>
-        <w:pStyle w:val="Heading2"/>
-        <w:keepNext/>
-        <w:spacing w:before="240" w:after="120"/>
-      </w:pPr>
-      <w:r>
-        <w:rPr>
-          <w:b/>
-          <w:color w:val="1A5685"/>
-          <w:sz w:val="24"/>
-        </w:rPr>
-        <w:t>File Page Aset (resources/js/Pages/Aset/Index.jsx)</w:t>
-      </w:r>
-    </w:p>
-    <w:p>
-      <w:pPr>
-        <w:spacing w:after="120" w:line="276" w:lineRule="auto"/>
-      </w:pPr>
-      <w:r>
-        <w:t>Komponen React utama untuk menampilkan aset medis. Dilengkapi filter pencarian, list kartu, scan QR Code terintegrasi webcam, dan detail pelacakan posisi peta.</w:t>
-      </w:r>
-    </w:p>
-    <w:p>
-      <w:pPr>
-        <w:pStyle w:val="Heading2"/>
-        <w:keepNext/>
-        <w:spacing w:before="240" w:after="120"/>
-      </w:pPr>
-      <w:r>
-        <w:rPr>
-          <w:b/>
-          <w:color w:val="1A5685"/>
-          <w:sz w:val="24"/>
-        </w:rPr>
-        <w:t>File Layout (resources/js/Layouts/AuthenticatedLayout.jsx)</w:t>
-      </w:r>
-    </w:p>
-    <w:p>
-      <w:pPr>
-        <w:spacing w:after="120" w:line="276" w:lineRule="auto"/>
-      </w:pPr>
-      <w:r>
-        <w:t>Menyediakan kerangka tampilan konsisten (sidebar dan header). Menampung widget notifikasi lonceng dinamis yang didistribusikan dari shared props, serta modal kamera scan QR Code.</w:t>
+        <w:t>Proses mutasi di MutasiController dibungkus dalam blok DB::transaction() untuk menjaga konsistensi. Jika salah satu proses gagal, seluruh kueri dibatalkan (Rollback) agar tidak ada data ruangan aset yang tidak sinkron.</w:t>
       </w:r>
     </w:p>
     <w:p>
@@ -937,7 +953,7 @@
           <w:color w:val="1A5685"/>
           <w:sz w:val="24"/>
         </w:rPr>
-        <w:t>Laravel: Framework Backend PHP Modern</w:t>
+        <w:t>Laravel (MVC &amp; ORM)</w:t>
       </w:r>
     </w:p>
     <w:p>
@@ -947,7 +963,7 @@
         <w:ind w:left="360"/>
       </w:pPr>
       <w:r>
-        <w:t>Model-View-Controller (MVC): Pola arsitektur yang memisahkan data (Model), tampilan antarmuka (View/React), dan logika kontrol (Controller).</w:t>
+        <w:t>MVC: Pemisahan data (Model), antarmuka (View/React), dan logika (Controller) agar kode terstruktur.</w:t>
       </w:r>
     </w:p>
     <w:p>
@@ -957,7 +973,7 @@
         <w:ind w:left="360"/>
       </w:pPr>
       <w:r>
-        <w:t>Eloquent ORM: Teknik pemrograman untuk memetakan tabel database ke objek PHP (misal Aset::all()).</w:t>
+        <w:t>Eloquent ORM: Mengubah baris tabel database menjadi objek PHP (Aset::find(1)).</w:t>
       </w:r>
     </w:p>
     <w:p>
@@ -967,17 +983,7 @@
         <w:ind w:left="360"/>
       </w:pPr>
       <w:r>
-        <w:t>Middleware: Lapisan filter keamanan HTTP request (seperti memverifikasi login session atau token API).</w:t>
-      </w:r>
-    </w:p>
-    <w:p>
-      <w:pPr>
-        <w:pStyle w:val="ListBullet"/>
-        <w:spacing w:after="80" w:line="276" w:lineRule="auto"/>
-        <w:ind w:left="360"/>
-      </w:pPr>
-      <w:r>
-        <w:t>Database Transactions: Pengelompokan beberapa perintah query (commit dan rollback) untuk menjamin integritas data.</w:t>
+        <w:t>Middleware: Filter keamanan HTTP request (seperti mengecek login session atau token API).</w:t>
       </w:r>
     </w:p>
     <w:p>
@@ -992,7 +998,7 @@
           <w:color w:val="1A5685"/>
           <w:sz w:val="24"/>
         </w:rPr>
-        <w:t>React.js: Library Frontend Berbasis Komponen</w:t>
+        <w:t>React.js (Virtual DOM &amp; State)</w:t>
       </w:r>
     </w:p>
     <w:p>
@@ -1002,7 +1008,7 @@
         <w:ind w:left="360"/>
       </w:pPr>
       <w:r>
-        <w:t>Component-based Architecture: UI dipecah menjadi bagian mandiri yang reusable.</w:t>
+        <w:t>Virtual DOM: React membandingkan salinan DOM di memori dengan DOM asli dan hanya me-render bagian HTML yang berubah saja (Diffing Algorithm), sehingga sangat cepat.</w:t>
       </w:r>
     </w:p>
     <w:p>
@@ -1012,72 +1018,7 @@
         <w:ind w:left="360"/>
       </w:pPr>
       <w:r>
-        <w:t>Virtual DOM: Salinan DOM asli di memori. React hanya meng-update elemen HTML yang berubah saja (Diffing Algorithm) sehingga performa web sangat cepat.</w:t>
-      </w:r>
-    </w:p>
-    <w:p>
-      <w:pPr>
-        <w:pStyle w:val="ListBullet"/>
-        <w:spacing w:after="80" w:line="276" w:lineRule="auto"/>
-        <w:ind w:left="360"/>
-      </w:pPr>
-      <w:r>
-        <w:t>State vs Props: State adalah data internal komponen (dapat diubah), sedangkan Props adalah data dari komponen induk (read-only).</w:t>
-      </w:r>
-    </w:p>
-    <w:p>
-      <w:pPr>
-        <w:pStyle w:val="ListBullet"/>
-        <w:spacing w:after="80" w:line="276" w:lineRule="auto"/>
-        <w:ind w:left="360"/>
-      </w:pPr>
-      <w:r>
-        <w:t>React Hooks: Fungsi bawaan React seperti useState() untuk state lokal dan useEffect() untuk lifecycle side-effects.</w:t>
-      </w:r>
-    </w:p>
-    <w:p>
-      <w:pPr>
-        <w:pStyle w:val="Heading2"/>
-        <w:keepNext/>
-        <w:spacing w:before="240" w:after="120"/>
-      </w:pPr>
-      <w:r>
-        <w:rPr>
-          <w:b/>
-          <w:color w:val="1A5685"/>
-          <w:sz w:val="24"/>
-        </w:rPr>
-        <w:t>REST API &amp; Laravel Sanctum</w:t>
-      </w:r>
-    </w:p>
-    <w:p>
-      <w:pPr>
-        <w:pStyle w:val="ListBullet"/>
-        <w:spacing w:after="80" w:line="276" w:lineRule="auto"/>
-        <w:ind w:left="360"/>
-      </w:pPr>
-      <w:r>
-        <w:t>Statelessness: Server tidak menyimpan status session klien. Setiap HTTP request Android membawa token autentikasi.</w:t>
-      </w:r>
-    </w:p>
-    <w:p>
-      <w:pPr>
-        <w:pStyle w:val="ListBullet"/>
-        <w:spacing w:after="80" w:line="276" w:lineRule="auto"/>
-        <w:ind w:left="360"/>
-      </w:pPr>
-      <w:r>
-        <w:t>HTTP Methods: Aksi standar komunikasi: GET (ambil), POST (buat baru), PUT/PATCH (update), DELETE (hapus).</w:t>
-      </w:r>
-    </w:p>
-    <w:p>
-      <w:pPr>
-        <w:pStyle w:val="ListBullet"/>
-        <w:spacing w:after="80" w:line="276" w:lineRule="auto"/>
-        <w:ind w:left="360"/>
-      </w:pPr>
-      <w:r>
-        <w:t>Laravel Sanctum: Sistem autentikasi token ringan untuk mengamankan endpoint REST API.</w:t>
+        <w:t>State vs Props: State adalah variabel lokal internal komponen (dapat diubah), sedangkan Props adalah data kiriman dari parent/controller (read-only).</w:t>
       </w:r>
     </w:p>
     <w:p>
@@ -1097,10 +1038,12 @@
     </w:p>
     <w:p>
       <w:pPr>
-        <w:spacing w:after="120" w:line="276" w:lineRule="auto"/>
+        <w:pStyle w:val="ListBullet"/>
+        <w:spacing w:after="80" w:line="276" w:lineRule="auto"/>
+        <w:ind w:left="360"/>
       </w:pPr>
       <w:r>
-        <w:t>Dosen sering menanyakan kegunaan berkas konfigurasi di root direktori proyek:</w:t>
+        <w:t>.env - Kredensial database lokal dan kunci enkripsi aplikasi.</w:t>
       </w:r>
     </w:p>
     <w:p>
@@ -1110,7 +1053,7 @@
         <w:ind w:left="360"/>
       </w:pPr>
       <w:r>
-        <w:t>.env &amp; .env.example: Menyimpan kredensial database lokal, app key, dan variabel lingkungan sensitif.</w:t>
+        <w:t>composer.json - Package manager PHP untuk mengelola dependensi Laravel backend.</w:t>
       </w:r>
     </w:p>
     <w:p>
@@ -1120,7 +1063,7 @@
         <w:ind w:left="360"/>
       </w:pPr>
       <w:r>
-        <w:t>.editorconfig &amp; .eslintrc.json: Menstandarkan gaya penulisan kode JavaScript dan deteksi error sintaks.</w:t>
+        <w:t>package.json - Package manager Node.js untuk mengelola dependensi React frontend.</w:t>
       </w:r>
     </w:p>
     <w:p>
@@ -1130,47 +1073,7 @@
         <w:ind w:left="360"/>
       </w:pPr>
       <w:r>
-        <w:t>.gitignore: Berkas instruksi agar Git mengabaikan folder dependensi vendor/ atau node_modules/ saat push ke GitHub.</w:t>
-      </w:r>
-    </w:p>
-    <w:p>
-      <w:pPr>
-        <w:pStyle w:val="ListBullet"/>
-        <w:spacing w:after="80" w:line="276" w:lineRule="auto"/>
-        <w:ind w:left="360"/>
-      </w:pPr>
-      <w:r>
-        <w:t>composer.json &amp; composer.lock: Package manager PHP untuk mendefinisikan library dependensi backend (Laravel, Sanctum, Inertia).</w:t>
-      </w:r>
-    </w:p>
-    <w:p>
-      <w:pPr>
-        <w:pStyle w:val="ListBullet"/>
-        <w:spacing w:after="80" w:line="276" w:lineRule="auto"/>
-        <w:ind w:left="360"/>
-      </w:pPr>
-      <w:r>
-        <w:t>package.json &amp; package-lock.json: Package manager Node.js untuk mendefinisikan library frontend (React, Axios, ChartJS).</w:t>
-      </w:r>
-    </w:p>
-    <w:p>
-      <w:pPr>
-        <w:pStyle w:val="ListBullet"/>
-        <w:spacing w:after="80" w:line="276" w:lineRule="auto"/>
-        <w:ind w:left="360"/>
-      </w:pPr>
-      <w:r>
-        <w:t>tailwind.config.js: Mengatur tema warna kustom, responsivitas, dan kelas CSS Tailwind.</w:t>
-      </w:r>
-    </w:p>
-    <w:p>
-      <w:pPr>
-        <w:pStyle w:val="ListBullet"/>
-        <w:spacing w:after="80" w:line="276" w:lineRule="auto"/>
-        <w:ind w:left="360"/>
-      </w:pPr>
-      <w:r>
-        <w:t>vite.config.js: Konfigurasi bundler Vite untuk kompilasi real-time aset React JSX dan Tailwind CSS.</w:t>
+        <w:t>vite.config.js - Bundler Vite untuk kompilasi real-time React JSX dan CSS Tailwind.</w:t>
       </w:r>
     </w:p>
     <w:p>
@@ -1190,25 +1093,12 @@
     </w:p>
     <w:p>
       <w:pPr>
-        <w:pStyle w:val="Heading2"/>
-        <w:keepNext/>
-        <w:spacing w:before="240" w:after="120"/>
+        <w:pStyle w:val="ListBullet"/>
+        <w:spacing w:after="80" w:line="276" w:lineRule="auto"/>
+        <w:ind w:left="360"/>
       </w:pPr>
       <w:r>
-        <w:rPr>
-          <w:b/>
-          <w:color w:val="1A5685"/>
-          <w:sz w:val="24"/>
-        </w:rPr>
-        <w:t>Web Sessions (Autentikasi Stateful)</w:t>
-      </w:r>
-    </w:p>
-    <w:p>
-      <w:pPr>
-        <w:spacing w:after="120" w:line="276" w:lineRule="auto"/>
-      </w:pPr>
-      <w:r>
-        <w:t>Session adalah mekanisme penyimpanan status login di sisi server:</w:t>
+        <w:t>Web Sessions (Stateful): Browser menyimpan Session ID di Cookie (laravel_session) yang dilampirkan otomatis pada setiap request HTTP. Server melacak status login di memori.</w:t>
       </w:r>
     </w:p>
     <w:p>
@@ -1218,7 +1108,7 @@
         <w:ind w:left="360"/>
       </w:pPr>
       <w:r>
-        <w:t>Pengguna memasukkan email/password -&gt; Laravel mencocokkannya -&gt; jika cocok, Laravel membuat file session unik di server dan mengirimkan Session ID (Cookie bernama laravel_session) ke browser.</w:t>
+        <w:t>API Tokens (Stateless): Android menyimpan token secara mandiri dan mengirimkannya di header Authorization. Server hanya memeriksa apakah token valid tanpa menyimpan status session.</w:t>
       </w:r>
     </w:p>
     <w:p>
@@ -1228,113 +1118,7 @@
         <w:ind w:left="360"/>
       </w:pPr>
       <w:r>
-        <w:t>Web browser melampirkan cookie Session ID tersebut secara otomatis dalam setiap request HTTP selanjutnya.</w:t>
-      </w:r>
-    </w:p>
-    <w:p>
-      <w:pPr>
-        <w:pStyle w:val="Heading2"/>
-        <w:keepNext/>
-        <w:spacing w:before="240" w:after="120"/>
-      </w:pPr>
-      <w:r>
-        <w:rPr>
-          <w:b/>
-          <w:color w:val="1A5685"/>
-          <w:sz w:val="24"/>
-        </w:rPr>
-        <w:t>API Tokens (Autentikasi Stateless)</w:t>
-      </w:r>
-    </w:p>
-    <w:p>
-      <w:pPr>
-        <w:spacing w:after="120" w:line="276" w:lineRule="auto"/>
-      </w:pPr>
-      <w:r>
-        <w:t>Token adalah string acak unik yang digunakan untuk mengautentikasi REST API mobile:</w:t>
-      </w:r>
-    </w:p>
-    <w:p>
-      <w:pPr>
-        <w:pStyle w:val="ListBullet"/>
-        <w:spacing w:after="80" w:line="276" w:lineRule="auto"/>
-        <w:ind w:left="360"/>
-      </w:pPr>
-      <w:r>
-        <w:t>Aplikasi Android mengirim login request -&gt; Laravel Sanctum membuat baris token baru di tabel database personal_access_tokens dan mengirimkan token string tersebut ke Android.</w:t>
-      </w:r>
-    </w:p>
-    <w:p>
-      <w:pPr>
-        <w:pStyle w:val="ListBullet"/>
-        <w:spacing w:after="80" w:line="276" w:lineRule="auto"/>
-        <w:ind w:left="360"/>
-      </w:pPr>
-      <w:r>
-        <w:t>Android menyimpan token secara lokal dan melampirkannya secara manual di header HTTP: Authorization: Bearer {token} pada setiap request.</w:t>
-      </w:r>
-    </w:p>
-    <w:p>
-      <w:pPr>
-        <w:pStyle w:val="ListBullet"/>
-        <w:spacing w:after="80" w:line="276" w:lineRule="auto"/>
-        <w:ind w:left="360"/>
-      </w:pPr>
-      <w:r>
-        <w:t>Mengapa Android memakai Token?: Karena aplikasi mobile tidak memiliki mekanisme otomatisasi cookie session layaknya web browser.</w:t>
-      </w:r>
-    </w:p>
-    <w:p>
-      <w:pPr>
-        <w:pStyle w:val="Heading2"/>
-        <w:keepNext/>
-        <w:spacing w:before="240" w:after="120"/>
-      </w:pPr>
-      <w:r>
-        <w:rPr>
-          <w:b/>
-          <w:color w:val="1A5685"/>
-          <w:sz w:val="24"/>
-        </w:rPr>
-        <w:t>Database Migrations (Version Control untuk Database)</w:t>
-      </w:r>
-    </w:p>
-    <w:p>
-      <w:pPr>
-        <w:spacing w:after="120" w:line="276" w:lineRule="auto"/>
-      </w:pPr>
-      <w:r>
-        <w:t>Migrasi adalah version control untuk skema database. Struktur tabel didefinisikan menggunakan kode PHP sehingga tidak perlu ekspor-impor file SQL manual.</w:t>
-      </w:r>
-    </w:p>
-    <w:p>
-      <w:pPr>
-        <w:pStyle w:val="ListBullet"/>
-        <w:spacing w:after="80" w:line="276" w:lineRule="auto"/>
-        <w:ind w:left="360"/>
-      </w:pPr>
-      <w:r>
-        <w:t>php artisan migrate: Menjalankan semua berkas migrasi baru ke database.</w:t>
-      </w:r>
-    </w:p>
-    <w:p>
-      <w:pPr>
-        <w:pStyle w:val="ListBullet"/>
-        <w:spacing w:after="80" w:line="276" w:lineRule="auto"/>
-        <w:ind w:left="360"/>
-      </w:pPr>
-      <w:r>
-        <w:t>php artisan migrate:rollback: Membatalkan atau memundurkan migrasi yang terakhir dijalankan.</w:t>
-      </w:r>
-    </w:p>
-    <w:p>
-      <w:pPr>
-        <w:pStyle w:val="ListBullet"/>
-        <w:spacing w:after="80" w:line="276" w:lineRule="auto"/>
-        <w:ind w:left="360"/>
-      </w:pPr>
-      <w:r>
-        <w:t>php artisan migrate:fresh: Menghapus seluruh tabel di database lalu menjalankan ulang seluruh berkas migrasi dari awal.</w:t>
+        <w:t>Database Migrations: Version control untuk skema database. php artisan migrate digunakan untuk memperbarui tabel database secara otomatis tanpa impor file SQL manual.</w:t>
       </w:r>
     </w:p>
     <w:sectPr>

</xml_diff>

<commit_message>
Docs: Update Word and text guides to mega detailed 14-page equivalence mapped to MedTrack files
</commit_message>
<xml_diff>
--- a/Poin Poin dan Pemahaman Untuk Presentasi (Hasil Edit).docx
+++ b/Poin Poin dan Pemahaman Untuk Presentasi (Hasil Edit).docx
@@ -13,7 +13,7 @@
           <w:color w:val="0A3A60"/>
           <w:sz w:val="40"/>
         </w:rPr>
-        <w:t>🏥 DOKUMENTASI &amp; BEDAH KODE STRUKTUR MEDTRACK</w:t>
+        <w:t>🏥 DOKUMENTASI PENDALAMAN TEKNIS DAN ANALISIS KODE KUNCI PROJEK MEDTRACK</w:t>
       </w:r>
     </w:p>
     <w:p>
@@ -27,7 +27,7 @@
           <w:color w:val="64748B"/>
           <w:sz w:val="22"/>
         </w:rPr>
-        <w:t>Analisis Lengkap Setiap Folder dan Berkas Kode Program MedTrack (Laravel-React) untuk Keperluan Presentasi &amp; Sidang Projek Akhir</w:t>
+        <w:t>Analisis Rinci Setiap Struktur Direktori, Komponen Frontend React, Alur Integrasi Hybrid Monolith, Otorisasi Keamanan Berbasis Peran, dan Kumpulan Simulasi Tanya Jawab Dosen Penguji</w:t>
       </w:r>
     </w:p>
     <w:p>
@@ -50,7 +50,7 @@
         <w:spacing w:after="120" w:line="276" w:lineRule="auto"/>
       </w:pPr>
       <w:r>
-        <w:t>Bagian ini memaparkan struktur folder secara keseluruhan, menjelaskan di mana letak berkas backend Laravel dan antarmuka frontend React.js:</w:t>
+        <w:t>Arsitektur Hybrid Monolith memadukan keunggulan Laravel sebagai backend tangguh dan React.js sebagai frontend reaktif di dalam satu repositori terpadu. Jembatan komunikasi data dikelola sepenuhnya oleh Inertia.js, yang meniadakan kebutuhan REST API internal untuk klien web. Berikut adalah pembagian tugas setiap folder:</w:t>
       </w:r>
     </w:p>
     <w:p>
@@ -75,7 +75,7 @@
         <w:ind w:left="360"/>
       </w:pPr>
       <w:r>
-        <w:t>app/Http/Controllers/Web/ - Berisi berkas-berkas pengolah logika web yang diakses pengguna melalui browser.</w:t>
+        <w:t>app/Http/Controllers/Web/ - Folder ini menyimpan seluruh logika bisnis web. Controller bertugas memproses data masukan, berinteraksi dengan database melalui Model Eloquent, dan meneruskan data tersebut ke frontend React via properti Inertia rendering.</w:t>
       </w:r>
     </w:p>
     <w:p>
@@ -85,7 +85,7 @@
         <w:ind w:left="360"/>
       </w:pPr>
       <w:r>
-        <w:t>app/Http/Controllers/Api/ - Menyimpan endpoint khusus pengiriman data JSON untuk aplikasi mobile tracker Android.</w:t>
+        <w:t>app/Http/Controllers/Api/ - Menyimpan pengolah logika API khusus (seperti ApiAuthController dan ApiAsetController) yang melayani pengiriman data JSON untuk aplikasi GPS tracker mobile Android.</w:t>
       </w:r>
     </w:p>
     <w:p>
@@ -95,7 +95,7 @@
         <w:ind w:left="360"/>
       </w:pPr>
       <w:r>
-        <w:t>app/Models/ - Folder representasi tabel database. Menggunakan ORM Eloquent sehingga kueri database direpresentasikan sebagai objek PHP.</w:t>
+        <w:t>app/Models/ - Folder yang berisi representasi objek ORM untuk tabel-tabel di database MySQL. Model di sini mengelola deklarasi relasi antar-tabel secara dinamis (seperti relasi hasMany atau belongsTo).</w:t>
       </w:r>
     </w:p>
     <w:p>
@@ -105,7 +105,7 @@
         <w:ind w:left="360"/>
       </w:pPr>
       <w:r>
-        <w:t>app/Http/Middleware/HandleInertiaRequests.php - Mengatur peminjaman properti global (shared props) agar dapat diakses dari komponen React manapun.</w:t>
+        <w:t>app/Http/Middleware/HandleInertiaRequests.php - Berkas konfigurasi shared props global yang secara konstan membagikan data dinamis (seperti status autentikasi user dan notifikasi lonceng) ke seluruh halaman React.</w:t>
       </w:r>
     </w:p>
     <w:p>
@@ -115,7 +115,7 @@
         <w:ind w:left="360"/>
       </w:pPr>
       <w:r>
-        <w:t>database/migrations/ - File instruksi pembuatan skema tabel-tabel di database MySQL.</w:t>
+        <w:t>database/migrations/ - Berkas deklarasi pembuatan skema tabel database MySQL, memungkinkan replikasi database secara otomatis.</w:t>
       </w:r>
     </w:p>
     <w:p>
@@ -125,7 +125,17 @@
         <w:ind w:left="360"/>
       </w:pPr>
       <w:r>
-        <w:t>routes/web.php &amp; routes/api.php - Pendefinisian rute URL web client (stateful session) dan rute REST API Android (stateless token).</w:t>
+        <w:t>routes/web.php - Tempat mendefinisikan rute URL aplikasi web yang diproteksi oleh sistem autentikasi berbasis session.</w:t>
+      </w:r>
+    </w:p>
+    <w:p>
+      <w:pPr>
+        <w:pStyle w:val="ListBullet"/>
+        <w:spacing w:after="80" w:line="276" w:lineRule="auto"/>
+        <w:ind w:left="360"/>
+      </w:pPr>
+      <w:r>
+        <w:t>routes/api.php - Tempat mendefinisikan rute REST API Android pelacak GPS yang diproteksi oleh Laravel Sanctum Token.</w:t>
       </w:r>
     </w:p>
     <w:p>
@@ -140,7 +150,7 @@
           <w:color w:val="1A5685"/>
           <w:sz w:val="24"/>
         </w:rPr>
-        <w:t>Sisi Frontend (React.js)</w:t>
+        <w:t>Sisi Frontend (React.js + Tailwind CSS)</w:t>
       </w:r>
     </w:p>
     <w:p>
@@ -150,7 +160,7 @@
         <w:ind w:left="360"/>
       </w:pPr>
       <w:r>
-        <w:t>resources/js/Pages/ - Berisi berkas antarmuka utama pengguna (Views). Setiap berkas disini adalah halaman komponen React.</w:t>
+        <w:t>resources/js/Pages/ - Menyimpan file komponen halaman utama (Views). Setiap berkas React JSX di folder ini mewakili satu halaman web utuh.</w:t>
       </w:r>
     </w:p>
     <w:p>
@@ -160,7 +170,7 @@
         <w:ind w:left="360"/>
       </w:pPr>
       <w:r>
-        <w:t>resources/js/Layouts/AuthenticatedLayout.jsx - Kerangka tata letak halaman dashboard (sidebar, header notifikasi, scanner QR code).</w:t>
+        <w:t>resources/js/Layouts/AuthenticatedLayout.jsx - Kerangka tata letak antarmuka utama (Sidebar, Header, lonceng notifikasi, modal scan QR Code, kalender pemeliharaan) yang menyelimuti seluruh halaman setelah login.</w:t>
       </w:r>
     </w:p>
     <w:p>
@@ -170,7 +180,7 @@
         <w:ind w:left="360"/>
       </w:pPr>
       <w:r>
-        <w:t>resources/js/Components/ - Menyimpan komponen UI kecil reusable (seperti Modal, Dropdown, Button).</w:t>
+        <w:t>resources/js/Components/ - Menyimpan komponen-komponen UI kecil yang dapat dipanggil secara berulang (reusable components), seperti Dropdown.jsx, Modal.jsx, TextInput.jsx.</w:t>
       </w:r>
     </w:p>
     <w:p>
@@ -193,7 +203,7 @@
         <w:spacing w:after="120" w:line="276" w:lineRule="auto"/>
       </w:pPr>
       <w:r>
-        <w:t>Di bawah ini adalah rincian detail fungsi dan metode kunci untuk setiap file kode program di dalam proyek MedTrack:</w:t>
+        <w:t>Penjelasan terperinci mengenai peran utama dan fungsi kunci dari setiap file model, controller, dan antarmuka React di dalam sistem MedTrack:</w:t>
       </w:r>
     </w:p>
     <w:p>
@@ -222,7 +232,7 @@
         <w:t xml:space="preserve">User.php: </w:t>
       </w:r>
       <w:r>
-        <w:t xml:space="preserve"> - Memetakan tabel m_user. Menyimpan informasi profil staff, peran (role), password, dan relasi ke unit/ruangan kerja.</w:t>
+        <w:t xml:space="preserve"> - Memetakan tabel m_user. Menyimpan informasi profil staff, peran (role), password (terenkripsi bcrypt), status keaktifan, dan relasi unit kerja.</w:t>
       </w:r>
     </w:p>
     <w:p>
@@ -232,7 +242,7 @@
         <w:ind w:left="360"/>
       </w:pPr>
       <w:r>
-        <w:t>Relasi ruangan(): belongsTo(Ruangan::class, 'id_ruang') untuk mendapatkan unit kerja user.</w:t>
+        <w:t>ruangan(): Mendefinisikan relasi belongsTo(Ruangan::class, 'id_ruang') untuk mendapatkan unit kerja user.</w:t>
       </w:r>
     </w:p>
     <w:p>
@@ -246,7 +256,7 @@
         <w:t xml:space="preserve">Aset.php: </w:t>
       </w:r>
       <w:r>
-        <w:t xml:space="preserve"> - Memetakan tabel t_aset. Menyimpan data inventaris alat medis, serial number, status operasional, koordinat lokasi GPS tracking, tanggal kalibrasi, dan file QR Code.</w:t>
+        <w:t xml:space="preserve"> - Memetakan tabel t_aset. Menyimpan detail inventaris alat medis (kode label, serial number, merk, tipe, status kelaikan, koordinat lokasi GPS tracking, tanggal kalibrasi terakhir, tanggal kalibrasi berikutnya, dan nama file QR Code).</w:t>
       </w:r>
     </w:p>
     <w:p>
@@ -256,7 +266,7 @@
         <w:ind w:left="360"/>
       </w:pPr>
       <w:r>
-        <w:t>Relasi ruangan(): belongsTo(Ruangan::class, 'id_ruang_saat_ini') untuk melacak lokasi ruang terkini alat.</w:t>
+        <w:t>ruangan(): Mendefinisikan relasi belongsTo(Ruangan::class, 'id_ruang_saat_ini') untuk melacak lokasi ruang terkini alat.</w:t>
       </w:r>
     </w:p>
     <w:p>
@@ -266,7 +276,7 @@
         <w:ind w:left="360"/>
       </w:pPr>
       <w:r>
-        <w:t>Relasi troubleshoot(): hasMany(Troubleshoot::class, 'id_aset') untuk mendapatkan riwayat kerusakan alat.</w:t>
+        <w:t>troubleshoot(): Mendefinisikan relasi hasMany(Troubleshoot::class, 'id_aset') untuk mendapatkan riwayat kerusakan alat.</w:t>
       </w:r>
     </w:p>
     <w:p>
@@ -280,7 +290,7 @@
         <w:t xml:space="preserve">Ruangan.php: </w:t>
       </w:r>
       <w:r>
-        <w:t xml:space="preserve"> - Memetakan tabel m_ruangan. Menyimpan data ruangan di rumah sakit.</w:t>
+        <w:t xml:space="preserve"> - Memetakan tabel m_ruangan. Menyimpan data ruangan di rumah sakit (ICU, IGD, OK, ICCU, dll.).</w:t>
       </w:r>
     </w:p>
     <w:p>
@@ -290,7 +300,7 @@
         <w:ind w:left="360"/>
       </w:pPr>
       <w:r>
-        <w:t>Relasi asets(): hasMany(Aset::class, 'id_ruang_saat_ini') untuk mendapatkan semua inventaris di ruangan tersebut.</w:t>
+        <w:t>asets(): Mendefinisikan relasi hasMany(Aset::class, 'id_ruang_saat_ini') untuk mendapatkan semua inventaris di ruangan tersebut.</w:t>
       </w:r>
     </w:p>
     <w:p>
@@ -304,7 +314,7 @@
         <w:t xml:space="preserve">Mutasi.php: </w:t>
       </w:r>
       <w:r>
-        <w:t xml:space="preserve"> - Memetakan tabel t_mutasi. Menyimpan riwayat pengajuan pemindahan alat.</w:t>
+        <w:t xml:space="preserve"> - Memetakan tabel t_mutasi. Menyimpan riwayat pengajuan pemindahan alat medis antar-ruangan.</w:t>
       </w:r>
     </w:p>
     <w:p>
@@ -314,7 +324,7 @@
         <w:ind w:left="360"/>
       </w:pPr>
       <w:r>
-        <w:t>Relasi aset(): belongsTo(Aset::class, 'id_aset')</w:t>
+        <w:t>aset(): belongsTo(Aset::class, 'id_aset')</w:t>
       </w:r>
     </w:p>
     <w:p>
@@ -324,7 +334,7 @@
         <w:ind w:left="360"/>
       </w:pPr>
       <w:r>
-        <w:t>Relasi ruanganAsal(): belongsTo(Ruangan::class, 'id_ruang_asal')</w:t>
+        <w:t>ruanganAsal(): belongsTo(Ruangan::class, 'id_ruang_asal')</w:t>
       </w:r>
     </w:p>
     <w:p>
@@ -334,7 +344,7 @@
         <w:ind w:left="360"/>
       </w:pPr>
       <w:r>
-        <w:t>Relasi ruanganTujuan(): belongsTo(Ruangan::class, 'id_ruang_tujuan')</w:t>
+        <w:t>ruanganTujuan(): belongsTo(Ruangan::class, 'id_ruang_tujuan')</w:t>
       </w:r>
     </w:p>
     <w:p>
@@ -348,7 +358,7 @@
         <w:t xml:space="preserve">Troubleshoot.php: </w:t>
       </w:r>
       <w:r>
-        <w:t xml:space="preserve"> - Memetakan tabel t_troubleshoot. Menyimpan tiket laporan kerusakan alat medis.</w:t>
+        <w:t xml:space="preserve"> - Memetakan tabel t_troubleshoot. Menyimpan tiket laporan kerusakan alat medis (Work Order).</w:t>
       </w:r>
     </w:p>
     <w:p>
@@ -358,7 +368,7 @@
         <w:ind w:left="360"/>
       </w:pPr>
       <w:r>
-        <w:t>Relasi pelapor(): belongsTo(User.class, 'id_user_pelapor')</w:t>
+        <w:t>pelapor(): belongsTo(User.class, 'id_user_pelapor')</w:t>
       </w:r>
     </w:p>
     <w:p>
@@ -368,7 +378,7 @@
         <w:ind w:left="360"/>
       </w:pPr>
       <w:r>
-        <w:t>Relasi teknisi(): belongsTo(User.class, 'id_teknisi_penanggungjawab')</w:t>
+        <w:t>teknisi(): belongsTo(User.class, 'id_teknisi_penanggungjawab')</w:t>
       </w:r>
     </w:p>
     <w:p>
@@ -378,7 +388,7 @@
         <w:ind w:left="360"/>
       </w:pPr>
       <w:r>
-        <w:t>Relasi aset(): belongsTo(Aset::class, 'id_aset')</w:t>
+        <w:t>aset(): belongsTo(Aset::class, 'id_aset')</w:t>
       </w:r>
     </w:p>
     <w:p>
@@ -388,7 +398,7 @@
         <w:ind w:left="360"/>
       </w:pPr>
       <w:r>
-        <w:t>Relasi ticketLogs(): hasMany(TroubleshootLog::class, 'id_ticket')</w:t>
+        <w:t>ticketLogs(): hasMany(TroubleshootLog::class, 'id_ticket')</w:t>
       </w:r>
     </w:p>
     <w:p>
@@ -417,7 +427,7 @@
         <w:t xml:space="preserve">DashboardController.php: </w:t>
       </w:r>
       <w:r>
-        <w:t xml:space="preserve"> - Menyajikan dasbor overview. Menghitung ringkasan statistik (jumlah aset, total kerusakan, mutasi pending) dan memuat agenda kalibrasi harian.</w:t>
+        <w:t xml:space="preserve"> - Menyajikan dasbor utama. Menghitung ringkasan statistik (jumlah aset, total kerusakan, mutasi pending) dan memuat agenda kalibrasi harian.</w:t>
       </w:r>
     </w:p>
     <w:p>
@@ -651,7 +661,7 @@
         <w:ind w:left="360"/>
       </w:pPr>
       <w:r>
-        <w:t>Dashboard.jsx - Merender visual statistik dasbor, chart grafik tingkat kerusakan, dan penampakan daftar notifikasi terkini.</w:t>
+        <w:t>Dashboard.jsx - Dashboard visual ringkasan data statistik card counter, list notifikasi lonceng terbaru, chart grafik tingkat kerusakan alat, dan widget kalender harian agenda pemeliharaan.</w:t>
       </w:r>
     </w:p>
     <w:p>
@@ -661,7 +671,7 @@
         <w:ind w:left="360"/>
       </w:pPr>
       <w:r>
-        <w:t>Aset/Index.jsx - Katalog data aset medis lengkap dengan kartu informasi, tombol tambah/edit/hapus (sesuai otorisasi), dan integrasi scan QR Code.</w:t>
+        <w:t>Aset/Index.jsx - Katalog data inventaris aset medis lengkap dengan kartu informasi, filter pencarian, list kartu, tombol tambah/edit/hapus (sesuai otorisasi), dan integrasi scan QR Code.</w:t>
       </w:r>
     </w:p>
     <w:p>
@@ -671,7 +681,17 @@
         <w:ind w:left="360"/>
       </w:pPr>
       <w:r>
-        <w:t>Aset/Show.jsx - Detail spesifikasi aset medis dan visualisasi peta pelacakan posisi GPS real-time.</w:t>
+        <w:t>Aset/Create.jsx &amp; Aset/Edit.jsx - Form pembuatan dan pengubahan data aset medis, lengkap dengan penanganan upload file gambar foto alat medis.</w:t>
+      </w:r>
+    </w:p>
+    <w:p>
+      <w:pPr>
+        <w:pStyle w:val="ListBullet"/>
+        <w:spacing w:after="80" w:line="276" w:lineRule="auto"/>
+        <w:ind w:left="360"/>
+      </w:pPr>
+      <w:r>
+        <w:t>Aset/Detail.jsx - Menampilkan detail spesifikasi teknis aset medis secara lengkap serta visualisasi peta pelacakan posisi GPS real-time.</w:t>
       </w:r>
     </w:p>
     <w:p>
@@ -691,7 +711,47 @@
         <w:ind w:left="360"/>
       </w:pPr>
       <w:r>
+        <w:t>WorkOrder/Create.jsx - Form pelaporan kerusakan alat medis oleh Unit_RS, lengkap dengan upload foto bukti kerusakan.</w:t>
+      </w:r>
+    </w:p>
+    <w:p>
+      <w:pPr>
+        <w:pStyle w:val="ListBullet"/>
+        <w:spacing w:after="80" w:line="276" w:lineRule="auto"/>
+        <w:ind w:left="360"/>
+      </w:pPr>
+      <w:r>
         <w:t>Mutasi/Index.jsx - Daftar riwayat mutasi alat dilengkapi pill badge status verifikasi (Pending, Approved, Rejected).</w:t>
+      </w:r>
+    </w:p>
+    <w:p>
+      <w:pPr>
+        <w:pStyle w:val="ListBullet"/>
+        <w:spacing w:after="80" w:line="276" w:lineRule="auto"/>
+        <w:ind w:left="360"/>
+      </w:pPr>
+      <w:r>
+        <w:t>Mutasi/Create.jsx - Form pengajuan mutasi/pemindahan aset medis keluar ruangan oleh Unit_RS.</w:t>
+      </w:r>
+    </w:p>
+    <w:p>
+      <w:pPr>
+        <w:pStyle w:val="ListBullet"/>
+        <w:spacing w:after="80" w:line="276" w:lineRule="auto"/>
+        <w:ind w:left="360"/>
+      </w:pPr>
+      <w:r>
+        <w:t>Maintenance/Index.jsx - Kalender pemeliharaan berkala untuk menjadwalkan agenda pemeliharaan preventif.</w:t>
+      </w:r>
+    </w:p>
+    <w:p>
+      <w:pPr>
+        <w:pStyle w:val="ListBullet"/>
+        <w:spacing w:after="80" w:line="276" w:lineRule="auto"/>
+        <w:ind w:left="360"/>
+      </w:pPr>
+      <w:r>
+        <w:t>Dokumen/Index.jsx - Manajemen berkas dokumen mutu laporan bulanan IPSRS.</w:t>
       </w:r>
     </w:p>
     <w:p>
@@ -711,7 +771,17 @@
         <w:ind w:left="360"/>
       </w:pPr>
       <w:r>
-        <w:t>Layouts/AuthenticatedLayout.jsx - Layout utama pembungkus halaman. Di sini diletakkan menu navigasi sidebar, bell notifikasi dengan filter role, dan modal kamera scanner QR Code.</w:t>
+        <w:t>Tracking/Map.jsx - Visualisasi peta real-time posisi koordinat GPS seluruh aset rumah sakit secara global.</w:t>
+      </w:r>
+    </w:p>
+    <w:p>
+      <w:pPr>
+        <w:pStyle w:val="ListBullet"/>
+        <w:spacing w:after="80" w:line="276" w:lineRule="auto"/>
+        <w:ind w:left="360"/>
+      </w:pPr>
+      <w:r>
+        <w:t>Layouts/AuthenticatedLayout.jsx - Layout utama pembungkus halaman. Di sini diletakkan menu navigasi sidebar, bell notifikasi dengan filter role, dan modal kamera scanner QR.</w:t>
       </w:r>
     </w:p>
     <w:p>
@@ -731,20 +801,35 @@
     </w:p>
     <w:p>
       <w:pPr>
-        <w:spacing w:after="120" w:line="276" w:lineRule="auto"/>
+        <w:pStyle w:val="Heading2"/>
+        <w:keepNext/>
+        <w:spacing w:before="240" w:after="120"/>
       </w:pPr>
       <w:r>
-        <w:t>Siklus Web Client (Inertia.js):</w:t>
+        <w:rPr>
+          <w:b/>
+          <w:color w:val="1A5685"/>
+          <w:sz w:val="24"/>
+        </w:rPr>
+        <w:t>Siklus Request Web (Menggunakan Protokol Inertia.js)</w:t>
       </w:r>
     </w:p>
     <w:p>
       <w:pPr>
+        <w:spacing w:after="120" w:line="276" w:lineRule="auto"/>
+      </w:pPr>
+      <w:r>
+        <w:t>Inertia bertindak sebagai jembatan. Alur kerja ketika pengguna mengakses halaman Aset Medis adalah sebagai berikut:</w:t>
+      </w:r>
+    </w:p>
+    <w:p>
+      <w:pPr>
         <w:pStyle w:val="ListBullet"/>
         <w:spacing w:after="80" w:line="276" w:lineRule="auto"/>
         <w:ind w:left="360"/>
       </w:pPr>
       <w:r>
-        <w:t>Pengguna mengklik tombol menu 'Aset Medis' di sidebar.</w:t>
+        <w:t>Pengguna mengklik menu 'Aset Medis' di Sidebar.</w:t>
       </w:r>
     </w:p>
     <w:p>
@@ -754,7 +839,7 @@
         <w:ind w:left="360"/>
       </w:pPr>
       <w:r>
-        <w:t>Inertia mengirimkan request AJAX XHR di latar belakang ke URL /aset.</w:t>
+        <w:t>Browser mengirimkan request internal (Inertia request XHR/AJAX) ke rute /aset.</w:t>
       </w:r>
     </w:p>
     <w:p>
@@ -764,17 +849,17 @@
         <w:ind w:left="360"/>
       </w:pPr>
       <w:r>
-        <w:t>Laravel memproses di AsetController@index, meng-query database via model Aset::with('ruangan')-&gt;get(), dan mengembalikan render:</w:t>
+        <w:t>Laravel mencocokkan rute di web.php dan memanggil AsetController@index.</w:t>
       </w:r>
     </w:p>
     <w:p>
       <w:pPr>
         <w:pStyle w:val="ListBullet"/>
         <w:spacing w:after="80" w:line="276" w:lineRule="auto"/>
-        <w:ind w:left="720"/>
+        <w:ind w:left="360"/>
       </w:pPr>
       <w:r>
-        <w:t>return Inertia::render('Aset/Index', ['asets' =&gt; $asets]);</w:t>
+        <w:t>AsetController melakukan query database melalui Eloquent: Aset::with('ruangan')-&gt;get().</w:t>
       </w:r>
     </w:p>
     <w:p>
@@ -784,15 +869,17 @@
         <w:ind w:left="360"/>
       </w:pPr>
       <w:r>
-        <w:t>Inertia menangkap data payload JSON dan mengganti konten halaman React Aset/Index.jsx secara instan tanpa memicu reload browser penuh.</w:t>
+        <w:t>Controller mengembalikan respon: return Inertia::render('Aset/Index', ['asets' =&gt; $asets]);</w:t>
       </w:r>
     </w:p>
     <w:p>
       <w:pPr>
-        <w:spacing w:after="120" w:line="276" w:lineRule="auto"/>
+        <w:pStyle w:val="ListBullet"/>
+        <w:spacing w:after="80" w:line="276" w:lineRule="auto"/>
+        <w:ind w:left="360"/>
       </w:pPr>
       <w:r>
-        <w:t>Siklus REST API Android (Laravel Sanctum):</w:t>
+        <w:t>Inertia menangkap kembalian tersebut, lalu mengirimkan payload berupa data JSON (bukan HTML mentah) ke frontend.</w:t>
       </w:r>
     </w:p>
     <w:p>
@@ -802,17 +889,40 @@
         <w:ind w:left="360"/>
       </w:pPr>
       <w:r>
-        <w:t>Aplikasi Android mengirim request POST ke /api/login untuk mendapatkan Bearer Token.</w:t>
+        <w:t>Komponen React di resources/js/Pages/Aset/Index.jsx menerima data tersebut melalui props (asets) lalu merendernya secara dinamis di browser tanpa refresh halaman penuh.</w:t>
       </w:r>
     </w:p>
     <w:p>
       <w:pPr>
+        <w:pStyle w:val="Heading2"/>
+        <w:keepNext/>
+        <w:spacing w:before="240" w:after="120"/>
+      </w:pPr>
+      <w:r>
+        <w:rPr>
+          <w:b/>
+          <w:color w:val="1A5685"/>
+          <w:sz w:val="24"/>
+        </w:rPr>
+        <w:t>Siklus Request API Mobile (Laravel Sanctum)</w:t>
+      </w:r>
+    </w:p>
+    <w:p>
+      <w:pPr>
+        <w:spacing w:after="120" w:line="276" w:lineRule="auto"/>
+      </w:pPr>
+      <w:r>
+        <w:t>Alur kerja ketika aplikasi Android pelacak lokasi mengirim data ke server:</w:t>
+      </w:r>
+    </w:p>
+    <w:p>
+      <w:pPr>
         <w:pStyle w:val="ListBullet"/>
         <w:spacing w:after="80" w:line="276" w:lineRule="auto"/>
         <w:ind w:left="360"/>
       </w:pPr>
       <w:r>
-        <w:t>Android menyimpan token secara lokal dan melampirkannya di header 'Authorization: Bearer &lt;token&gt;' pada request POST /api/tracking.</w:t>
+        <w:t>Aplikasi Android mengirim HTTP POST request ke http://alamat-server/api/tracking.</w:t>
       </w:r>
     </w:p>
     <w:p>
@@ -822,7 +932,37 @@
         <w:ind w:left="360"/>
       </w:pPr>
       <w:r>
-        <w:t>Laravel menyaring request melalui middleware auth:sanctum untuk mencocokkan ke database. Jika valid, koordinat GPS diperbarui.</w:t>
+        <w:t>Android menyertakan header Authorization: Bearer {token} yang diperoleh saat login.</w:t>
+      </w:r>
+    </w:p>
+    <w:p>
+      <w:pPr>
+        <w:pStyle w:val="ListBullet"/>
+        <w:spacing w:after="80" w:line="276" w:lineRule="auto"/>
+        <w:ind w:left="360"/>
+      </w:pPr>
+      <w:r>
+        <w:t>Laravel mencocokkan rute di routes/api.php dan memprosesnya melalui middleware auth:sanctum.</w:t>
+      </w:r>
+    </w:p>
+    <w:p>
+      <w:pPr>
+        <w:pStyle w:val="ListBullet"/>
+        <w:spacing w:after="80" w:line="276" w:lineRule="auto"/>
+        <w:ind w:left="360"/>
+      </w:pPr>
+      <w:r>
+        <w:t>Middleware memverifikasi keaslian token pada tabel personal_access_tokens di database.</w:t>
+      </w:r>
+    </w:p>
+    <w:p>
+      <w:pPr>
+        <w:pStyle w:val="ListBullet"/>
+        <w:spacing w:after="80" w:line="276" w:lineRule="auto"/>
+        <w:ind w:left="360"/>
+      </w:pPr>
+      <w:r>
+        <w:t>Jika valid, request diteruskan ke Api\AsetController@updateTracking yang menyimpan koordinat GPS terbaru ke database.</w:t>
       </w:r>
     </w:p>
     <w:p>
@@ -837,7 +977,7 @@
           <w:color w:val="0A3A60"/>
           <w:sz w:val="28"/>
         </w:rPr>
-        <w:t>BAB IV: BEDAH LOGIKA DAN KODE CRITICAL</w:t>
+        <w:t>BAB IV: BEDAH LOGIKA DAN KODE CRITICAL (PERTANYAAN KHUSUS DOSEN)</w:t>
       </w:r>
     </w:p>
     <w:p>
@@ -852,7 +992,7 @@
           <w:color w:val="1A5685"/>
           <w:sz w:val="24"/>
         </w:rPr>
-        <w:t>Notifikasi Lonceng Dinamis di Layout Header</w:t>
+        <w:t>Logika Mutasi Aset &amp; Keamanan Database Transactions</w:t>
       </w:r>
     </w:p>
     <w:p>
@@ -860,17 +1000,25 @@
         <w:spacing w:after="120" w:line="276" w:lineRule="auto"/>
       </w:pPr>
       <w:r>
-        <w:t>Notifikasi dikumpulkan secara terpusat di HandleInertiaRequests.php berdasarkan role pengguna yang login:</w:t>
+        <w:t>Fokus Pembahasan: Pertanyaan Dosen: 'Bagaimana logika mutasi alat medis dan bagaimana Anda menjamin konsistensi?'</w:t>
       </w:r>
     </w:p>
     <w:p>
       <w:pPr>
+        <w:spacing w:after="120" w:line="276" w:lineRule="auto"/>
+      </w:pPr>
+      <w:r>
+        <w:t>Di dalam file MutasiController.php, transaksi dilakukan di dalam blok DB::transaction(). Hal ini penting untuk memastikan sifat Atomicity (semua berhasil atau tidak sama sekali):</w:t>
+      </w:r>
+    </w:p>
+    <w:p>
+      <w:pPr>
         <w:pStyle w:val="ListBullet"/>
         <w:spacing w:after="80" w:line="276" w:lineRule="auto"/>
         <w:ind w:left="360"/>
       </w:pPr>
       <w:r>
-        <w:t>IPSRS: Laporan kerusakan baru (Open WO), mutasi menunggu verifikasi, dan jadwal pemeliharaan (PM).</w:t>
+        <w:t>Sistem memverifikasi status aset dan ruangan tujuan.</w:t>
       </w:r>
     </w:p>
     <w:p>
@@ -880,7 +1028,7 @@
         <w:ind w:left="360"/>
       </w:pPr>
       <w:r>
-        <w:t>Logistik: Aset medis yang tanggal sertifikat kalibrasinya sudah kadaluarsa (expired).</w:t>
+        <w:t>Jika validasi lolos, jalankan DB::transaction(function() { ... })</w:t>
       </w:r>
     </w:p>
     <w:p>
@@ -890,7 +1038,7 @@
         <w:ind w:left="360"/>
       </w:pPr>
       <w:r>
-        <w:t>Unit_RS: Status penanganan tiket kerusakan aktif di unit ruangan mereka.</w:t>
+        <w:t>Sistem memperbarui kolom id_ruang_saat_ini pada tabel t_aset.</w:t>
       </w:r>
     </w:p>
     <w:p>
@@ -900,7 +1048,17 @@
         <w:ind w:left="360"/>
       </w:pPr>
       <w:r>
-        <w:t>Fungsi Dismiss: Di frontend AuthenticatedLayout.jsx, saat notifikasi diklik, ID item disimpan ke localStorage. Notifikasi tersebut langsung hilang dari lonceng secara real-time dan browser mengarahkan pengguna ke halaman form tujuan.</w:t>
+        <w:t>Sistem mencatat riwayat log mutasi ke tabel t_mutasi.</w:t>
+      </w:r>
+    </w:p>
+    <w:p>
+      <w:pPr>
+        <w:pStyle w:val="ListBullet"/>
+        <w:spacing w:after="80" w:line="276" w:lineRule="auto"/>
+        <w:ind w:left="360"/>
+      </w:pPr>
+      <w:r>
+        <w:t>Jika terjadi error di tengah proses (misalnya koneksi putus saat menyimpan log mutasi), Laravel otomatis membatalkan pembaruan ruangan pada aset (Rollback) agar data tetap konsisten.</w:t>
       </w:r>
     </w:p>
     <w:p>
@@ -915,7 +1073,7 @@
           <w:color w:val="1A5685"/>
           <w:sz w:val="24"/>
         </w:rPr>
-        <w:t>Keamanan Mutasi Aset (DB Transactions)</w:t>
+        <w:t>Logika Work Order (Alur Pelaporan Kerusakan)</w:t>
       </w:r>
     </w:p>
     <w:p>
@@ -923,7 +1081,108 @@
         <w:spacing w:after="120" w:line="276" w:lineRule="auto"/>
       </w:pPr>
       <w:r>
-        <w:t>Proses mutasi di MutasiController dibungkus dalam blok DB::transaction() untuk menjaga konsistensi. Jika salah satu proses gagal, seluruh kueri dibatalkan (Rollback) agar tidak ada data ruangan aset yang tidak sinkron.</w:t>
+        <w:t>Fokus Pembahasan: Pertanyaan Dosen: 'Bagaimana alur pelaporan kerusakan dan penugasan teknisi?'</w:t>
+      </w:r>
+    </w:p>
+    <w:p>
+      <w:pPr>
+        <w:pStyle w:val="ListBullet"/>
+        <w:spacing w:after="80" w:line="276" w:lineRule="auto"/>
+        <w:ind w:left="360"/>
+      </w:pPr>
+      <w:r>
+        <w:t>Pengguna dengan peran 'Unit_RS' mengirimkan laporan kerusakan alat dari unitnya. Status awal diset default ke 'Open'.</w:t>
+      </w:r>
+    </w:p>
+    <w:p>
+      <w:pPr>
+        <w:pStyle w:val="ListBullet"/>
+        <w:spacing w:after="80" w:line="276" w:lineRule="auto"/>
+        <w:ind w:left="360"/>
+      </w:pPr>
+      <w:r>
+        <w:t>Pengguna dengan peran 'Admin_IPSRS' masuk ke menu Work Order, melihat tiket 'Open' tersebut, lalu menunjuk teknisi penanggungjawab.</w:t>
+      </w:r>
+    </w:p>
+    <w:p>
+      <w:pPr>
+        <w:pStyle w:val="ListBullet"/>
+        <w:spacing w:after="80" w:line="276" w:lineRule="auto"/>
+        <w:ind w:left="360"/>
+      </w:pPr>
+      <w:r>
+        <w:t>Teknisi lapangan (Budi, Hendra, Agus) masuk dengan akun mereka. Mereka hanya bisa melihat daftar tugas mereka dan memperbarui progres status (Open -&gt; Dikerjakan -&gt; Menunggu Sign-Off).</w:t>
+      </w:r>
+    </w:p>
+    <w:p>
+      <w:pPr>
+        <w:pStyle w:val="ListBullet"/>
+        <w:spacing w:after="80" w:line="276" w:lineRule="auto"/>
+        <w:ind w:left="360"/>
+      </w:pPr>
+      <w:r>
+        <w:t>Setelah selesai, status diset menjadi 'Closed' setelah divalidasi.</w:t>
+      </w:r>
+    </w:p>
+    <w:p>
+      <w:pPr>
+        <w:pStyle w:val="Heading2"/>
+        <w:keepNext/>
+        <w:spacing w:before="240" w:after="120"/>
+      </w:pPr>
+      <w:r>
+        <w:rPr>
+          <w:b/>
+          <w:color w:val="1A5685"/>
+          <w:sz w:val="24"/>
+        </w:rPr>
+        <w:t>Pengelolaan Laporan Cetak PDF (Print-Friendly CSS)</w:t>
+      </w:r>
+    </w:p>
+    <w:p>
+      <w:pPr>
+        <w:spacing w:after="120" w:line="276" w:lineRule="auto"/>
+      </w:pPr>
+      <w:r>
+        <w:t>Fokus Pembahasan: Pertanyaan Dosen: 'Bagaimana laporan dicetak menjadi PDF?'</w:t>
+      </w:r>
+    </w:p>
+    <w:p>
+      <w:pPr>
+        <w:spacing w:after="120" w:line="276" w:lineRule="auto"/>
+      </w:pPr>
+      <w:r>
+        <w:t>Di halaman resources/js/Pages/Aset/Index.jsx, tombol 'Cetak' memicu window.print(). Kita menggunakan utility class Tailwind CSS khusus cetak:</w:t>
+      </w:r>
+    </w:p>
+    <w:p>
+      <w:pPr>
+        <w:pStyle w:val="ListBullet"/>
+        <w:spacing w:after="80" w:line="276" w:lineRule="auto"/>
+        <w:ind w:left="360"/>
+      </w:pPr>
+      <w:r>
+        <w:t>print:hidden -&gt; Menyembunyikan sidebar, topbar, dan tombol aksi cetak saat proses print PDF berlangsung.</w:t>
+      </w:r>
+    </w:p>
+    <w:p>
+      <w:pPr>
+        <w:pStyle w:val="ListBullet"/>
+        <w:spacing w:after="80" w:line="276" w:lineRule="auto"/>
+        <w:ind w:left="360"/>
+      </w:pPr>
+      <w:r>
+        <w:t>print:block -&gt; Memunculkan Kop Laporan resmi yang disembunyikan di layar monitor biasa.</w:t>
+      </w:r>
+    </w:p>
+    <w:p>
+      <w:pPr>
+        <w:pStyle w:val="ListBullet"/>
+        <w:spacing w:after="80" w:line="276" w:lineRule="auto"/>
+        <w:ind w:left="360"/>
+      </w:pPr>
+      <w:r>
+        <w:t>print:shadow-none &amp; print:border-none -&gt; Menghilangkan bayangan dan border dekoratif agar hasil cetak PDF bersih.</w:t>
       </w:r>
     </w:p>
     <w:p>
@@ -953,7 +1212,7 @@
           <w:color w:val="1A5685"/>
           <w:sz w:val="24"/>
         </w:rPr>
-        <w:t>Laravel (MVC &amp; ORM)</w:t>
+        <w:t>Laravel: Framework Backend PHP Modern</w:t>
       </w:r>
     </w:p>
     <w:p>
@@ -963,7 +1222,7 @@
         <w:ind w:left="360"/>
       </w:pPr>
       <w:r>
-        <w:t>MVC: Pemisahan data (Model), antarmuka (View/React), dan logika (Controller) agar kode terstruktur.</w:t>
+        <w:t>Model-View-Controller (MVC): Pola arsitektur yang memisahkan data (Model), tampilan antarmuka (View/React), dan logika kontrol (Controller).</w:t>
       </w:r>
     </w:p>
     <w:p>
@@ -973,7 +1232,7 @@
         <w:ind w:left="360"/>
       </w:pPr>
       <w:r>
-        <w:t>Eloquent ORM: Mengubah baris tabel database menjadi objek PHP (Aset::find(1)).</w:t>
+        <w:t>Eloquent ORM: Teknik pemrograman untuk memetakan tabel database ke objek PHP (misal Aset::all()).</w:t>
       </w:r>
     </w:p>
     <w:p>
@@ -983,7 +1242,17 @@
         <w:ind w:left="360"/>
       </w:pPr>
       <w:r>
-        <w:t>Middleware: Filter keamanan HTTP request (seperti mengecek login session atau token API).</w:t>
+        <w:t>Middleware: Lapisan filter keamanan HTTP request (seperti memverifikasi login session atau token API).</w:t>
+      </w:r>
+    </w:p>
+    <w:p>
+      <w:pPr>
+        <w:pStyle w:val="ListBullet"/>
+        <w:spacing w:after="80" w:line="276" w:lineRule="auto"/>
+        <w:ind w:left="360"/>
+      </w:pPr>
+      <w:r>
+        <w:t>Database Transactions: Pengelompokan beberapa perintah query (commit dan rollback) untuk menjamin integritas data.</w:t>
       </w:r>
     </w:p>
     <w:p>
@@ -998,7 +1267,7 @@
           <w:color w:val="1A5685"/>
           <w:sz w:val="24"/>
         </w:rPr>
-        <w:t>React.js (Virtual DOM &amp; State)</w:t>
+        <w:t>React.js: Library Frontend Berbasis Komponen</w:t>
       </w:r>
     </w:p>
     <w:p>
@@ -1008,7 +1277,7 @@
         <w:ind w:left="360"/>
       </w:pPr>
       <w:r>
-        <w:t>Virtual DOM: React membandingkan salinan DOM di memori dengan DOM asli dan hanya me-render bagian HTML yang berubah saja (Diffing Algorithm), sehingga sangat cepat.</w:t>
+        <w:t>Component-based Architecture: UI dipecah menjadi bagian mandiri yang reusable.</w:t>
       </w:r>
     </w:p>
     <w:p>
@@ -1018,7 +1287,72 @@
         <w:ind w:left="360"/>
       </w:pPr>
       <w:r>
+        <w:t>Virtual DOM: Salinan DOM asli di memori. React hanya meng-update elemen HTML yang berubah saja (Diffing Algorithm) sehingga performa web sangat cepat.</w:t>
+      </w:r>
+    </w:p>
+    <w:p>
+      <w:pPr>
+        <w:pStyle w:val="ListBullet"/>
+        <w:spacing w:after="80" w:line="276" w:lineRule="auto"/>
+        <w:ind w:left="360"/>
+      </w:pPr>
+      <w:r>
         <w:t>State vs Props: State adalah variabel lokal internal komponen (dapat diubah), sedangkan Props adalah data kiriman dari parent/controller (read-only).</w:t>
+      </w:r>
+    </w:p>
+    <w:p>
+      <w:pPr>
+        <w:pStyle w:val="ListBullet"/>
+        <w:spacing w:after="80" w:line="276" w:lineRule="auto"/>
+        <w:ind w:left="360"/>
+      </w:pPr>
+      <w:r>
+        <w:t>React Hooks: Fungsi bawaan React seperti useState() untuk state lokal dan useEffect() untuk lifecycle side-effects.</w:t>
+      </w:r>
+    </w:p>
+    <w:p>
+      <w:pPr>
+        <w:pStyle w:val="Heading2"/>
+        <w:keepNext/>
+        <w:spacing w:before="240" w:after="120"/>
+      </w:pPr>
+      <w:r>
+        <w:rPr>
+          <w:b/>
+          <w:color w:val="1A5685"/>
+          <w:sz w:val="24"/>
+        </w:rPr>
+        <w:t>REST API &amp; Laravel Sanctum</w:t>
+      </w:r>
+    </w:p>
+    <w:p>
+      <w:pPr>
+        <w:pStyle w:val="ListBullet"/>
+        <w:spacing w:after="80" w:line="276" w:lineRule="auto"/>
+        <w:ind w:left="360"/>
+      </w:pPr>
+      <w:r>
+        <w:t>Statelessness: Server tidak menyimpan status session klien. Setiap HTTP request Android membawa token autentikasi.</w:t>
+      </w:r>
+    </w:p>
+    <w:p>
+      <w:pPr>
+        <w:pStyle w:val="ListBullet"/>
+        <w:spacing w:after="80" w:line="276" w:lineRule="auto"/>
+        <w:ind w:left="360"/>
+      </w:pPr>
+      <w:r>
+        <w:t>HTTP Methods: Aksi standar komunikasi: GET (ambil), POST (buat baru), PUT/PATCH (update), DELETE (hapus).</w:t>
+      </w:r>
+    </w:p>
+    <w:p>
+      <w:pPr>
+        <w:pStyle w:val="ListBullet"/>
+        <w:spacing w:after="80" w:line="276" w:lineRule="auto"/>
+        <w:ind w:left="360"/>
+      </w:pPr>
+      <w:r>
+        <w:t>Laravel Sanctum: Sistem autentikasi token ringan untuk mengamankan endpoint REST API.</w:t>
       </w:r>
     </w:p>
     <w:p>
@@ -1038,12 +1372,20 @@
     </w:p>
     <w:p>
       <w:pPr>
+        <w:spacing w:after="120" w:line="276" w:lineRule="auto"/>
+      </w:pPr>
+      <w:r>
+        <w:t>Dosen sering menanyakan kegunaan berkas konfigurasi di root direktori proyek:</w:t>
+      </w:r>
+    </w:p>
+    <w:p>
+      <w:pPr>
         <w:pStyle w:val="ListBullet"/>
         <w:spacing w:after="80" w:line="276" w:lineRule="auto"/>
         <w:ind w:left="360"/>
       </w:pPr>
       <w:r>
-        <w:t>.env - Kredensial database lokal dan kunci enkripsi aplikasi.</w:t>
+        <w:t>.env &amp; .env.example: Menyimpan kredensial database lokal, app key, dan variabel lingkungan sensitif.</w:t>
       </w:r>
     </w:p>
     <w:p>
@@ -1053,7 +1395,7 @@
         <w:ind w:left="360"/>
       </w:pPr>
       <w:r>
-        <w:t>composer.json - Package manager PHP untuk mengelola dependensi Laravel backend.</w:t>
+        <w:t>.editorconfig &amp; .eslintrc.json: Menstandarkan gaya penulisan kode JavaScript dan deteksi error sintaks.</w:t>
       </w:r>
     </w:p>
     <w:p>
@@ -1063,7 +1405,7 @@
         <w:ind w:left="360"/>
       </w:pPr>
       <w:r>
-        <w:t>package.json - Package manager Node.js untuk mengelola dependensi React frontend.</w:t>
+        <w:t>.gitignore: Berkas instruksi agar Git mengabaikan folder dependensi vendor/ atau node_modules/ saat push ke GitHub.</w:t>
       </w:r>
     </w:p>
     <w:p>
@@ -1073,7 +1415,37 @@
         <w:ind w:left="360"/>
       </w:pPr>
       <w:r>
-        <w:t>vite.config.js - Bundler Vite untuk kompilasi real-time React JSX dan CSS Tailwind.</w:t>
+        <w:t>composer.json &amp; composer.lock: Package manager PHP untuk mendefinisikan library dependensi backend (Laravel, Sanctum, Inertia).</w:t>
+      </w:r>
+    </w:p>
+    <w:p>
+      <w:pPr>
+        <w:pStyle w:val="ListBullet"/>
+        <w:spacing w:after="80" w:line="276" w:lineRule="auto"/>
+        <w:ind w:left="360"/>
+      </w:pPr>
+      <w:r>
+        <w:t>package.json &amp; package-lock.json: Package manager Node.js untuk mendefinisikan library frontend (React, Axios, ChartJS).</w:t>
+      </w:r>
+    </w:p>
+    <w:p>
+      <w:pPr>
+        <w:pStyle w:val="ListBullet"/>
+        <w:spacing w:after="80" w:line="276" w:lineRule="auto"/>
+        <w:ind w:left="360"/>
+      </w:pPr>
+      <w:r>
+        <w:t>tailwind.config.js: Mengatur tema warna kustom, responsivitas, dan kelas CSS Tailwind.</w:t>
+      </w:r>
+    </w:p>
+    <w:p>
+      <w:pPr>
+        <w:pStyle w:val="ListBullet"/>
+        <w:spacing w:after="80" w:line="276" w:lineRule="auto"/>
+        <w:ind w:left="360"/>
+      </w:pPr>
+      <w:r>
+        <w:t>vite.config.js: Konfigurasi bundler Vite untuk kompilasi real-time aset React JSX dan Tailwind CSS.</w:t>
       </w:r>
     </w:p>
     <w:p>
@@ -1093,12 +1465,35 @@
     </w:p>
     <w:p>
       <w:pPr>
+        <w:pStyle w:val="Heading2"/>
+        <w:keepNext/>
+        <w:spacing w:before="240" w:after="120"/>
+      </w:pPr>
+      <w:r>
+        <w:rPr>
+          <w:b/>
+          <w:color w:val="1A5685"/>
+          <w:sz w:val="24"/>
+        </w:rPr>
+        <w:t>Web Sessions (Autentikasi Stateful)</w:t>
+      </w:r>
+    </w:p>
+    <w:p>
+      <w:pPr>
+        <w:spacing w:after="120" w:line="276" w:lineRule="auto"/>
+      </w:pPr>
+      <w:r>
+        <w:t>Session adalah mekanisme penyimpanan status login di sisi server:</w:t>
+      </w:r>
+    </w:p>
+    <w:p>
+      <w:pPr>
         <w:pStyle w:val="ListBullet"/>
         <w:spacing w:after="80" w:line="276" w:lineRule="auto"/>
         <w:ind w:left="360"/>
       </w:pPr>
       <w:r>
-        <w:t>Web Sessions (Stateful): Browser menyimpan Session ID di Cookie (laravel_session) yang dilampirkan otomatis pada setiap request HTTP. Server melacak status login di memori.</w:t>
+        <w:t>Pengguna memasukkan email/password -&gt; Laravel mencocokkannya -&gt; jika cocok, Laravel membuat file session unik di server dan mengirimkan Session ID (Cookie bernama laravel_session) ke browser.</w:t>
       </w:r>
     </w:p>
     <w:p>
@@ -1108,17 +1503,113 @@
         <w:ind w:left="360"/>
       </w:pPr>
       <w:r>
-        <w:t>API Tokens (Stateless): Android menyimpan token secara mandiri dan mengirimkannya di header Authorization. Server hanya memeriksa apakah token valid tanpa menyimpan status session.</w:t>
+        <w:t>Web browser melampirkan cookie Session ID tersebut secara otomatis dalam setiap request HTTP selanjutnya.</w:t>
       </w:r>
     </w:p>
     <w:p>
       <w:pPr>
+        <w:pStyle w:val="Heading2"/>
+        <w:keepNext/>
+        <w:spacing w:before="240" w:after="120"/>
+      </w:pPr>
+      <w:r>
+        <w:rPr>
+          <w:b/>
+          <w:color w:val="1A5685"/>
+          <w:sz w:val="24"/>
+        </w:rPr>
+        <w:t>API Tokens (Autentikasi Stateless)</w:t>
+      </w:r>
+    </w:p>
+    <w:p>
+      <w:pPr>
+        <w:spacing w:after="120" w:line="276" w:lineRule="auto"/>
+      </w:pPr>
+      <w:r>
+        <w:t>Token adalah string acak unik yang digunakan untuk mengautentikasi REST API mobile:</w:t>
+      </w:r>
+    </w:p>
+    <w:p>
+      <w:pPr>
         <w:pStyle w:val="ListBullet"/>
         <w:spacing w:after="80" w:line="276" w:lineRule="auto"/>
         <w:ind w:left="360"/>
       </w:pPr>
       <w:r>
-        <w:t>Database Migrations: Version control untuk skema database. php artisan migrate digunakan untuk memperbarui tabel database secara otomatis tanpa impor file SQL manual.</w:t>
+        <w:t>Aplikasi Android mengirim login request -&gt; Laravel Sanctum membuat baris token baru di tabel database personal_access_tokens dan mengirimkan token string tersebut ke Android.</w:t>
+      </w:r>
+    </w:p>
+    <w:p>
+      <w:pPr>
+        <w:pStyle w:val="ListBullet"/>
+        <w:spacing w:after="80" w:line="276" w:lineRule="auto"/>
+        <w:ind w:left="360"/>
+      </w:pPr>
+      <w:r>
+        <w:t>Android menyimpan token secara lokal dan melampirkannya secara manual di header HTTP: Authorization: Bearer {token} pada setiap request.</w:t>
+      </w:r>
+    </w:p>
+    <w:p>
+      <w:pPr>
+        <w:pStyle w:val="ListBullet"/>
+        <w:spacing w:after="80" w:line="276" w:lineRule="auto"/>
+        <w:ind w:left="360"/>
+      </w:pPr>
+      <w:r>
+        <w:t>Mengapa Android memakai Token?: Karena aplikasi mobile tidak memiliki mekanisme otomatisasi cookie session layaknya web browser.</w:t>
+      </w:r>
+    </w:p>
+    <w:p>
+      <w:pPr>
+        <w:pStyle w:val="Heading2"/>
+        <w:keepNext/>
+        <w:spacing w:before="240" w:after="120"/>
+      </w:pPr>
+      <w:r>
+        <w:rPr>
+          <w:b/>
+          <w:color w:val="1A5685"/>
+          <w:sz w:val="24"/>
+        </w:rPr>
+        <w:t>Database Migrations (Version Control untuk Database)</w:t>
+      </w:r>
+    </w:p>
+    <w:p>
+      <w:pPr>
+        <w:spacing w:after="120" w:line="276" w:lineRule="auto"/>
+      </w:pPr>
+      <w:r>
+        <w:t>Migrasi adalah version control untuk skema database. Struktur tabel didefinisikan menggunakan kode PHP sehingga tidak perlu ekspor-impor file SQL manual.</w:t>
+      </w:r>
+    </w:p>
+    <w:p>
+      <w:pPr>
+        <w:pStyle w:val="ListBullet"/>
+        <w:spacing w:after="80" w:line="276" w:lineRule="auto"/>
+        <w:ind w:left="360"/>
+      </w:pPr>
+      <w:r>
+        <w:t>php artisan migrate: Menjalankan semua berkas migrasi baru ke database.</w:t>
+      </w:r>
+    </w:p>
+    <w:p>
+      <w:pPr>
+        <w:pStyle w:val="ListBullet"/>
+        <w:spacing w:after="80" w:line="276" w:lineRule="auto"/>
+        <w:ind w:left="360"/>
+      </w:pPr>
+      <w:r>
+        <w:t>php artisan migrate:rollback: Membatalkan atau memundurkan migrasi yang terakhir dijalankan.</w:t>
+      </w:r>
+    </w:p>
+    <w:p>
+      <w:pPr>
+        <w:pStyle w:val="ListBullet"/>
+        <w:spacing w:after="80" w:line="276" w:lineRule="auto"/>
+        <w:ind w:left="360"/>
+      </w:pPr>
+      <w:r>
+        <w:t>php artisan migrate:fresh: Menghapus seluruh tabel di database lalu menjalankan ulang seluruh berkas migrasi dari awal.</w:t>
       </w:r>
     </w:p>
     <w:sectPr>

</xml_diff>

<commit_message>
Docs: Align Word and text guides exactly with the 14-page PDF structure and MedTrack code
</commit_message>
<xml_diff>
--- a/Poin Poin dan Pemahaman Untuk Presentasi (Hasil Edit).docx
+++ b/Poin Poin dan Pemahaman Untuk Presentasi (Hasil Edit).docx
@@ -10,24 +10,26 @@
       <w:r>
         <w:rPr>
           <w:b/>
-          <w:color w:val="0A3A60"/>
+          <w:color w:val="000000"/>
           <w:sz w:val="40"/>
         </w:rPr>
-        <w:t>🏥 DOKUMENTASI PENDALAMAN TEKNIS DAN ANALISIS KODE KUNCI PROJEK MEDTRACK</w:t>
+        <w:t>PANDUAN DETAIL PEMAHAMAN TEKNIS PROJEK AKHIR</w:t>
       </w:r>
     </w:p>
     <w:p>
       <w:pPr>
-        <w:spacing w:after="400"/>
+        <w:spacing w:after="480"/>
         <w:jc w:val="center"/>
       </w:pPr>
       <w:r>
         <w:rPr>
           <w:i/>
-          <w:color w:val="64748B"/>
+          <w:color w:val="505050"/>
           <w:sz w:val="22"/>
         </w:rPr>
-        <w:t>Analisis Rinci Setiap Struktur Direktori, Komponen Frontend React, Alur Integrasi Hybrid Monolith, Otorisasi Keamanan Berbasis Peran, dan Kumpulan Simulasi Tanya Jawab Dosen Penguji</w:t>
+        <w:t>Materi Pendalaman Struktur Kode, Alur Data, dan Integrasi Laravel + React Inertia</w:t>
+        <w:br/>
+        <w:t>Khusus untuk Menjawab Pertanyaan Dosen Penguji secara Rinci</w:t>
       </w:r>
     </w:p>
     <w:p>
@@ -39,7 +41,7 @@
       <w:r>
         <w:rPr>
           <w:b/>
-          <w:color w:val="0A3A60"/>
+          <w:color w:val="1F4E79"/>
           <w:sz w:val="28"/>
         </w:rPr>
         <w:t>BAB I: BEDAH STRUKTUR DIREKTORI PROYEK (LARAVEL + REACT INERTIA)</w:t>
@@ -50,7 +52,7 @@
         <w:spacing w:after="120" w:line="276" w:lineRule="auto"/>
       </w:pPr>
       <w:r>
-        <w:t>Arsitektur Hybrid Monolith memadukan keunggulan Laravel sebagai backend tangguh dan React.js sebagai frontend reaktif di dalam satu repositori terpadu. Jembatan komunikasi data dikelola sepenuhnya oleh Inertia.js, yang meniadakan kebutuhan REST API internal untuk klien web. Berikut adalah pembagian tugas setiap folder:</w:t>
+        <w:t>Dosen sering menanyakan di mana letak logika bisnis, di mana letak rute, dan bagaimana kode frontend bisa menyatu dengan backend. Berikut adalah rincian fungsional struktur folder proyek:</w:t>
       </w:r>
     </w:p>
     <w:p>
@@ -62,10 +64,10 @@
       <w:r>
         <w:rPr>
           <w:b/>
-          <w:color w:val="1A5685"/>
+          <w:color w:val="2E75B5"/>
           <w:sz w:val="24"/>
         </w:rPr>
-        <w:t>Sisi Backend (Laravel 10)</w:t>
+        <w:t>1.1 Sisi Backend (Laravel 10)</w:t>
       </w:r>
     </w:p>
     <w:p>
@@ -73,166 +75,15 @@
         <w:pStyle w:val="ListBullet"/>
         <w:spacing w:after="80" w:line="276" w:lineRule="auto"/>
         <w:ind w:left="360"/>
-      </w:pPr>
-      <w:r>
-        <w:t>app/Http/Controllers/Web/ - Folder ini menyimpan seluruh logika bisnis web. Controller bertugas memproses data masukan, berinteraksi dengan database melalui Model Eloquent, dan meneruskan data tersebut ke frontend React via properti Inertia rendering.</w:t>
-      </w:r>
-    </w:p>
-    <w:p>
-      <w:pPr>
-        <w:pStyle w:val="ListBullet"/>
-        <w:spacing w:after="80" w:line="276" w:lineRule="auto"/>
-        <w:ind w:left="360"/>
-      </w:pPr>
-      <w:r>
-        <w:t>app/Http/Controllers/Api/ - Menyimpan pengolah logika API khusus (seperti ApiAuthController dan ApiAsetController) yang melayani pengiriman data JSON untuk aplikasi GPS tracker mobile Android.</w:t>
-      </w:r>
-    </w:p>
-    <w:p>
-      <w:pPr>
-        <w:pStyle w:val="ListBullet"/>
-        <w:spacing w:after="80" w:line="276" w:lineRule="auto"/>
-        <w:ind w:left="360"/>
-      </w:pPr>
-      <w:r>
-        <w:t>app/Models/ - Folder yang berisi representasi objek ORM untuk tabel-tabel di database MySQL. Model di sini mengelola deklarasi relasi antar-tabel secara dinamis (seperti relasi hasMany atau belongsTo).</w:t>
-      </w:r>
-    </w:p>
-    <w:p>
-      <w:pPr>
-        <w:pStyle w:val="ListBullet"/>
-        <w:spacing w:after="80" w:line="276" w:lineRule="auto"/>
-        <w:ind w:left="360"/>
-      </w:pPr>
-      <w:r>
-        <w:t>app/Http/Middleware/HandleInertiaRequests.php - Berkas konfigurasi shared props global yang secara konstan membagikan data dinamis (seperti status autentikasi user dan notifikasi lonceng) ke seluruh halaman React.</w:t>
-      </w:r>
-    </w:p>
-    <w:p>
-      <w:pPr>
-        <w:pStyle w:val="ListBullet"/>
-        <w:spacing w:after="80" w:line="276" w:lineRule="auto"/>
-        <w:ind w:left="360"/>
-      </w:pPr>
-      <w:r>
-        <w:t>database/migrations/ - Berkas deklarasi pembuatan skema tabel database MySQL, memungkinkan replikasi database secara otomatis.</w:t>
-      </w:r>
-    </w:p>
-    <w:p>
-      <w:pPr>
-        <w:pStyle w:val="ListBullet"/>
-        <w:spacing w:after="80" w:line="276" w:lineRule="auto"/>
-        <w:ind w:left="360"/>
-      </w:pPr>
-      <w:r>
-        <w:t>routes/web.php - Tempat mendefinisikan rute URL aplikasi web yang diproteksi oleh sistem autentikasi berbasis session.</w:t>
-      </w:r>
-    </w:p>
-    <w:p>
-      <w:pPr>
-        <w:pStyle w:val="ListBullet"/>
-        <w:spacing w:after="80" w:line="276" w:lineRule="auto"/>
-        <w:ind w:left="360"/>
-      </w:pPr>
-      <w:r>
-        <w:t>routes/api.php - Tempat mendefinisikan rute REST API Android pelacak GPS yang diproteksi oleh Laravel Sanctum Token.</w:t>
-      </w:r>
-    </w:p>
-    <w:p>
-      <w:pPr>
-        <w:pStyle w:val="Heading2"/>
-        <w:keepNext/>
-        <w:spacing w:before="240" w:after="120"/>
-      </w:pPr>
-      <w:r>
-        <w:rPr>
-          <w:b/>
-          <w:color w:val="1A5685"/>
-          <w:sz w:val="24"/>
-        </w:rPr>
-        <w:t>Sisi Frontend (React.js + Tailwind CSS)</w:t>
-      </w:r>
-    </w:p>
-    <w:p>
-      <w:pPr>
-        <w:pStyle w:val="ListBullet"/>
-        <w:spacing w:after="80" w:line="276" w:lineRule="auto"/>
-        <w:ind w:left="360"/>
-      </w:pPr>
-      <w:r>
-        <w:t>resources/js/Pages/ - Menyimpan file komponen halaman utama (Views). Setiap berkas React JSX di folder ini mewakili satu halaman web utuh.</w:t>
-      </w:r>
-    </w:p>
-    <w:p>
-      <w:pPr>
-        <w:pStyle w:val="ListBullet"/>
-        <w:spacing w:after="80" w:line="276" w:lineRule="auto"/>
-        <w:ind w:left="360"/>
-      </w:pPr>
-      <w:r>
-        <w:t>resources/js/Layouts/AuthenticatedLayout.jsx - Kerangka tata letak antarmuka utama (Sidebar, Header, lonceng notifikasi, modal scan QR Code, kalender pemeliharaan) yang menyelimuti seluruh halaman setelah login.</w:t>
-      </w:r>
-    </w:p>
-    <w:p>
-      <w:pPr>
-        <w:pStyle w:val="ListBullet"/>
-        <w:spacing w:after="80" w:line="276" w:lineRule="auto"/>
-        <w:ind w:left="360"/>
-      </w:pPr>
-      <w:r>
-        <w:t>resources/js/Components/ - Menyimpan komponen-komponen UI kecil yang dapat dipanggil secara berulang (reusable components), seperti Dropdown.jsx, Modal.jsx, TextInput.jsx.</w:t>
-      </w:r>
-    </w:p>
-    <w:p>
-      <w:pPr>
-        <w:pStyle w:val="Heading1"/>
-        <w:keepNext/>
-        <w:spacing w:before="360" w:after="160"/>
-      </w:pPr>
-      <w:r>
-        <w:rPr>
-          <w:b/>
-          <w:color w:val="0A3A60"/>
-          <w:sz w:val="28"/>
-        </w:rPr>
-        <w:t>BAB II: PENJELASAN DETIL SETIAP FILE KODE PROGRAM</w:t>
-      </w:r>
-    </w:p>
-    <w:p>
-      <w:pPr>
-        <w:spacing w:after="120" w:line="276" w:lineRule="auto"/>
-      </w:pPr>
-      <w:r>
-        <w:t>Penjelasan terperinci mengenai peran utama dan fungsi kunci dari setiap file model, controller, dan antarmuka React di dalam sistem MedTrack:</w:t>
-      </w:r>
-    </w:p>
-    <w:p>
-      <w:pPr>
-        <w:pStyle w:val="Heading2"/>
-        <w:keepNext/>
-        <w:spacing w:before="240" w:after="120"/>
-      </w:pPr>
-      <w:r>
-        <w:rPr>
-          <w:b/>
-          <w:color w:val="1A5685"/>
-          <w:sz w:val="24"/>
-        </w:rPr>
-        <w:t>1. Model Eloquent (app/Models/)</w:t>
-      </w:r>
-    </w:p>
-    <w:p>
-      <w:pPr>
-        <w:spacing w:after="120" w:line="276" w:lineRule="auto"/>
       </w:pPr>
       <w:r>
         <w:rPr>
           <w:b/>
         </w:rPr>
-        <w:t xml:space="preserve">User.php: </w:t>
+        <w:t>• app/Http/Controllers/Web/:</w:t>
       </w:r>
       <w:r>
-        <w:t xml:space="preserve"> - Memetakan tabel m_user. Menyimpan informasi profil staff, peran (role), password (terenkripsi bcrypt), status keaktifan, dan relasi unit kerja.</w:t>
+        <w:t xml:space="preserve"> Tempat menyimpan logika kontroler web. Controller bertugas mengambil data dari Model, memproses otorisasi peran pengguna (role checking), melakukan manipulasi data, dan meneruskan data tersebut ke tampilan frontend menggunakan Inertia rendering.</w:t>
       </w:r>
     </w:p>
     <w:p>
@@ -240,23 +91,15 @@
         <w:pStyle w:val="ListBullet"/>
         <w:spacing w:after="80" w:line="276" w:lineRule="auto"/>
         <w:ind w:left="360"/>
-      </w:pPr>
-      <w:r>
-        <w:t>ruangan(): Mendefinisikan relasi belongsTo(Ruangan::class, 'id_ruang') untuk mendapatkan unit kerja user.</w:t>
-      </w:r>
-    </w:p>
-    <w:p>
-      <w:pPr>
-        <w:spacing w:after="120" w:line="276" w:lineRule="auto"/>
       </w:pPr>
       <w:r>
         <w:rPr>
           <w:b/>
         </w:rPr>
-        <w:t xml:space="preserve">Aset.php: </w:t>
+        <w:t>• app/Http/Controllers/Api/:</w:t>
       </w:r>
       <w:r>
-        <w:t xml:space="preserve"> - Memetakan tabel t_aset. Menyimpan detail inventaris alat medis (kode label, serial number, merk, tipe, status kelaikan, koordinat lokasi GPS tracking, tanggal kalibrasi terakhir, tanggal kalibrasi berikutnya, dan nama file QR Code).</w:t>
+        <w:t xml:space="preserve"> Berisi file ApiAuthController dan ApiAsetController untuk melayani request mobile tracker Android Kotlin dalam format JSON.</w:t>
       </w:r>
     </w:p>
     <w:p>
@@ -264,33 +107,15 @@
         <w:pStyle w:val="ListBullet"/>
         <w:spacing w:after="80" w:line="276" w:lineRule="auto"/>
         <w:ind w:left="360"/>
-      </w:pPr>
-      <w:r>
-        <w:t>ruangan(): Mendefinisikan relasi belongsTo(Ruangan::class, 'id_ruang_saat_ini') untuk melacak lokasi ruang terkini alat.</w:t>
-      </w:r>
-    </w:p>
-    <w:p>
-      <w:pPr>
-        <w:pStyle w:val="ListBullet"/>
-        <w:spacing w:after="80" w:line="276" w:lineRule="auto"/>
-        <w:ind w:left="360"/>
-      </w:pPr>
-      <w:r>
-        <w:t>troubleshoot(): Mendefinisikan relasi hasMany(Troubleshoot::class, 'id_aset') untuk mendapatkan riwayat kerusakan alat.</w:t>
-      </w:r>
-    </w:p>
-    <w:p>
-      <w:pPr>
-        <w:spacing w:after="120" w:line="276" w:lineRule="auto"/>
       </w:pPr>
       <w:r>
         <w:rPr>
           <w:b/>
         </w:rPr>
-        <w:t xml:space="preserve">Ruangan.php: </w:t>
+        <w:t>• app/Models/:</w:t>
       </w:r>
       <w:r>
-        <w:t xml:space="preserve"> - Memetakan tabel m_ruangan. Menyimpan data ruangan di rumah sakit (ICU, IGD, OK, ICCU, dll.).</w:t>
+        <w:t xml:space="preserve"> Berisi Model Eloquent (User.php, Aset.php, Ruangan.php, Mutasi.php, Troubleshoot.php, TroubleshootLog.php, Pemeliharaan.php, PemeliharaanLog.php, DokumenMutu.php) yang memetakan tabel database MySQL secara objek ORM. Model mendefinisikan relasi antar-tabel secara dinamis (seperti Aset milik Ruangan melalui belongsTo).</w:t>
       </w:r>
     </w:p>
     <w:p>
@@ -298,23 +123,15 @@
         <w:pStyle w:val="ListBullet"/>
         <w:spacing w:after="80" w:line="276" w:lineRule="auto"/>
         <w:ind w:left="360"/>
-      </w:pPr>
-      <w:r>
-        <w:t>asets(): Mendefinisikan relasi hasMany(Aset::class, 'id_ruang_saat_ini') untuk mendapatkan semua inventaris di ruangan tersebut.</w:t>
-      </w:r>
-    </w:p>
-    <w:p>
-      <w:pPr>
-        <w:spacing w:after="120" w:line="276" w:lineRule="auto"/>
       </w:pPr>
       <w:r>
         <w:rPr>
           <w:b/>
         </w:rPr>
-        <w:t xml:space="preserve">Mutasi.php: </w:t>
+        <w:t>• database/migrations/:</w:t>
       </w:r>
       <w:r>
-        <w:t xml:space="preserve"> - Memetakan tabel t_mutasi. Menyimpan riwayat pengajuan pemindahan alat medis antar-ruangan.</w:t>
+        <w:t xml:space="preserve"> Skema pembuatan tabel database. Skema migrations dipisahkan agar pembuatan constraint foreign key dan indexing berjalan runtut tanpa error.</w:t>
       </w:r>
     </w:p>
     <w:p>
@@ -322,43 +139,15 @@
         <w:pStyle w:val="ListBullet"/>
         <w:spacing w:after="80" w:line="276" w:lineRule="auto"/>
         <w:ind w:left="360"/>
-      </w:pPr>
-      <w:r>
-        <w:t>aset(): belongsTo(Aset::class, 'id_aset')</w:t>
-      </w:r>
-    </w:p>
-    <w:p>
-      <w:pPr>
-        <w:pStyle w:val="ListBullet"/>
-        <w:spacing w:after="80" w:line="276" w:lineRule="auto"/>
-        <w:ind w:left="360"/>
-      </w:pPr>
-      <w:r>
-        <w:t>ruanganAsal(): belongsTo(Ruangan::class, 'id_ruang_asal')</w:t>
-      </w:r>
-    </w:p>
-    <w:p>
-      <w:pPr>
-        <w:pStyle w:val="ListBullet"/>
-        <w:spacing w:after="80" w:line="276" w:lineRule="auto"/>
-        <w:ind w:left="360"/>
-      </w:pPr>
-      <w:r>
-        <w:t>ruanganTujuan(): belongsTo(Ruangan::class, 'id_ruang_tujuan')</w:t>
-      </w:r>
-    </w:p>
-    <w:p>
-      <w:pPr>
-        <w:spacing w:after="120" w:line="276" w:lineRule="auto"/>
       </w:pPr>
       <w:r>
         <w:rPr>
           <w:b/>
         </w:rPr>
-        <w:t xml:space="preserve">Troubleshoot.php: </w:t>
+        <w:t>• database/seeders/DatabaseSeeder.php:</w:t>
       </w:r>
       <w:r>
-        <w:t xml:space="preserve"> - Memetakan tabel t_troubleshoot. Menyimpan tiket laporan kerusakan alat medis (Work Order).</w:t>
+        <w:t xml:space="preserve"> Menyimpan data awal bawaan (akun user dengan role berbeda seperti Admin_IPSRS, Staf_Logistik, dan Unit_RS, ruangan medis, serta data aset medis dummy).</w:t>
       </w:r>
     </w:p>
     <w:p>
@@ -366,68 +155,15 @@
         <w:pStyle w:val="ListBullet"/>
         <w:spacing w:after="80" w:line="276" w:lineRule="auto"/>
         <w:ind w:left="360"/>
-      </w:pPr>
-      <w:r>
-        <w:t>pelapor(): belongsTo(User.class, 'id_user_pelapor')</w:t>
-      </w:r>
-    </w:p>
-    <w:p>
-      <w:pPr>
-        <w:pStyle w:val="ListBullet"/>
-        <w:spacing w:after="80" w:line="276" w:lineRule="auto"/>
-        <w:ind w:left="360"/>
-      </w:pPr>
-      <w:r>
-        <w:t>teknisi(): belongsTo(User.class, 'id_teknisi_penanggungjawab')</w:t>
-      </w:r>
-    </w:p>
-    <w:p>
-      <w:pPr>
-        <w:pStyle w:val="ListBullet"/>
-        <w:spacing w:after="80" w:line="276" w:lineRule="auto"/>
-        <w:ind w:left="360"/>
-      </w:pPr>
-      <w:r>
-        <w:t>aset(): belongsTo(Aset::class, 'id_aset')</w:t>
-      </w:r>
-    </w:p>
-    <w:p>
-      <w:pPr>
-        <w:pStyle w:val="ListBullet"/>
-        <w:spacing w:after="80" w:line="276" w:lineRule="auto"/>
-        <w:ind w:left="360"/>
-      </w:pPr>
-      <w:r>
-        <w:t>ticketLogs(): hasMany(TroubleshootLog::class, 'id_ticket')</w:t>
-      </w:r>
-    </w:p>
-    <w:p>
-      <w:pPr>
-        <w:pStyle w:val="Heading2"/>
-        <w:keepNext/>
-        <w:spacing w:before="240" w:after="120"/>
-      </w:pPr>
-      <w:r>
-        <w:rPr>
-          <w:b/>
-          <w:color w:val="1A5685"/>
-          <w:sz w:val="24"/>
-        </w:rPr>
-        <w:t>2. Web Controllers (app/Http/Controllers/Web/)</w:t>
-      </w:r>
-    </w:p>
-    <w:p>
-      <w:pPr>
-        <w:spacing w:after="120" w:line="276" w:lineRule="auto"/>
       </w:pPr>
       <w:r>
         <w:rPr>
           <w:b/>
         </w:rPr>
-        <w:t xml:space="preserve">DashboardController.php: </w:t>
+        <w:t>• routes/web.php:</w:t>
       </w:r>
       <w:r>
-        <w:t xml:space="preserve"> - Menyajikan dasbor utama. Menghitung ringkasan statistik (jumlah aset, total kerusakan, mutasi pending) dan memuat agenda kalibrasi harian.</w:t>
+        <w:t xml:space="preserve"> Menyimpan rute akses web client yang dilindungi oleh middleware 'auth' (mengharuskan login session). Rute mengarah ke controller Inertia.</w:t>
       </w:r>
     </w:p>
     <w:p>
@@ -435,77 +171,46 @@
         <w:pStyle w:val="ListBullet"/>
         <w:spacing w:after="80" w:line="276" w:lineRule="auto"/>
         <w:ind w:left="360"/>
-      </w:pPr>
-      <w:r>
-        <w:t>index(): Mengambil data statistik kartu ringkasan dan kalender pemeliharaan.</w:t>
-      </w:r>
-    </w:p>
-    <w:p>
-      <w:pPr>
-        <w:pStyle w:val="ListBullet"/>
-        <w:spacing w:after="80" w:line="276" w:lineRule="auto"/>
-        <w:ind w:left="360"/>
-      </w:pPr>
-      <w:r>
-        <w:t>reschedule(): Logika pembaruan tanggal kalibrasi alat secara interaktif dari kalender sidebar.</w:t>
-      </w:r>
-    </w:p>
-    <w:p>
-      <w:pPr>
-        <w:spacing w:after="120" w:line="276" w:lineRule="auto"/>
       </w:pPr>
       <w:r>
         <w:rPr>
           <w:b/>
         </w:rPr>
-        <w:t xml:space="preserve">AsetController.php: </w:t>
+        <w:t>• routes/api.php:</w:t>
       </w:r>
       <w:r>
-        <w:t xml:space="preserve"> - Menangani manajemen inventaris alat medis.</w:t>
+        <w:t xml:space="preserve"> Menyimpan rute REST API untuk Android. Rute login bersifat publik, sedangkan rute lainnya dilindungi middleware 'auth:sanctum' (wajib menyertakan token).</w:t>
       </w:r>
     </w:p>
     <w:p>
       <w:pPr>
+        <w:pStyle w:val="Heading2"/>
+        <w:keepNext/>
+        <w:spacing w:before="240" w:after="120"/>
+      </w:pPr>
+      <w:r>
+        <w:rPr>
+          <w:b/>
+          <w:color w:val="2E75B5"/>
+          <w:sz w:val="24"/>
+        </w:rPr>
+        <w:t>1.2 Sisi Frontend (React.js + Tailwind)</w:t>
+      </w:r>
+    </w:p>
+    <w:p>
+      <w:pPr>
         <w:pStyle w:val="ListBullet"/>
         <w:spacing w:after="80" w:line="276" w:lineRule="auto"/>
         <w:ind w:left="360"/>
-      </w:pPr>
-      <w:r>
-        <w:t>index(): Menampilkan katalog aset. Menyaring data otomatis per unit untuk Unit_RS, dan menonaktifkan filter jika ada parameter pencarian (scan QR).</w:t>
-      </w:r>
-    </w:p>
-    <w:p>
-      <w:pPr>
-        <w:pStyle w:val="ListBullet"/>
-        <w:spacing w:after="80" w:line="276" w:lineRule="auto"/>
-        <w:ind w:left="360"/>
-      </w:pPr>
-      <w:r>
-        <w:t>checkCanCreate() &amp; checkCanEditOrDelete(): Membatasi hak akses CRUD aset agar tidak dapat diakses oleh Unit_RS, Staf_Logistik (hanya bisa create), serta teknisi budi_ipsrs, hendra_ipsrs, dan agus_ipsrs.</w:t>
-      </w:r>
-    </w:p>
-    <w:p>
-      <w:pPr>
-        <w:pStyle w:val="ListBullet"/>
-        <w:spacing w:after="80" w:line="276" w:lineRule="auto"/>
-        <w:ind w:left="360"/>
-      </w:pPr>
-      <w:r>
-        <w:t>store() &amp; update(): Melakukan validasi pengisian data aset medis dan meng-generate file gambar QR Code secara dinamis.</w:t>
-      </w:r>
-    </w:p>
-    <w:p>
-      <w:pPr>
-        <w:spacing w:after="120" w:line="276" w:lineRule="auto"/>
       </w:pPr>
       <w:r>
         <w:rPr>
           <w:b/>
         </w:rPr>
-        <w:t xml:space="preserve">WorkOrderController.php: </w:t>
+        <w:t>• resources/js/Pages/:</w:t>
       </w:r>
       <w:r>
-        <w:t xml:space="preserve"> - Menangani alur pelaporan kerusakan alat medis.</w:t>
+        <w:t xml:space="preserve"> Halaman antarmuka pengguna (Views). Setiap berkas disini (seperti Dashboard.jsx, Aset/Index.jsx, WorkOrder/Index.jsx, Mutasi/Index.jsx, Direktori/Index.jsx, Dokumen/Index.jsx) adalah komponen React utuh yang merender UI halaman web secara dinamis.</w:t>
       </w:r>
     </w:p>
     <w:p>
@@ -513,43 +218,15 @@
         <w:pStyle w:val="ListBullet"/>
         <w:spacing w:after="80" w:line="276" w:lineRule="auto"/>
         <w:ind w:left="360"/>
-      </w:pPr>
-      <w:r>
-        <w:t>store(): Menyimpan tiket kerusakan baru dari Unit_RS dengan status default 'Open'.</w:t>
-      </w:r>
-    </w:p>
-    <w:p>
-      <w:pPr>
-        <w:pStyle w:val="ListBullet"/>
-        <w:spacing w:after="80" w:line="276" w:lineRule="auto"/>
-        <w:ind w:left="360"/>
-      </w:pPr>
-      <w:r>
-        <w:t>assignTeknisi(): Meng-assign teknisi penanggungjawab (budi_ipsrs, hendra_ipsrs, atau agus_ipsrs) ke dalam tiket. Diblokir jika diakses oleh teknisi lapangan itu sendiri.</w:t>
-      </w:r>
-    </w:p>
-    <w:p>
-      <w:pPr>
-        <w:pStyle w:val="ListBullet"/>
-        <w:spacing w:after="80" w:line="276" w:lineRule="auto"/>
-        <w:ind w:left="360"/>
-      </w:pPr>
-      <w:r>
-        <w:t>updateStatus(): Mengubah status progres perbaikan alat (Open -&gt; Pengecekan -&gt; Dikerjakan -&gt; Menunggu Sign-Off) oleh teknisi penanggungjawab.</w:t>
-      </w:r>
-    </w:p>
-    <w:p>
-      <w:pPr>
-        <w:spacing w:after="120" w:line="276" w:lineRule="auto"/>
       </w:pPr>
       <w:r>
         <w:rPr>
           <w:b/>
         </w:rPr>
-        <w:t xml:space="preserve">MutasiController.php: </w:t>
+        <w:t>• resources/js/Layouts/AuthenticatedLayout.jsx:</w:t>
       </w:r>
       <w:r>
-        <w:t xml:space="preserve"> - Mengelola alur pemindahan/mutasi alat medis antar ruangan.</w:t>
+        <w:t xml:space="preserve"> Kerangka halaman utama (Sidebar, Topbar/Header, Profil Info, Lonceng Notifikasi Dinamis, Kamera Web Scanner QR Code) yang membungkus semua halaman setelah pengguna berhasil login. Menghindari penulisan sidebar berulang di setiap file Page.</w:t>
       </w:r>
     </w:p>
     <w:p>
@@ -557,43 +234,30 @@
         <w:pStyle w:val="ListBullet"/>
         <w:spacing w:after="80" w:line="276" w:lineRule="auto"/>
         <w:ind w:left="360"/>
-      </w:pPr>
-      <w:r>
-        <w:t>store(): Mengajukan pemindahan alat medis dengan status 'Menunggu_Verifikasi'.</w:t>
-      </w:r>
-    </w:p>
-    <w:p>
-      <w:pPr>
-        <w:pStyle w:val="ListBullet"/>
-        <w:spacing w:after="80" w:line="276" w:lineRule="auto"/>
-        <w:ind w:left="360"/>
-      </w:pPr>
-      <w:r>
-        <w:t>verify(): Logika verifikasi persetujuan (Approve/Reject) mutasi oleh IPSRS yang menggunakan DB::transaction() untuk memperbarui kolom id_ruang_saat_ini pada aset sekaligus mencatat log mutasi.</w:t>
-      </w:r>
-    </w:p>
-    <w:p>
-      <w:pPr>
-        <w:spacing w:after="120" w:line="276" w:lineRule="auto"/>
       </w:pPr>
       <w:r>
         <w:rPr>
           <w:b/>
         </w:rPr>
-        <w:t xml:space="preserve">DirektoriController.php: </w:t>
+        <w:t>• resources/js/app.jsx:</w:t>
       </w:r>
       <w:r>
-        <w:t xml:space="preserve"> - Mengelola master data ruangan rumah sakit dan direktori staff/SDM.</w:t>
+        <w:t xml:space="preserve"> Entri utama JavaScript. Di sini Inertia dikonfigurasi untuk memuat komponen React dari folder Pages secara dinamis.</w:t>
       </w:r>
     </w:p>
     <w:p>
       <w:pPr>
-        <w:pStyle w:val="ListBullet"/>
-        <w:spacing w:after="80" w:line="276" w:lineRule="auto"/>
-        <w:ind w:left="360"/>
+        <w:pStyle w:val="Heading1"/>
+        <w:keepNext/>
+        <w:spacing w:before="360" w:after="160"/>
       </w:pPr>
       <w:r>
-        <w:t>checkAccess(): Memproteksi CRUD ruangan dan profil staff agar menolak role Unit_RS, Staf_Logistik, dan teknisi lapangan (Budi/Hendra/Agus).</w:t>
+        <w:rPr>
+          <w:b/>
+          <w:color w:val="1F4E79"/>
+          <w:sz w:val="28"/>
+        </w:rPr>
+        <w:t>BAB II: ALUR DATA DAN REQUEST-RESPONSE LIFECYCLE (BAGAIMANA APLIKASI BEKERJA)</w:t>
       </w:r>
     </w:p>
     <w:p>
@@ -605,213 +269,10 @@
       <w:r>
         <w:rPr>
           <w:b/>
-          <w:color w:val="1A5685"/>
+          <w:color w:val="2E75B5"/>
           <w:sz w:val="24"/>
         </w:rPr>
-        <w:t>3. API Controllers (app/Http/Controllers/Api/)</w:t>
-      </w:r>
-    </w:p>
-    <w:p>
-      <w:pPr>
-        <w:spacing w:after="120" w:line="276" w:lineRule="auto"/>
-      </w:pPr>
-      <w:r>
-        <w:rPr>
-          <w:b/>
-        </w:rPr>
-        <w:t xml:space="preserve">ApiAuthController.php: </w:t>
-      </w:r>
-      <w:r>
-        <w:t xml:space="preserve"> - Melayani proses autentikasi (login/logout) aplikasi mobile tracker Android Kotlin dan menghasilkan string plainTextToken Sanctum.</w:t>
-      </w:r>
-    </w:p>
-    <w:p>
-      <w:pPr>
-        <w:spacing w:after="120" w:line="276" w:lineRule="auto"/>
-      </w:pPr>
-      <w:r>
-        <w:rPr>
-          <w:b/>
-        </w:rPr>
-        <w:t xml:space="preserve">ApiAsetController.php: </w:t>
-      </w:r>
-      <w:r>
-        <w:t xml:space="preserve"> - Melayani kueri data inventaris aset dan menerima update data posisi koordinat GPS tracker dari aplikasi Android untuk disimpan ke tabel t_aset.</w:t>
-      </w:r>
-    </w:p>
-    <w:p>
-      <w:pPr>
-        <w:pStyle w:val="Heading2"/>
-        <w:keepNext/>
-        <w:spacing w:before="240" w:after="120"/>
-      </w:pPr>
-      <w:r>
-        <w:rPr>
-          <w:b/>
-          <w:color w:val="1A5685"/>
-          <w:sz w:val="24"/>
-        </w:rPr>
-        <w:t>4. Halaman React Pages (resources/js/Pages/)</w:t>
-      </w:r>
-    </w:p>
-    <w:p>
-      <w:pPr>
-        <w:pStyle w:val="ListBullet"/>
-        <w:spacing w:after="80" w:line="276" w:lineRule="auto"/>
-        <w:ind w:left="360"/>
-      </w:pPr>
-      <w:r>
-        <w:t>Dashboard.jsx - Dashboard visual ringkasan data statistik card counter, list notifikasi lonceng terbaru, chart grafik tingkat kerusakan alat, dan widget kalender harian agenda pemeliharaan.</w:t>
-      </w:r>
-    </w:p>
-    <w:p>
-      <w:pPr>
-        <w:pStyle w:val="ListBullet"/>
-        <w:spacing w:after="80" w:line="276" w:lineRule="auto"/>
-        <w:ind w:left="360"/>
-      </w:pPr>
-      <w:r>
-        <w:t>Aset/Index.jsx - Katalog data inventaris aset medis lengkap dengan kartu informasi, filter pencarian, list kartu, tombol tambah/edit/hapus (sesuai otorisasi), dan integrasi scan QR Code.</w:t>
-      </w:r>
-    </w:p>
-    <w:p>
-      <w:pPr>
-        <w:pStyle w:val="ListBullet"/>
-        <w:spacing w:after="80" w:line="276" w:lineRule="auto"/>
-        <w:ind w:left="360"/>
-      </w:pPr>
-      <w:r>
-        <w:t>Aset/Create.jsx &amp; Aset/Edit.jsx - Form pembuatan dan pengubahan data aset medis, lengkap dengan penanganan upload file gambar foto alat medis.</w:t>
-      </w:r>
-    </w:p>
-    <w:p>
-      <w:pPr>
-        <w:pStyle w:val="ListBullet"/>
-        <w:spacing w:after="80" w:line="276" w:lineRule="auto"/>
-        <w:ind w:left="360"/>
-      </w:pPr>
-      <w:r>
-        <w:t>Aset/Detail.jsx - Menampilkan detail spesifikasi teknis aset medis secara lengkap serta visualisasi peta pelacakan posisi GPS real-time.</w:t>
-      </w:r>
-    </w:p>
-    <w:p>
-      <w:pPr>
-        <w:pStyle w:val="ListBullet"/>
-        <w:spacing w:after="80" w:line="276" w:lineRule="auto"/>
-        <w:ind w:left="360"/>
-      </w:pPr>
-      <w:r>
-        <w:t>WorkOrder/Index.jsx - Tiket pelaporan kerusakan, dilengkapi dropdown inline untuk mengubah status perbaikan (bagi teknisi) dan assign teknisi (bagi admin).</w:t>
-      </w:r>
-    </w:p>
-    <w:p>
-      <w:pPr>
-        <w:pStyle w:val="ListBullet"/>
-        <w:spacing w:after="80" w:line="276" w:lineRule="auto"/>
-        <w:ind w:left="360"/>
-      </w:pPr>
-      <w:r>
-        <w:t>WorkOrder/Create.jsx - Form pelaporan kerusakan alat medis oleh Unit_RS, lengkap dengan upload foto bukti kerusakan.</w:t>
-      </w:r>
-    </w:p>
-    <w:p>
-      <w:pPr>
-        <w:pStyle w:val="ListBullet"/>
-        <w:spacing w:after="80" w:line="276" w:lineRule="auto"/>
-        <w:ind w:left="360"/>
-      </w:pPr>
-      <w:r>
-        <w:t>Mutasi/Index.jsx - Daftar riwayat mutasi alat dilengkapi pill badge status verifikasi (Pending, Approved, Rejected).</w:t>
-      </w:r>
-    </w:p>
-    <w:p>
-      <w:pPr>
-        <w:pStyle w:val="ListBullet"/>
-        <w:spacing w:after="80" w:line="276" w:lineRule="auto"/>
-        <w:ind w:left="360"/>
-      </w:pPr>
-      <w:r>
-        <w:t>Mutasi/Create.jsx - Form pengajuan mutasi/pemindahan aset medis keluar ruangan oleh Unit_RS.</w:t>
-      </w:r>
-    </w:p>
-    <w:p>
-      <w:pPr>
-        <w:pStyle w:val="ListBullet"/>
-        <w:spacing w:after="80" w:line="276" w:lineRule="auto"/>
-        <w:ind w:left="360"/>
-      </w:pPr>
-      <w:r>
-        <w:t>Maintenance/Index.jsx - Kalender pemeliharaan berkala untuk menjadwalkan agenda pemeliharaan preventif.</w:t>
-      </w:r>
-    </w:p>
-    <w:p>
-      <w:pPr>
-        <w:pStyle w:val="ListBullet"/>
-        <w:spacing w:after="80" w:line="276" w:lineRule="auto"/>
-        <w:ind w:left="360"/>
-      </w:pPr>
-      <w:r>
-        <w:t>Dokumen/Index.jsx - Manajemen berkas dokumen mutu laporan bulanan IPSRS.</w:t>
-      </w:r>
-    </w:p>
-    <w:p>
-      <w:pPr>
-        <w:pStyle w:val="ListBullet"/>
-        <w:spacing w:after="80" w:line="276" w:lineRule="auto"/>
-        <w:ind w:left="360"/>
-      </w:pPr>
-      <w:r>
-        <w:t>Direktori/Index.jsx - Grid data ruangan dan direktori staff rumah sakit.</w:t>
-      </w:r>
-    </w:p>
-    <w:p>
-      <w:pPr>
-        <w:pStyle w:val="ListBullet"/>
-        <w:spacing w:after="80" w:line="276" w:lineRule="auto"/>
-        <w:ind w:left="360"/>
-      </w:pPr>
-      <w:r>
-        <w:t>Tracking/Map.jsx - Visualisasi peta real-time posisi koordinat GPS seluruh aset rumah sakit secara global.</w:t>
-      </w:r>
-    </w:p>
-    <w:p>
-      <w:pPr>
-        <w:pStyle w:val="ListBullet"/>
-        <w:spacing w:after="80" w:line="276" w:lineRule="auto"/>
-        <w:ind w:left="360"/>
-      </w:pPr>
-      <w:r>
-        <w:t>Layouts/AuthenticatedLayout.jsx - Layout utama pembungkus halaman. Di sini diletakkan menu navigasi sidebar, bell notifikasi dengan filter role, dan modal kamera scanner QR.</w:t>
-      </w:r>
-    </w:p>
-    <w:p>
-      <w:pPr>
-        <w:pStyle w:val="Heading1"/>
-        <w:keepNext/>
-        <w:spacing w:before="360" w:after="160"/>
-      </w:pPr>
-      <w:r>
-        <w:rPr>
-          <w:b/>
-          <w:color w:val="0A3A60"/>
-          <w:sz w:val="28"/>
-        </w:rPr>
-        <w:t>BAB III: ALUR DATA DAN REQUEST-RESPONSE LIFECYCLE (BAGAIMANA APLIKASI BEKERJA)</w:t>
-      </w:r>
-    </w:p>
-    <w:p>
-      <w:pPr>
-        <w:pStyle w:val="Heading2"/>
-        <w:keepNext/>
-        <w:spacing w:before="240" w:after="120"/>
-      </w:pPr>
-      <w:r>
-        <w:rPr>
-          <w:b/>
-          <w:color w:val="1A5685"/>
-          <w:sz w:val="24"/>
-        </w:rPr>
-        <w:t>Siklus Request Web (Menggunakan Protokol Inertia.js)</w:t>
+        <w:t>2.1 Siklus Request Web (Menggunakan Protokol Inertia.js)</w:t>
       </w:r>
     </w:p>
     <w:p>
@@ -859,7 +320,7 @@
         <w:ind w:left="360"/>
       </w:pPr>
       <w:r>
-        <w:t>AsetController melakukan query database melalui Eloquent: Aset::with('ruangan')-&gt;get().</w:t>
+        <w:t>AsetController melakukan query database melalui Eloquent: Aset::with('ruangan')-&gt;get() untuk memuat aset medis beserta nama ruangan tempat alat itu ditempatkan.</w:t>
       </w:r>
     </w:p>
     <w:p>
@@ -901,10 +362,10 @@
       <w:r>
         <w:rPr>
           <w:b/>
-          <w:color w:val="1A5685"/>
+          <w:color w:val="2E75B5"/>
           <w:sz w:val="24"/>
         </w:rPr>
-        <w:t>Siklus Request API Mobile (Laravel Sanctum)</w:t>
+        <w:t>2.2 Siklus Request API Mobile (Laravel Sanctum)</w:t>
       </w:r>
     </w:p>
     <w:p>
@@ -912,7 +373,7 @@
         <w:spacing w:after="120" w:line="276" w:lineRule="auto"/>
       </w:pPr>
       <w:r>
-        <w:t>Alur kerja ketika aplikasi Android pelacak lokasi mengirim data ke server:</w:t>
+        <w:t>Alur kerja ketika aplikasi Android pelacak lokasi meminta daftar barang atau mengirimkan koordinat GPS ke server:</w:t>
       </w:r>
     </w:p>
     <w:p>
@@ -962,7 +423,7 @@
         <w:ind w:left="360"/>
       </w:pPr>
       <w:r>
-        <w:t>Jika valid, request diteruskan ke Api\AsetController@updateTracking yang menyimpan koordinat GPS terbaru ke database.</w:t>
+        <w:t>Jika valid, request diteruskan ke Api\ApiAsetController@updateTracking yang mengambil data koordinat GPS terbaru dan menyimpannya ke tabel t_aset.</w:t>
       </w:r>
     </w:p>
     <w:p>
@@ -974,10 +435,10 @@
       <w:r>
         <w:rPr>
           <w:b/>
-          <w:color w:val="0A3A60"/>
+          <w:color w:val="1F4E79"/>
           <w:sz w:val="28"/>
         </w:rPr>
-        <w:t>BAB IV: BEDAH LOGIKA DAN KODE CRITICAL (PERTANYAAN KHUSUS DOSEN)</w:t>
+        <w:t>BAB III: BEDAH LOGIKA DAN KODE CRITICAL (PERTANYAAN KHUSUS DOSEN)</w:t>
       </w:r>
     </w:p>
     <w:p>
@@ -989,10 +450,10 @@
       <w:r>
         <w:rPr>
           <w:b/>
-          <w:color w:val="1A5685"/>
+          <w:color w:val="2E75B5"/>
           <w:sz w:val="24"/>
         </w:rPr>
-        <w:t>Logika Mutasi Aset &amp; Keamanan Database Transactions</w:t>
+        <w:t>3.1 Logika Mutasi Aset &amp; Keamanan Database Transactions</w:t>
       </w:r>
     </w:p>
     <w:p>
@@ -1000,7 +461,7 @@
         <w:spacing w:after="120" w:line="276" w:lineRule="auto"/>
       </w:pPr>
       <w:r>
-        <w:t>Fokus Pembahasan: Pertanyaan Dosen: 'Bagaimana logika mutasi alat medis dan bagaimana Anda menjamin konsistensi?'</w:t>
+        <w:t>Fokus Pembahasan: Pertanyaan Dosen: 'Bagaimana logika mutasi alat medis dan bagaimana Anda menjamin konsistensi lokasi?'</w:t>
       </w:r>
     </w:p>
     <w:p>
@@ -1008,7 +469,7 @@
         <w:spacing w:after="120" w:line="276" w:lineRule="auto"/>
       </w:pPr>
       <w:r>
-        <w:t>Di dalam file MutasiController.php, transaksi dilakukan di dalam blok DB::transaction(). Hal ini penting untuk memastikan sifat Atomicity (semua berhasil atau tidak sama sekali):</w:t>
+        <w:t>Di dalam file MutasiController.php, transaksi dilakukan di dalam blok DB::transaction(). Hal ini penting untuk memastikan sifat Atomicity (semua berhasil atau tidak sama sekali). Logikanya:</w:t>
       </w:r>
     </w:p>
     <w:p>
@@ -1018,7 +479,7 @@
         <w:ind w:left="360"/>
       </w:pPr>
       <w:r>
-        <w:t>Sistem memverifikasi status aset dan ruangan tujuan.</w:t>
+        <w:t>Validasi input: memastikan aset yang akan dimutasi saat ini memiliki data asal unit ruangan yang terdaftar di database.</w:t>
       </w:r>
     </w:p>
     <w:p>
@@ -1038,7 +499,7 @@
         <w:ind w:left="360"/>
       </w:pPr>
       <w:r>
-        <w:t>Sistem memperbarui kolom id_ruang_saat_ini pada tabel t_aset.</w:t>
+        <w:t>Sistem memperbarui kolom id_ruang_saat_ini pada tabel t_aset menjadi ID ruangan tujuan mutasi.</w:t>
       </w:r>
     </w:p>
     <w:p>
@@ -1048,7 +509,7 @@
         <w:ind w:left="360"/>
       </w:pPr>
       <w:r>
-        <w:t>Sistem mencatat riwayat log mutasi ke tabel t_mutasi.</w:t>
+        <w:t>Sistem mencatat log riwayat pemindahan ke dalam tabel t_mutasi.</w:t>
       </w:r>
     </w:p>
     <w:p>
@@ -1058,7 +519,7 @@
         <w:ind w:left="360"/>
       </w:pPr>
       <w:r>
-        <w:t>Jika terjadi error di tengah proses (misalnya koneksi putus saat menyimpan log mutasi), Laravel otomatis membatalkan pembaruan ruangan pada aset (Rollback) agar data tetap konsisten.</w:t>
+        <w:t>Jika terjadi error di tengah proses (misalnya database down saat mencatat log mutasi), Laravel otomatis membatalkan pembaruan ruangan pada aset (Rollback) agar lokasi aset tidak bergeser secara tidak konsisten.</w:t>
       </w:r>
     </w:p>
     <w:p>
@@ -1070,10 +531,10 @@
       <w:r>
         <w:rPr>
           <w:b/>
-          <w:color w:val="1A5685"/>
+          <w:color w:val="2E75B5"/>
           <w:sz w:val="24"/>
         </w:rPr>
-        <w:t>Logika Work Order (Alur Pelaporan Kerusakan)</w:t>
+        <w:t>3.2 Logika Pelaporan Kerusakan &amp; Penugasan Teknisi (Work Order)</w:t>
       </w:r>
     </w:p>
     <w:p>
@@ -1081,17 +542,25 @@
         <w:spacing w:after="120" w:line="276" w:lineRule="auto"/>
       </w:pPr>
       <w:r>
-        <w:t>Fokus Pembahasan: Pertanyaan Dosen: 'Bagaimana alur pelaporan kerusakan dan penugasan teknisi?'</w:t>
+        <w:t>Fokus Pembahasan: Pertanyaan Dosen: 'Bagaimana alur pelaporan kerusakan alat medis dan penugasan teknisi?'</w:t>
       </w:r>
     </w:p>
     <w:p>
       <w:pPr>
+        <w:spacing w:after="120" w:line="276" w:lineRule="auto"/>
+      </w:pPr>
+      <w:r>
+        <w:t>Tiket troubleshoot/kerusakan dikelola melalui tabel t_troubleshoot. Kolom penting di sini adalah status (status_ticket dengan opsi Open, Pengecekan, Dikerjakan, Menunggu Sign-Off, Closed), id_user_pelapor, dan id_teknisi_penanggungjawab.</w:t>
+      </w:r>
+    </w:p>
+    <w:p>
+      <w:pPr>
         <w:pStyle w:val="ListBullet"/>
         <w:spacing w:after="80" w:line="276" w:lineRule="auto"/>
         <w:ind w:left="360"/>
       </w:pPr>
       <w:r>
-        <w:t>Pengguna dengan peran 'Unit_RS' mengirimkan laporan kerusakan alat dari unitnya. Status awal diset default ke 'Open'.</w:t>
+        <w:t>Pengguna dengan peran 'Unit_RS' mengirim form laporan kerusakan alat dari unitnya. Status awal diset default ke 'Open'.</w:t>
       </w:r>
     </w:p>
     <w:p>
@@ -1101,7 +570,7 @@
         <w:ind w:left="360"/>
       </w:pPr>
       <w:r>
-        <w:t>Pengguna dengan peran 'Admin_IPSRS' masuk ke menu Work Order, melihat tiket 'Open' tersebut, lalu menunjuk teknisi penanggungjawab.</w:t>
+        <w:t>Pengguna dengan peran 'Admin_IPSRS' masuk ke menu Work Order, melihat tiket 'Open' tersebut, lalu menugaskan teknisi penanggungjawab dengan memilih dari daftar user yang memiliki kompetensi teknis.</w:t>
       </w:r>
     </w:p>
     <w:p>
@@ -1111,7 +580,7 @@
         <w:ind w:left="360"/>
       </w:pPr>
       <w:r>
-        <w:t>Teknisi lapangan (Budi, Hendra, Agus) masuk dengan akun mereka. Mereka hanya bisa melihat daftar tugas mereka dan memperbarui progres status (Open -&gt; Dikerjakan -&gt; Menunggu Sign-Off).</w:t>
+        <w:t>Teknisi lapangan (seperti Budi, Hendra, Agus) masuk ke sistem. Mereka hanya melihat tiket pengerjaan yang ditugaskan kepada mereka dan dapat memperbarui status pengerjaan secara bertahap (misal dari Open ke Dikerjakan).</w:t>
       </w:r>
     </w:p>
     <w:p>
@@ -1121,7 +590,7 @@
         <w:ind w:left="360"/>
       </w:pPr>
       <w:r>
-        <w:t>Setelah selesai, status diset menjadi 'Closed' setelah divalidasi.</w:t>
+        <w:t>Setelah selesai dikerjakan, status tiket diperbarui menjadi 'Menunggu Sign-Off' untuk divalidasi oleh admin atau unit sebelum tiket ditutup secara permanen ('Closed').</w:t>
       </w:r>
     </w:p>
     <w:p>
@@ -1133,10 +602,10 @@
       <w:r>
         <w:rPr>
           <w:b/>
-          <w:color w:val="1A5685"/>
+          <w:color w:val="2E75B5"/>
           <w:sz w:val="24"/>
         </w:rPr>
-        <w:t>Pengelolaan Laporan Cetak PDF (Print-Friendly CSS)</w:t>
+        <w:t>3.3 Pengelolaan Laporan Cetak PDF (Print-Friendly CSS)</w:t>
       </w:r>
     </w:p>
     <w:p>
@@ -1152,7 +621,7 @@
         <w:spacing w:after="120" w:line="276" w:lineRule="auto"/>
       </w:pPr>
       <w:r>
-        <w:t>Di halaman resources/js/Pages/Aset/Index.jsx, tombol 'Cetak' memicu window.print(). Kita menggunakan utility class Tailwind CSS khusus cetak:</w:t>
+        <w:t>Di halaman resources/js/Pages/Aset/Index.jsx, tombol 'Cetak Laporan' memicu fungsi window.print(). Untuk menghasilkan PDF yang rapi tanpa elemen navigasi web, kita menggunakan utility class Tailwind CSS khusus cetak:</w:t>
       </w:r>
     </w:p>
     <w:p>
@@ -1162,7 +631,7 @@
         <w:ind w:left="360"/>
       </w:pPr>
       <w:r>
-        <w:t>print:hidden -&gt; Menyembunyikan sidebar, topbar, dan tombol aksi cetak saat proses print PDF berlangsung.</w:t>
+        <w:t>print:hidden -&gt; Menyembunyikan sidebar, topbar, dan tombol cetak saat proses print PDF berlangsung.</w:t>
       </w:r>
     </w:p>
     <w:p>
@@ -1172,7 +641,7 @@
         <w:ind w:left="360"/>
       </w:pPr>
       <w:r>
-        <w:t>print:block -&gt; Memunculkan Kop Laporan resmi yang disembunyikan di layar monitor biasa.</w:t>
+        <w:t>print:block -&gt; Memunculkan Kop Laporan resmi yang disembunyikan di layar monitor.</w:t>
       </w:r>
     </w:p>
     <w:p>
@@ -1182,11 +651,21 @@
         <w:ind w:left="360"/>
       </w:pPr>
       <w:r>
-        <w:t>print:shadow-none &amp; print:border-none -&gt; Menghilangkan bayangan dan border dekoratif agar hasil cetak PDF bersih.</w:t>
+        <w:t>print:shadow-none &amp; print:border-none -&gt; Menghilangkan bayangan dan border dekoratif agar PDF bersih layaknya dokumen kertas resmi.</w:t>
       </w:r>
     </w:p>
     <w:p>
       <w:pPr>
+        <w:pStyle w:val="ListBullet"/>
+        <w:spacing w:after="80" w:line="276" w:lineRule="auto"/>
+        <w:ind w:left="360"/>
+      </w:pPr>
+      <w:r>
+        <w:t>print:text-black &amp; print:divide-slate-350 -&gt; Mengubah teks menjadi hitam pekat agar hasil cetakan jelas dibaca.</w:t>
+      </w:r>
+    </w:p>
+    <w:p>
+      <w:pPr>
         <w:pStyle w:val="Heading1"/>
         <w:keepNext/>
         <w:spacing w:before="360" w:after="160"/>
@@ -1194,7 +673,333 @@
       <w:r>
         <w:rPr>
           <w:b/>
-          <w:color w:val="0A3A60"/>
+          <w:color w:val="1F4E79"/>
+          <w:sz w:val="28"/>
+        </w:rPr>
+        <w:t>BAB IV: BEDAH DETAIL FILE KODE PROGRAM (FUNGSI DAN PENJELASAN KODE)</w:t>
+      </w:r>
+    </w:p>
+    <w:p>
+      <w:pPr>
+        <w:pStyle w:val="Heading2"/>
+        <w:keepNext/>
+        <w:spacing w:before="240" w:after="120"/>
+      </w:pPr>
+      <w:r>
+        <w:rPr>
+          <w:b/>
+          <w:color w:val="2E75B5"/>
+          <w:sz w:val="24"/>
+        </w:rPr>
+        <w:t>4.1 File Migrasi Database</w:t>
+      </w:r>
+    </w:p>
+    <w:p>
+      <w:pPr>
+        <w:spacing w:after="120" w:line="276" w:lineRule="auto"/>
+      </w:pPr>
+      <w:r>
+        <w:t>Berkas ini berfungsi untuk mendefinisikan skema tabel database MySQL. Di dalamnya terdapat fungsi up() yang dijalankan saat php artisan migrate dipanggil. Dosen akan menyorot relasi foreign key di sini:</w:t>
+      </w:r>
+    </w:p>
+    <w:p>
+      <w:pPr>
+        <w:pStyle w:val="ListBullet"/>
+        <w:spacing w:after="80" w:line="276" w:lineRule="auto"/>
+        <w:ind w:left="360"/>
+      </w:pPr>
+      <w:r>
+        <w:t>Tabel m_ruangan: Dibuat dengan id_ruang sebagai primary key dan nama_ruang ber-constraint unique() agar tidak ada ruangan ganda.</w:t>
+      </w:r>
+    </w:p>
+    <w:p>
+      <w:pPr>
+        <w:pStyle w:val="ListBullet"/>
+        <w:spacing w:after="80" w:line="276" w:lineRule="auto"/>
+        <w:ind w:left="360"/>
+      </w:pPr>
+      <w:r>
+        <w:t>Tabel t_aset: Memiliki kolom id_ruang_saat_ini yang dihubungkan sebagai foreign key menggunakan constrained('m_ruangan')-&gt;nullOnDelete(). Artinya, jika sebuah ruangan dihapus, kolom lokasi aset diisi NULL tanpa menghapus data aset.</w:t>
+      </w:r>
+    </w:p>
+    <w:p>
+      <w:pPr>
+        <w:pStyle w:val="ListBullet"/>
+        <w:spacing w:after="80" w:line="276" w:lineRule="auto"/>
+        <w:ind w:left="360"/>
+      </w:pPr>
+      <w:r>
+        <w:t>Tabel t_mutasi: Melacak log perpindahan aset (id_aset, id_ruang_asal, id_ruang_tujuan).</w:t>
+      </w:r>
+    </w:p>
+    <w:p>
+      <w:pPr>
+        <w:pStyle w:val="ListBullet"/>
+        <w:spacing w:after="80" w:line="276" w:lineRule="auto"/>
+        <w:ind w:left="360"/>
+      </w:pPr>
+      <w:r>
+        <w:t>Tabel t_troubleshoot: Melacak tiket kerusakan (id_aset, id_user_pelapor, id_teknisi_penanggungjawab, status_ticket).</w:t>
+      </w:r>
+    </w:p>
+    <w:p>
+      <w:pPr>
+        <w:pStyle w:val="Heading2"/>
+        <w:keepNext/>
+        <w:spacing w:before="240" w:after="120"/>
+      </w:pPr>
+      <w:r>
+        <w:rPr>
+          <w:b/>
+          <w:color w:val="2E75B5"/>
+          <w:sz w:val="24"/>
+        </w:rPr>
+        <w:t>4.2 File Model (app/Models/Aset.php)</w:t>
+      </w:r>
+    </w:p>
+    <w:p>
+      <w:pPr>
+        <w:spacing w:after="120" w:line="276" w:lineRule="auto"/>
+      </w:pPr>
+      <w:r>
+        <w:t>Model Eloquent bertindak sebagai perwakilan tabel database di pemrograman PHP berbasis objek. Di dalamnya, relasi didefinisikan secara eksplisit untuk mempermudah query data:</w:t>
+      </w:r>
+    </w:p>
+    <w:p>
+      <w:pPr>
+        <w:pStyle w:val="ListBullet"/>
+        <w:spacing w:after="80" w:line="276" w:lineRule="auto"/>
+        <w:ind w:left="360"/>
+      </w:pPr>
+      <w:r>
+        <w:t>protected $fillable: Daftar kolom yang diizinkan untuk diisi secara massal (mass assignment) saat proses insert/update data di controller.</w:t>
+      </w:r>
+    </w:p>
+    <w:p>
+      <w:pPr>
+        <w:pStyle w:val="ListBullet"/>
+        <w:spacing w:after="80" w:line="276" w:lineRule="auto"/>
+        <w:ind w:left="360"/>
+      </w:pPr>
+      <w:r>
+        <w:t>public function ruangan(): Mendefinisikan relasi belongsTo(Ruangan::class, 'id_ruang_saat_ini'). Relasi ini memberitahu Laravel bahwa satu aset berada di satu ruangan (One-to-One/Many-to-One).</w:t>
+      </w:r>
+    </w:p>
+    <w:p>
+      <w:pPr>
+        <w:pStyle w:val="ListBullet"/>
+        <w:spacing w:after="80" w:line="276" w:lineRule="auto"/>
+        <w:ind w:left="360"/>
+      </w:pPr>
+      <w:r>
+        <w:t>public function troubleshoot(): Mendefinisikan relasi hasMany(Troubleshoot::class, 'id_aset'). Berarti satu aset bisa memiliki banyak catatan riwayat kerusakan/Work Order (One-to-Many).</w:t>
+      </w:r>
+    </w:p>
+    <w:p>
+      <w:pPr>
+        <w:pStyle w:val="Heading2"/>
+        <w:keepNext/>
+        <w:spacing w:before="240" w:after="120"/>
+      </w:pPr>
+      <w:r>
+        <w:rPr>
+          <w:b/>
+          <w:color w:val="2E75B5"/>
+          <w:sz w:val="24"/>
+        </w:rPr>
+        <w:t>4.3 File Controller Aset (app/Http/Controllers/Web/AsetController.php)</w:t>
+      </w:r>
+    </w:p>
+    <w:p>
+      <w:pPr>
+        <w:spacing w:after="120" w:line="276" w:lineRule="auto"/>
+      </w:pPr>
+      <w:r>
+        <w:t>Controller ini melayani rute halaman Aset web. Dosen biasanya menanyakan bagaimana validasi peran dan query databasenya bekerja di sini:</w:t>
+      </w:r>
+    </w:p>
+    <w:p>
+      <w:pPr>
+        <w:pStyle w:val="ListBullet"/>
+        <w:spacing w:after="80" w:line="276" w:lineRule="auto"/>
+        <w:ind w:left="360"/>
+      </w:pPr>
+      <w:r>
+        <w:t>Proteksi Peran (Role Checking): Di awal metode CRUD, terdapat pengecekan menggunakan helper checkCanCreate dan checkCanEditOrDelete untuk membatasi Unit_RS, Staf_Logistik (hanya diizinkan tambah/create, dilarang edit/hapus), serta teknisi budi_ipsrs, hendra_ipsrs, dan agus_ipsrs agar tidak bisa memanipulasi data aset master.</w:t>
+      </w:r>
+    </w:p>
+    <w:p>
+      <w:pPr>
+        <w:pStyle w:val="ListBullet"/>
+        <w:spacing w:after="80" w:line="276" w:lineRule="auto"/>
+        <w:ind w:left="360"/>
+      </w:pPr>
+      <w:r>
+        <w:t>Eager Loading (with): Mengambil data aset menggunakan Aset::with('ruangan')-&gt;get(). Penggunaan 'with' bertujuan mengoptimalkan database dengan teknik Eager Loading untuk mencegah masalah N+1 Query.</w:t>
+      </w:r>
+    </w:p>
+    <w:p>
+      <w:pPr>
+        <w:pStyle w:val="ListBullet"/>
+        <w:spacing w:after="80" w:line="276" w:lineRule="auto"/>
+        <w:ind w:left="360"/>
+      </w:pPr>
+      <w:r>
+        <w:t>Inertia::render(): Mengirimkan data $asets ke frontend React Page Aset/Index.jsx.</w:t>
+      </w:r>
+    </w:p>
+    <w:p>
+      <w:pPr>
+        <w:pStyle w:val="Heading2"/>
+        <w:keepNext/>
+        <w:spacing w:before="240" w:after="120"/>
+      </w:pPr>
+      <w:r>
+        <w:rPr>
+          <w:b/>
+          <w:color w:val="2E75B5"/>
+          <w:sz w:val="24"/>
+        </w:rPr>
+        <w:t>4.4 File Controller Mutasi (app/Http/Controllers/Web/MutasiController.php)</w:t>
+      </w:r>
+    </w:p>
+    <w:p>
+      <w:pPr>
+        <w:spacing w:after="120" w:line="276" w:lineRule="auto"/>
+      </w:pPr>
+      <w:r>
+        <w:t>Menangani transaksi mutasi aset medis. Di dalamnya terdapat fungsi kritis DB::transaction() untuk mengubah kolom id_ruang_saat_ini di tabel t_aset dan membuat record baru di tabel t_mutasi secara transaksional.</w:t>
+      </w:r>
+    </w:p>
+    <w:p>
+      <w:pPr>
+        <w:pStyle w:val="Heading2"/>
+        <w:keepNext/>
+        <w:spacing w:before="240" w:after="120"/>
+      </w:pPr>
+      <w:r>
+        <w:rPr>
+          <w:b/>
+          <w:color w:val="2E75B5"/>
+          <w:sz w:val="24"/>
+        </w:rPr>
+        <w:t>4.5 File Controller Work Order (app/Http/Controllers/Web/WorkOrderController.php)</w:t>
+      </w:r>
+    </w:p>
+    <w:p>
+      <w:pPr>
+        <w:spacing w:after="120" w:line="276" w:lineRule="auto"/>
+      </w:pPr>
+      <w:r>
+        <w:t>Menangani pembuatan tiket laporan kerusakan oleh Unit_RS, penunjukan teknisi oleh Admin IPSRS, dan pembaruan status pengerjaan oleh teknisi lapangan.</w:t>
+      </w:r>
+    </w:p>
+    <w:p>
+      <w:pPr>
+        <w:pStyle w:val="Heading2"/>
+        <w:keepNext/>
+        <w:spacing w:before="240" w:after="120"/>
+      </w:pPr>
+      <w:r>
+        <w:rPr>
+          <w:b/>
+          <w:color w:val="2E75B5"/>
+          <w:sz w:val="24"/>
+        </w:rPr>
+        <w:t>4.6 File Page Aset (resources/js/Pages/Aset/Index.jsx)</w:t>
+      </w:r>
+    </w:p>
+    <w:p>
+      <w:pPr>
+        <w:spacing w:after="120" w:line="276" w:lineRule="auto"/>
+      </w:pPr>
+      <w:r>
+        <w:t>Komponen React utama untuk menampilkan katalog aset medis:</w:t>
+      </w:r>
+    </w:p>
+    <w:p>
+      <w:pPr>
+        <w:pStyle w:val="ListBullet"/>
+        <w:spacing w:after="80" w:line="276" w:lineRule="auto"/>
+        <w:ind w:left="360"/>
+      </w:pPr>
+      <w:r>
+        <w:t>Props (asets, ruangans): Menerima kiriman data array aset dan ruangan dari controller Laravel.</w:t>
+      </w:r>
+    </w:p>
+    <w:p>
+      <w:pPr>
+        <w:pStyle w:val="ListBullet"/>
+        <w:spacing w:after="80" w:line="276" w:lineRule="auto"/>
+        <w:ind w:left="360"/>
+      </w:pPr>
+      <w:r>
+        <w:t>Integrated QR Code Scanner: Webcam scanner terintegrasi yang memproses kode QR dan mengarahkan langsung ke halaman detail aset terkait secara instan.</w:t>
+      </w:r>
+    </w:p>
+    <w:p>
+      <w:pPr>
+        <w:pStyle w:val="Heading2"/>
+        <w:keepNext/>
+        <w:spacing w:before="240" w:after="120"/>
+      </w:pPr>
+      <w:r>
+        <w:rPr>
+          <w:b/>
+          <w:color w:val="2E75B5"/>
+          <w:sz w:val="24"/>
+        </w:rPr>
+        <w:t>4.7 File Layout (resources/js/Layouts/AuthenticatedLayout.jsx)</w:t>
+      </w:r>
+    </w:p>
+    <w:p>
+      <w:pPr>
+        <w:spacing w:after="120" w:line="276" w:lineRule="auto"/>
+      </w:pPr>
+      <w:r>
+        <w:t>Menyediakan kerangka tampilan konsisten (sidebar dan header). Semua halaman dibungkus di dalam layout ini:</w:t>
+      </w:r>
+    </w:p>
+    <w:p>
+      <w:pPr>
+        <w:pStyle w:val="ListBullet"/>
+        <w:spacing w:after="80" w:line="276" w:lineRule="auto"/>
+        <w:ind w:left="360"/>
+      </w:pPr>
+      <w:r>
+        <w:t>Fungsi Layout: Menyediakan kerangka tampilan konsisten (sidebar dan header). Semua halaman dibungkus di dalam layout ini.</w:t>
+      </w:r>
+    </w:p>
+    <w:p>
+      <w:pPr>
+        <w:pStyle w:val="ListBullet"/>
+        <w:spacing w:after="80" w:line="276" w:lineRule="auto"/>
+        <w:ind w:left="360"/>
+      </w:pPr>
+      <w:r>
+        <w:t>Lonceng Notifikasi Dinamis: Menampilkan notifikasi lonceng dinamis yang secara real-time diperoleh dari shared props notifications di HandleInertiaRequests.php berdasarkan role user yang aktif.</w:t>
+      </w:r>
+    </w:p>
+    <w:p>
+      <w:pPr>
+        <w:pStyle w:val="ListBullet"/>
+        <w:spacing w:after="80" w:line="276" w:lineRule="auto"/>
+        <w:ind w:left="360"/>
+      </w:pPr>
+      <w:r>
+        <w:t>Children Prop: Tag {children} bertindak sebagai placeholder dinamis di mana konten halaman aktif akan dirender di dalam kerangka layout.</w:t>
+      </w:r>
+    </w:p>
+    <w:p>
+      <w:pPr>
+        <w:pStyle w:val="Heading1"/>
+        <w:keepNext/>
+        <w:spacing w:before="360" w:after="160"/>
+      </w:pPr>
+      <w:r>
+        <w:rPr>
+          <w:b/>
+          <w:color w:val="1F4E79"/>
           <w:sz w:val="28"/>
         </w:rPr>
         <w:t>BAB V: PEMAHAMAN MENDALAM KONSEP TEKNOLOGI (LARAVEL, REACT, &amp; REST API)</w:t>
@@ -1202,6 +1007,14 @@
     </w:p>
     <w:p>
       <w:pPr>
+        <w:spacing w:after="120" w:line="276" w:lineRule="auto"/>
+      </w:pPr>
+      <w:r>
+        <w:t>Bab ini berisi materi pemahaman fundamental secara konseptual. Dosen penguji sering kali menanyakan teori dasar di balik teknologi yang digunakan untuk menguji pemahaman mendalam Anda.</w:t>
+      </w:r>
+    </w:p>
+    <w:p>
+      <w:pPr>
         <w:pStyle w:val="Heading2"/>
         <w:keepNext/>
         <w:spacing w:before="240" w:after="120"/>
@@ -1209,20 +1022,28 @@
       <w:r>
         <w:rPr>
           <w:b/>
-          <w:color w:val="1A5685"/>
+          <w:color w:val="2E75B5"/>
           <w:sz w:val="24"/>
         </w:rPr>
-        <w:t>Laravel: Framework Backend PHP Modern</w:t>
+        <w:t>5.1 Laravel: Framework Backend PHP Modern</w:t>
       </w:r>
     </w:p>
     <w:p>
       <w:pPr>
+        <w:spacing w:after="120" w:line="276" w:lineRule="auto"/>
+      </w:pPr>
+      <w:r>
+        <w:t>Laravel adalah framework PHP MVC (Model-View-Controller) yang dirancang untuk mempermudah pengembangan aplikasi web yang aman, terstruktur, dan mudah dirawat. Konsep penting yang harus dipahami:</w:t>
+      </w:r>
+    </w:p>
+    <w:p>
+      <w:pPr>
         <w:pStyle w:val="ListBullet"/>
         <w:spacing w:after="80" w:line="276" w:lineRule="auto"/>
         <w:ind w:left="360"/>
       </w:pPr>
       <w:r>
-        <w:t>Model-View-Controller (MVC): Pola arsitektur yang memisahkan data (Model), tampilan antarmuka (View/React), dan logika kontrol (Controller).</w:t>
+        <w:t>Model-View-Controller (MVC): Pola arsitektur yang memisahkan data (Model), tampilan antarmuka (View), dan logika kontrol (Controller). Dalam arsitektur hybrid kita, React bertindak sebagai View, Laravel Model sebagai Model, dan Laravel Controller sebagai Controller.</w:t>
       </w:r>
     </w:p>
     <w:p>
@@ -1232,7 +1053,7 @@
         <w:ind w:left="360"/>
       </w:pPr>
       <w:r>
-        <w:t>Eloquent ORM: Teknik pemrograman untuk memetakan tabel database ke objek PHP (misal Aset::all()).</w:t>
+        <w:t>Eloquent ORM (Object-Relational Mapping): Teknik pemrograman untuk memetakan tabel database ke dalam bentuk objek bahasa pemrograman PHP. Kita tidak menulis query SQL manual (seperti SELECT * FROM aset), melainkan menggunakan sintaks objek seperti Aset::all() atau Aset::find(1).</w:t>
       </w:r>
     </w:p>
     <w:p>
@@ -1242,7 +1063,7 @@
         <w:ind w:left="360"/>
       </w:pPr>
       <w:r>
-        <w:t>Middleware: Lapisan filter keamanan HTTP request (seperti memverifikasi login session atau token API).</w:t>
+        <w:t>Middleware: Lapisan filter keamanan yang memeriksa setiap request HTTP sebelum masuk ke Controller. Contoh: Middleware auth memastikan pengguna sudah login session, dan middleware auth:sanctum memeriksa validitas token API Android.</w:t>
       </w:r>
     </w:p>
     <w:p>
@@ -1252,7 +1073,7 @@
         <w:ind w:left="360"/>
       </w:pPr>
       <w:r>
-        <w:t>Database Transactions: Pengelompokan beberapa perintah query (commit dan rollback) untuk menjamin integritas data.</w:t>
+        <w:t>Database Transactions: Mekanisme pengelompokan beberapa perintah database (insert/update/delete) menjadi satu kesatuan (unit of work). Jika salah satu perintah gagal, semua perintah dibatalkan secara otomatis (rollback) menggunakan DB::rollBack(). Jika semuanya sukses, data disimpan permanen menggunakan DB::commit(). Ini menjaga integritas data.</w:t>
       </w:r>
     </w:p>
     <w:p>
@@ -1264,20 +1085,28 @@
       <w:r>
         <w:rPr>
           <w:b/>
-          <w:color w:val="1A5685"/>
+          <w:color w:val="2E75B5"/>
           <w:sz w:val="24"/>
         </w:rPr>
-        <w:t>React.js: Library Frontend Berbasis Komponen</w:t>
+        <w:t>5.2 React.js: Library Frontend Berbasis Komponen</w:t>
       </w:r>
     </w:p>
     <w:p>
       <w:pPr>
+        <w:spacing w:after="120" w:line="276" w:lineRule="auto"/>
+      </w:pPr>
+      <w:r>
+        <w:t>React.js adalah library JavaScript yang dikembangkan oleh Meta untuk membangun antarmuka pengguna (UI) yang dinamis, cepat, dan interaktif. Konsep penting yang harus dipahami:</w:t>
+      </w:r>
+    </w:p>
+    <w:p>
+      <w:pPr>
         <w:pStyle w:val="ListBullet"/>
         <w:spacing w:after="80" w:line="276" w:lineRule="auto"/>
         <w:ind w:left="360"/>
       </w:pPr>
       <w:r>
-        <w:t>Component-based Architecture: UI dipecah menjadi bagian mandiri yang reusable.</w:t>
+        <w:t>Component-based Architecture: Aplikasi dipecah menjadi bagian-bagian kecil yang mandiri (reusable components). Contoh: Navbar, Sidebar, dan FormModal dibuat sekali dan dipanggil berulang-ulang di halaman yang berbeda.</w:t>
       </w:r>
     </w:p>
     <w:p>
@@ -1287,7 +1116,7 @@
         <w:ind w:left="360"/>
       </w:pPr>
       <w:r>
-        <w:t>Virtual DOM: Salinan DOM asli di memori. React hanya meng-update elemen HTML yang berubah saja (Diffing Algorithm) sehingga performa web sangat cepat.</w:t>
+        <w:t>Virtual DOM (Document Object Model): React membuat salinan DOM asli browser di memori (Virtual DOM). Ketika data berubah, React membandingkan Virtual DOM dengan DOM asli dan hanya memperbarui elemen HTML yang berubah saja (Diffing Algorithm), bukan me-render ulang seluruh halaman. Ini membuat web berjalan sangat cepat.</w:t>
       </w:r>
     </w:p>
     <w:p>
@@ -1297,7 +1126,7 @@
         <w:ind w:left="360"/>
       </w:pPr>
       <w:r>
-        <w:t>State vs Props: State adalah variabel lokal internal komponen (dapat diubah), sedangkan Props adalah data kiriman dari parent/controller (read-only).</w:t>
+        <w:t>State vs Props: State adalah data internal yang dikelola dan diubah oleh komponen itu sendiri (lokal). Props adalah data eksternal yang dikirimkan oleh komponen induk ke komponen anak dan bersifat read-only (tidak bisa diubah langsung oleh komponen anak).</w:t>
       </w:r>
     </w:p>
     <w:p>
@@ -1307,7 +1136,7 @@
         <w:ind w:left="360"/>
       </w:pPr>
       <w:r>
-        <w:t>React Hooks: Fungsi bawaan React seperti useState() untuk state lokal dan useEffect() untuk lifecycle side-effects.</w:t>
+        <w:t>React Hooks: Fungsi bawaan React untuk menggunakan fitur state dan lifecycle di function component. Contoh: useState() untuk membuat state lokal, dan useEffect() untuk menjalankan efek samping seperti mengambil data saat komponen pertama kali dirender.</w:t>
       </w:r>
     </w:p>
     <w:p>
@@ -1319,20 +1148,28 @@
       <w:r>
         <w:rPr>
           <w:b/>
-          <w:color w:val="1A5685"/>
+          <w:color w:val="2E75B5"/>
           <w:sz w:val="24"/>
         </w:rPr>
-        <w:t>REST API &amp; Laravel Sanctum</w:t>
+        <w:t>5.3 REST API &amp; Laravel Sanctum</w:t>
       </w:r>
     </w:p>
     <w:p>
       <w:pPr>
+        <w:spacing w:after="120" w:line="276" w:lineRule="auto"/>
+      </w:pPr>
+      <w:r>
+        <w:t>REST (Representational State Transfer) API adalah standar arsitektur komunikasi data antara sistem yang berbeda (dalam proyek ini antara backend Laravel dengan klien mobile Android Kotlin) dengan menggunakan protokol HTTP. Konsep penting yang harus dipahami:</w:t>
+      </w:r>
+    </w:p>
+    <w:p>
+      <w:pPr>
         <w:pStyle w:val="ListBullet"/>
         <w:spacing w:after="80" w:line="276" w:lineRule="auto"/>
         <w:ind w:left="360"/>
       </w:pPr>
       <w:r>
-        <w:t>Statelessness: Server tidak menyimpan status session klien. Setiap HTTP request Android membawa token autentikasi.</w:t>
+        <w:t>Statelessness: Sifat utama REST API di mana server tidak menyimpan status session klien. Setiap HTTP request dari klien Android harus membawa informasi lengkap (token autentikasi) secara mandiri untuk diproses oleh server.</w:t>
       </w:r>
     </w:p>
     <w:p>
@@ -1342,7 +1179,7 @@
         <w:ind w:left="360"/>
       </w:pPr>
       <w:r>
-        <w:t>HTTP Methods: Aksi standar komunikasi: GET (ambil), POST (buat baru), PUT/PATCH (update), DELETE (hapus).</w:t>
+        <w:t>HTTP Methods (Verbs): Standar komunikasi aksi: GET (mengambil data), POST (mengirim/membuat data baru), PUT/PATCH (memperbarui data), dan DELETE (menghapus data).</w:t>
       </w:r>
     </w:p>
     <w:p>
@@ -1352,11 +1189,21 @@
         <w:ind w:left="360"/>
       </w:pPr>
       <w:r>
-        <w:t>Laravel Sanctum: Sistem autentikasi token ringan untuk mengamankan endpoint REST API.</w:t>
+        <w:t>Format Data JSON: Komunikasi data dilakukan menggunakan format JSON (JavaScript Object Notation), yaitu format teks ringan yang mudah dibaca oleh manusia dan mudah diparse oleh bahasa pemrograman apa pun (PHP di backend dan Kotlin di Android).</w:t>
       </w:r>
     </w:p>
     <w:p>
       <w:pPr>
+        <w:pStyle w:val="ListBullet"/>
+        <w:spacing w:after="80" w:line="276" w:lineRule="auto"/>
+        <w:ind w:left="360"/>
+      </w:pPr>
+      <w:r>
+        <w:t>Laravel Sanctum: Sistem autentikasi token bawaan Laravel yang sangat ringan. Sanctum menghasilkan string token acak (plainTextToken) yang disimpan di Android. Setiap request Android menyertakan token ini di header Authorization (Bearer Token) untuk diuji kecocokannya dengan token terenkripsi SHA-256 yang tersimpan di tabel database personal_access_tokens.</w:t>
+      </w:r>
+    </w:p>
+    <w:p>
+      <w:pPr>
         <w:pStyle w:val="Heading1"/>
         <w:keepNext/>
         <w:spacing w:before="360" w:after="160"/>
@@ -1364,10 +1211,10 @@
       <w:r>
         <w:rPr>
           <w:b/>
-          <w:color w:val="0A3A60"/>
+          <w:color w:val="1F4E79"/>
           <w:sz w:val="28"/>
         </w:rPr>
-        <w:t>BAB VI: FUNGSI DAN PENJELASAN BERKAS KONFIGURASI PROJEK</w:t>
+        <w:t>BAB VI: FUNGSI DAN PENJELASAN BERKAS KONFIGURASI PROJEK (FILES EXPLANATION)</w:t>
       </w:r>
     </w:p>
     <w:p>
@@ -1375,7 +1222,7 @@
         <w:spacing w:after="120" w:line="276" w:lineRule="auto"/>
       </w:pPr>
       <w:r>
-        <w:t>Dosen sering menanyakan kegunaan berkas konfigurasi di root direktori proyek:</w:t>
+        <w:t>Bab ini memuat daftar berkas konfigurasi di root direktori proyek, yang sering ditanyakan dosen untuk memastikan Anda memahami komponen arsitektur proyek secara utuh:</w:t>
       </w:r>
     </w:p>
     <w:p>
@@ -1385,7 +1232,7 @@
         <w:ind w:left="360"/>
       </w:pPr>
       <w:r>
-        <w:t>.env &amp; .env.example: Menyimpan kredensial database lokal, app key, dan variabel lingkungan sensitif.</w:t>
+        <w:t>.editorconfig: Berkas konfigurasi editor (seperti VS Code) untuk menstandarkan gaya penulisan kode antar pengembang (misalnya ukuran indentasi spasi/tab secara seragam).</w:t>
       </w:r>
     </w:p>
     <w:p>
@@ -1395,7 +1242,7 @@
         <w:ind w:left="360"/>
       </w:pPr>
       <w:r>
-        <w:t>.editorconfig &amp; .eslintrc.json: Menstandarkan gaya penulisan kode JavaScript dan deteksi error sintaks.</w:t>
+        <w:t>.env: Berkas konfigurasi lingkungan (environment variables) lokal yang menyimpan data sensitif seperti kredensial database (host, port, DB name, username, password) dan kunci keamanan aplikasi (App Key). Berkas ini tidak di-upload ke GitHub demi keamanan.</w:t>
       </w:r>
     </w:p>
     <w:p>
@@ -1405,7 +1252,7 @@
         <w:ind w:left="360"/>
       </w:pPr>
       <w:r>
-        <w:t>.gitignore: Berkas instruksi agar Git mengabaikan folder dependensi vendor/ atau node_modules/ saat push ke GitHub.</w:t>
+        <w:t>.env.example: Salinan template berkas .env tanpa isi data sensitif. Berfungsi sebagai panduan bagi developer lain untuk meniru konfigurasi lingkungan ketika baru pertama kali mengkloning proyek.</w:t>
       </w:r>
     </w:p>
     <w:p>
@@ -1415,7 +1262,7 @@
         <w:ind w:left="360"/>
       </w:pPr>
       <w:r>
-        <w:t>composer.json &amp; composer.lock: Package manager PHP untuk mendefinisikan library dependensi backend (Laravel, Sanctum, Inertia).</w:t>
+        <w:t>.eslintrc.json: Berkas konfigurasi ESLint (linter Javascript) untuk mendeteksi penulisan kode Javascript/React yang salah secara otomatis di editor agar kode bersih dan minim bug.</w:t>
       </w:r>
     </w:p>
     <w:p>
@@ -1425,7 +1272,7 @@
         <w:ind w:left="360"/>
       </w:pPr>
       <w:r>
-        <w:t>package.json &amp; package-lock.json: Package manager Node.js untuk mendefinisikan library frontend (React, Axios, ChartJS).</w:t>
+        <w:t>.gitattributes: Mengatur atribut berkas di dalam sistem Git, seperti konversi baris akhir otomatis (CRLF ke LF) saat file dibagikan antar sistem operasi (Windows dan Linux/Mac).</w:t>
       </w:r>
     </w:p>
     <w:p>
@@ -1435,7 +1282,7 @@
         <w:ind w:left="360"/>
       </w:pPr>
       <w:r>
-        <w:t>tailwind.config.js: Mengatur tema warna kustom, responsivitas, dan kelas CSS Tailwind.</w:t>
+        <w:t>.gitignore: Berkas instruksi untuk Git untuk mengabaikan (tidak melacak/mengunggah) folder dan berkas tertentu seperti folder dependensi vendor/, node_modules/, atau berkas konfigurasi lokal .env ke GitHub.</w:t>
       </w:r>
     </w:p>
     <w:p>
@@ -1445,11 +1292,111 @@
         <w:ind w:left="360"/>
       </w:pPr>
       <w:r>
-        <w:t>vite.config.js: Konfigurasi bundler Vite untuk kompilasi real-time aset React JSX dan Tailwind CSS.</w:t>
+        <w:t>.prettierrc: Konfigurasi format otomatis kode untuk library Prettier di editor (misalnya memaksa tanda titik koma, spasi, dan gaya penulisan React JSX seragam).</w:t>
       </w:r>
     </w:p>
     <w:p>
       <w:pPr>
+        <w:pStyle w:val="ListBullet"/>
+        <w:spacing w:after="80" w:line="276" w:lineRule="auto"/>
+        <w:ind w:left="360"/>
+      </w:pPr>
+      <w:r>
+        <w:t>artisan: Aplikasi Command Line Interface (CLI) bawaan Laravel. Digunakan untuk menjalankan perintah-perintah framework Laravel di terminal, seperti php artisan serve, php artisan migrate, dll.</w:t>
+      </w:r>
+    </w:p>
+    <w:p>
+      <w:pPr>
+        <w:pStyle w:val="ListBullet"/>
+        <w:spacing w:after="80" w:line="276" w:lineRule="auto"/>
+        <w:ind w:left="360"/>
+      </w:pPr>
+      <w:r>
+        <w:t>composer.json: Berkas utama package manager Composer. Menyimpan data metadata proyek, versi PHP yang dibutuhkan, dan daftar pustaka dependensi PHP backend (seperti Laravel core, Sanctum, Inertia) yang harus diinstal.</w:t>
+      </w:r>
+    </w:p>
+    <w:p>
+      <w:pPr>
+        <w:pStyle w:val="ListBullet"/>
+        <w:spacing w:after="80" w:line="276" w:lineRule="auto"/>
+        <w:ind w:left="360"/>
+      </w:pPr>
+      <w:r>
+        <w:t>composer.lock: Mengunci versi spesifik dari library Composer yang telah terinstal agar ketika orang lain menjalankan composer install, mereka akan mengunduh versi library yang sama persis.</w:t>
+      </w:r>
+    </w:p>
+    <w:p>
+      <w:pPr>
+        <w:pStyle w:val="ListBullet"/>
+        <w:spacing w:after="80" w:line="276" w:lineRule="auto"/>
+        <w:ind w:left="360"/>
+      </w:pPr>
+      <w:r>
+        <w:t>jsconfig.json: Konfigurasi compiler Javascript di editor. Digunakan untuk mendefinisikan alias path impor, sehingga kita bisa mengimpor file di React dengan path pendek seperti @/Components/Button alih-alih path panjang seperti ../../../Components/Button.</w:t>
+      </w:r>
+    </w:p>
+    <w:p>
+      <w:pPr>
+        <w:pStyle w:val="ListBullet"/>
+        <w:spacing w:after="80" w:line="276" w:lineRule="auto"/>
+        <w:ind w:left="360"/>
+      </w:pPr>
+      <w:r>
+        <w:t>package.json: Berkas utama package manager NPM (Node.js). Menyimpan metadata proyek frontend serta daftar library Javascript/React yang dibutuhkan (seperti React, Axios, Tailwind CSS, Inertia).</w:t>
+      </w:r>
+    </w:p>
+    <w:p>
+      <w:pPr>
+        <w:pStyle w:val="ListBullet"/>
+        <w:spacing w:after="80" w:line="276" w:lineRule="auto"/>
+        <w:ind w:left="360"/>
+      </w:pPr>
+      <w:r>
+        <w:t>package-lock.json: Mengunci versi library NPM yang terinstal agar tetap sama persis di komputer developer lain ketika mereka menjalankan npm install.</w:t>
+      </w:r>
+    </w:p>
+    <w:p>
+      <w:pPr>
+        <w:pStyle w:val="ListBullet"/>
+        <w:spacing w:after="80" w:line="276" w:lineRule="auto"/>
+        <w:ind w:left="360"/>
+      </w:pPr>
+      <w:r>
+        <w:t>phpunit.xml: Konfigurasi bawaan untuk framework pengujian otomatis PHPUnit (untuk menjalankan tes fungsional/unit di Laravel).</w:t>
+      </w:r>
+    </w:p>
+    <w:p>
+      <w:pPr>
+        <w:pStyle w:val="ListBullet"/>
+        <w:spacing w:after="80" w:line="276" w:lineRule="auto"/>
+        <w:ind w:left="360"/>
+      </w:pPr>
+      <w:r>
+        <w:t>postcss.config.js: Berkas konfigurasi PostCSS yang digunakan oleh compiler aset (Vite) untuk memproses sintaks CSS modern agar kompatibel dengan seluruh web browser.</w:t>
+      </w:r>
+    </w:p>
+    <w:p>
+      <w:pPr>
+        <w:pStyle w:val="ListBullet"/>
+        <w:spacing w:after="80" w:line="276" w:lineRule="auto"/>
+        <w:ind w:left="360"/>
+      </w:pPr>
+      <w:r>
+        <w:t>tailwind.config.js: Berkas konfigurasi utama framework Tailwind CSS. Digunakan untuk mengatur tema warna kustom, font, path pencarian kelas CSS di dalam file React, dan responsivitas layout.</w:t>
+      </w:r>
+    </w:p>
+    <w:p>
+      <w:pPr>
+        <w:pStyle w:val="ListBullet"/>
+        <w:spacing w:after="80" w:line="276" w:lineRule="auto"/>
+        <w:ind w:left="360"/>
+      </w:pPr>
+      <w:r>
+        <w:t>vite.config.js: Berkas konfigurasi utama untuk bundler Vite. Vite bertugas mengompilasi dan menggabungkan semua file React JSX dan Tailwind CSS Anda secara real-time saat server pengembangan aktif.</w:t>
+      </w:r>
+    </w:p>
+    <w:p>
+      <w:pPr>
         <w:pStyle w:val="Heading1"/>
         <w:keepNext/>
         <w:spacing w:before="360" w:after="160"/>
@@ -1457,7 +1404,7 @@
       <w:r>
         <w:rPr>
           <w:b/>
-          <w:color w:val="0A3A60"/>
+          <w:color w:val="1F4E79"/>
           <w:sz w:val="28"/>
         </w:rPr>
         <w:t>BAB VII: DEEP DIVE: KONSEP SESSIONS, TOKENS, DAN DATABASE MIGRATIONS</w:t>
@@ -1465,6 +1412,14 @@
     </w:p>
     <w:p>
       <w:pPr>
+        <w:spacing w:after="120" w:line="276" w:lineRule="auto"/>
+      </w:pPr>
+      <w:r>
+        <w:t>Tiga konsep ini adalah fondasi penting dalam pemrograman backend Laravel. Dosen penguji hampir pasti menanyakan perbedaan cara kerja autentikasi web (session) dengan Android (token), serta bagaimana migrasi bekerja.</w:t>
+      </w:r>
+    </w:p>
+    <w:p>
+      <w:pPr>
         <w:pStyle w:val="Heading2"/>
         <w:keepNext/>
         <w:spacing w:before="240" w:after="120"/>
@@ -1472,10 +1427,10 @@
       <w:r>
         <w:rPr>
           <w:b/>
-          <w:color w:val="1A5685"/>
+          <w:color w:val="2E75B5"/>
           <w:sz w:val="24"/>
         </w:rPr>
-        <w:t>Web Sessions (Autentikasi Stateful)</w:t>
+        <w:t>7.1 Web Sessions (Autentikasi Stateful)</w:t>
       </w:r>
     </w:p>
     <w:p>
@@ -1483,7 +1438,7 @@
         <w:spacing w:after="120" w:line="276" w:lineRule="auto"/>
       </w:pPr>
       <w:r>
-        <w:t>Session adalah mekanisme penyimpanan status login di sisi server:</w:t>
+        <w:t>Session adalah mekanisme penyimpanan informasi sementara di sisi server untuk melacak status login pengguna di web browser. Cara kerjanya:</w:t>
       </w:r>
     </w:p>
     <w:p>
@@ -1493,7 +1448,7 @@
         <w:ind w:left="360"/>
       </w:pPr>
       <w:r>
-        <w:t>Pengguna memasukkan email/password -&gt; Laravel mencocokkannya -&gt; jika cocok, Laravel membuat file session unik di server dan mengirimkan Session ID (Cookie bernama laravel_session) ke browser.</w:t>
+        <w:t>Proses Autentikasi: Pengguna memasukkan email/password di browser -&gt; Laravel mencocokkannya -&gt; jika cocok, Laravel membuat file session unik di server (storage/framework/sessions/) dan mengirimkan Session ID ke browser dalam bentuk Cookie (bernama laravel_session).</w:t>
       </w:r>
     </w:p>
     <w:p>
@@ -1503,11 +1458,21 @@
         <w:ind w:left="360"/>
       </w:pPr>
       <w:r>
-        <w:t>Web browser melampirkan cookie Session ID tersebut secara otomatis dalam setiap request HTTP selanjutnya.</w:t>
+        <w:t>Pengiriman Cookie Otomatis: Web browser menyimpan cookie tersebut secara otomatis. Setiap kali pengguna berpindah halaman di web Anda, browser akan melampirkan cookie Session ID tersebut secara otomatis dalam request HTTP.</w:t>
       </w:r>
     </w:p>
     <w:p>
       <w:pPr>
+        <w:pStyle w:val="ListBullet"/>
+        <w:spacing w:after="80" w:line="276" w:lineRule="auto"/>
+        <w:ind w:left="360"/>
+      </w:pPr>
+      <w:r>
+        <w:t>Stateful: Disebut Stateful karena server secara aktif melacak dan menyimpan status login pengguna di memori/file server selama browser belum ditutup atau waktu session belum habis (expire).</w:t>
+      </w:r>
+    </w:p>
+    <w:p>
+      <w:pPr>
         <w:pStyle w:val="Heading2"/>
         <w:keepNext/>
         <w:spacing w:before="240" w:after="120"/>
@@ -1515,10 +1480,10 @@
       <w:r>
         <w:rPr>
           <w:b/>
-          <w:color w:val="1A5685"/>
+          <w:color w:val="2E75B5"/>
           <w:sz w:val="24"/>
         </w:rPr>
-        <w:t>API Tokens (Autentikasi Stateless)</w:t>
+        <w:t>7.2 API Tokens (Autentikasi Stateless)</w:t>
       </w:r>
     </w:p>
     <w:p>
@@ -1526,7 +1491,7 @@
         <w:spacing w:after="120" w:line="276" w:lineRule="auto"/>
       </w:pPr>
       <w:r>
-        <w:t>Token adalah string acak unik yang digunakan untuk mengautentikasi REST API mobile:</w:t>
+        <w:t>Token adalah string acak unik yang digunakan untuk mengautentikasi pengguna pada REST API (mobile Android Kotlin). Cara kerjanya:</w:t>
       </w:r>
     </w:p>
     <w:p>
@@ -1536,7 +1501,7 @@
         <w:ind w:left="360"/>
       </w:pPr>
       <w:r>
-        <w:t>Aplikasi Android mengirim login request -&gt; Laravel Sanctum membuat baris token baru di tabel database personal_access_tokens dan mengirimkan token string tersebut ke Android.</w:t>
+        <w:t>Proses Autentikasi: Aplikasi Android mengirim email/password ke API login -&gt; Laravel memverifikasi -&gt; jika cocok, Laravel Sanctum membuat baris token acak baru di tabel database personal_access_tokens dan mengembalikan token string mentah tersebut ke aplikasi Android.</w:t>
       </w:r>
     </w:p>
     <w:p>
@@ -1546,7 +1511,7 @@
         <w:ind w:left="360"/>
       </w:pPr>
       <w:r>
-        <w:t>Android menyimpan token secara lokal dan melampirkannya secara manual di header HTTP: Authorization: Bearer {token} pada setiap request.</w:t>
+        <w:t>Penyimpanan Manual: Aplikasi Android menyimpan token tersebut secara mandiri di memori lokal perangkat (SharedPreferences atau Datastore).</w:t>
       </w:r>
     </w:p>
     <w:p>
@@ -1556,11 +1521,31 @@
         <w:ind w:left="360"/>
       </w:pPr>
       <w:r>
-        <w:t>Mengapa Android memakai Token?: Karena aplikasi mobile tidak memiliki mekanisme otomatisasi cookie session layaknya web browser.</w:t>
+        <w:t>Pengiriman Header Manual: Setiap kali Android mengirim request ke server (misal meminta data barang), Android harus melampirkan token tersebut secara manual di dalam header HTTP: Authorization: Bearer {token}.</w:t>
       </w:r>
     </w:p>
     <w:p>
       <w:pPr>
+        <w:pStyle w:val="ListBullet"/>
+        <w:spacing w:after="80" w:line="276" w:lineRule="auto"/>
+        <w:ind w:left="360"/>
+      </w:pPr>
+      <w:r>
+        <w:t>Stateless: Disebut Stateless karena server tidak menyimpan status session aktif untuk klien. Server hanya memeriksa apakah token yang dibawa di header HTTP cocok dengan yang ada di database. Jika cocok, data dikirim. Ini lebih hemat sumber daya server dan sangat fleksibel untuk integrasi multi-platform.</w:t>
+      </w:r>
+    </w:p>
+    <w:p>
+      <w:pPr>
+        <w:pStyle w:val="ListBullet"/>
+        <w:spacing w:after="80" w:line="276" w:lineRule="auto"/>
+        <w:ind w:left="360"/>
+      </w:pPr>
+      <w:r>
+        <w:t>Mengapa Android memakai Token bukan Session?: Karena aplikasi mobile (Android/iOS) tidak memiliki mekanisme bawaan untuk mengelola cookie session secara otomatis seperti web browser. Selain itu, token lebih aman dan kompatibel untuk komunikasi lintas platform berbasis API.</w:t>
+      </w:r>
+    </w:p>
+    <w:p>
+      <w:pPr>
         <w:pStyle w:val="Heading2"/>
         <w:keepNext/>
         <w:spacing w:before="240" w:after="120"/>
@@ -1568,10 +1553,10 @@
       <w:r>
         <w:rPr>
           <w:b/>
-          <w:color w:val="1A5685"/>
+          <w:color w:val="2E75B5"/>
           <w:sz w:val="24"/>
         </w:rPr>
-        <w:t>Database Migrations (Version Control untuk Database)</w:t>
+        <w:t>7.3 Database Migrations (Version Control untuk Database)</w:t>
       </w:r>
     </w:p>
     <w:p>
@@ -1579,7 +1564,7 @@
         <w:spacing w:after="120" w:line="276" w:lineRule="auto"/>
       </w:pPr>
       <w:r>
-        <w:t>Migrasi adalah version control untuk skema database. Struktur tabel didefinisikan menggunakan kode PHP sehingga tidak perlu ekspor-impor file SQL manual.</w:t>
+        <w:t>Migrasi adalah fitur Laravel yang berfungsi sebagai sistem pengontrol versi (seperti Git) tetapi khusus untuk skema database. Dengan migrasi, struktur tabel didefinisikan menggunakan kode PHP, bukan query SQL manual.</w:t>
       </w:r>
     </w:p>
     <w:p>
@@ -1589,7 +1574,7 @@
         <w:ind w:left="360"/>
       </w:pPr>
       <w:r>
-        <w:t>php artisan migrate: Menjalankan semua berkas migrasi baru ke database.</w:t>
+        <w:t>Manfaat Utama: Mempermudah kolaborasi tim developer atau proses penilaian oleh dosen. Cukup dengan menjalankan satu baris perintah di terminal baru, seluruh struktur database beserta relasi foreign key akan dibuat secara otomatis dengan tingkat akurasi 100% tanpa perlu ekspor-impor file SQL manual.</w:t>
       </w:r>
     </w:p>
     <w:p>
@@ -1599,17 +1584,37 @@
         <w:ind w:left="360"/>
       </w:pPr>
       <w:r>
-        <w:t>php artisan migrate:rollback: Membatalkan atau memundurkan migrasi yang terakhir dijalankan.</w:t>
+        <w:t>Perintah Artisan Utama: Berikut adalah 3 perintah migrasi yang wajib dihafalkan fungsinya:</w:t>
       </w:r>
     </w:p>
     <w:p>
       <w:pPr>
         <w:pStyle w:val="ListBullet"/>
         <w:spacing w:after="80" w:line="276" w:lineRule="auto"/>
-        <w:ind w:left="360"/>
+        <w:ind w:left="720"/>
       </w:pPr>
       <w:r>
-        <w:t>php artisan migrate:fresh: Menghapus seluruh tabel di database lalu menjalankan ulang seluruh berkas migrasi dari awal.</w:t>
+        <w:t>1. php artisan migrate: Menjalankan semua berkas migrasi baru yang belum pernah dijalankan sebelumnya di database.</w:t>
+      </w:r>
+    </w:p>
+    <w:p>
+      <w:pPr>
+        <w:pStyle w:val="ListBullet"/>
+        <w:spacing w:after="80" w:line="276" w:lineRule="auto"/>
+        <w:ind w:left="720"/>
+      </w:pPr>
+      <w:r>
+        <w:t>2. php artisan migrate:rollback: Membatalkan atau memundurkan migrasi yang terakhir kali dijalankan (menghapus tabel/kolom yang baru dibuat). Ini berguna untuk membatalkan kesalahan skema.</w:t>
+      </w:r>
+    </w:p>
+    <w:p>
+      <w:pPr>
+        <w:pStyle w:val="ListBullet"/>
+        <w:spacing w:after="80" w:line="276" w:lineRule="auto"/>
+        <w:ind w:left="720"/>
+      </w:pPr>
+      <w:r>
+        <w:t>3. php artisan migrate:fresh: Menghapus seluruh tabel di database (drop all tables) lalu menjalankan ulang seluruh berkas migrasi dari awal. Ini digunakan untuk mereset database ke keadaan kosong bersih.</w:t>
       </w:r>
     </w:p>
     <w:sectPr>

</xml_diff>

<commit_message>
Docs: Complete 8-chapter presentation guide with detailed database schemas mapped to MedTrack
</commit_message>
<xml_diff>
--- a/Poin Poin dan Pemahaman Untuk Presentasi (Hasil Edit).docx
+++ b/Poin Poin dan Pemahaman Untuk Presentasi (Hasil Edit).docx
@@ -27,7 +27,7 @@
           <w:color w:val="505050"/>
           <w:sz w:val="22"/>
         </w:rPr>
-        <w:t>Materi Pendalaman Struktur Kode, Alur Data, dan Integrasi Laravel + React Inertia</w:t>
+        <w:t>Materi Pendalaman Struktur Kode, Alur Data, dan Integrasi Laravel 10 + React Inertia</w:t>
         <w:br/>
         <w:t>Khusus untuk Menjawab Pertanyaan Dosen Penguji secara Rinci</w:t>
       </w:r>
@@ -115,7 +115,7 @@
         <w:t>• app/Models/:</w:t>
       </w:r>
       <w:r>
-        <w:t xml:space="preserve"> Berisi Model Eloquent (User.php, Aset.php, Ruangan.php, Mutasi.php, Troubleshoot.php, TroubleshootLog.php, Pemeliharaan.php, PemeliharaanLog.php, DokumenMutu.php) yang memetakan tabel database MySQL secara objek ORM. Model mendefinisikan relasi antar-tabel secara dinamis (seperti Aset milik Ruangan melalui belongsTo).</w:t>
+        <w:t xml:space="preserve"> Berisi Model Eloquent (User.php, Aset.php, Ruangan.php, Mutasi.php, Troubleshoot.php, TroubleshootLog.php, Pemeliharaan.php, PemeliharaanLog.php, DokumenMutu.php) yang memetakan tabel database MySQL secara objek ORM. Model mendefinisikan relasi (seperti Aset milik Ruangan melalui belongsTo).</w:t>
       </w:r>
     </w:p>
     <w:p>
@@ -709,7 +709,7 @@
         <w:ind w:left="360"/>
       </w:pPr>
       <w:r>
-        <w:t>Tabel m_ruangan: Dibuat dengan id_ruang sebagai primary key dan nama_ruang ber-constraint unique() agar tidak ada ruangan ganda.</w:t>
+        <w:t>Tabel Ruangan: Dibuat dengan id_ruang sebagai primary key dan nama_ruang ber-constraint unique() agar tidak ada ruangan ganda.</w:t>
       </w:r>
     </w:p>
     <w:p>
@@ -719,7 +719,7 @@
         <w:ind w:left="360"/>
       </w:pPr>
       <w:r>
-        <w:t>Tabel t_aset: Memiliki kolom id_ruang_saat_ini yang dihubungkan sebagai foreign key menggunakan constrained('m_ruangan')-&gt;nullOnDelete(). Artinya, jika sebuah ruangan dihapus, kolom lokasi aset diisi NULL tanpa menghapus data aset.</w:t>
+        <w:t>Tabel Aset: Memiliki kolom id_ruang_saat_ini yang dihubungkan sebagai foreign key menggunakan constrained('m_ruangan')-&gt;nullOnDelete(). Artinya, jika sebuah ruangan dihapus, kolom lokasi aset diisi NULL tanpa menghapus data aset.</w:t>
       </w:r>
     </w:p>
     <w:p>
@@ -729,7 +729,7 @@
         <w:ind w:left="360"/>
       </w:pPr>
       <w:r>
-        <w:t>Tabel t_mutasi: Melacak log perpindahan aset (id_aset, id_ruang_asal, id_ruang_tujuan).</w:t>
+        <w:t>Tabel Mutasi: Melacak log perpindahan aset (id_aset, id_ruang_asal, id_ruang_tujuan).</w:t>
       </w:r>
     </w:p>
     <w:p>
@@ -739,7 +739,7 @@
         <w:ind w:left="360"/>
       </w:pPr>
       <w:r>
-        <w:t>Tabel t_troubleshoot: Melacak tiket kerusakan (id_aset, id_user_pelapor, id_teknisi_penanggungjawab, status_ticket).</w:t>
+        <w:t>Tabel Troubleshoot: Melacak tiket kerusakan (id_aset, id_user_pelapor, id_teknisi_penanggungjawab, status_ticket).</w:t>
       </w:r>
     </w:p>
     <w:p>
@@ -1615,6 +1615,411 @@
       </w:pPr>
       <w:r>
         <w:t>3. php artisan migrate:fresh: Menghapus seluruh tabel di database (drop all tables) lalu menjalankan ulang seluruh berkas migrasi dari awal. Ini digunakan untuk mereset database ke keadaan kosong bersih.</w:t>
+      </w:r>
+    </w:p>
+    <w:p>
+      <w:pPr>
+        <w:pStyle w:val="Heading1"/>
+        <w:keepNext/>
+        <w:spacing w:before="360" w:after="160"/>
+      </w:pPr>
+      <w:r>
+        <w:rPr>
+          <w:b/>
+          <w:color w:val="1F4E79"/>
+          <w:sz w:val="28"/>
+        </w:rPr>
+        <w:t>BAB VIII: PEMAHAMAN STRUKTUR &amp; DETAIL DATABASE (SCHEMAS &amp; RELATIONSHIPS)</w:t>
+      </w:r>
+    </w:p>
+    <w:p>
+      <w:pPr>
+        <w:spacing w:after="120" w:line="276" w:lineRule="auto"/>
+      </w:pPr>
+      <w:r>
+        <w:t>Dosen penguji hampir pasti menanyakan tentang struktur tabel, primary key, foreign key, dan hubungan relasional di dalam database MySQL projek MedTrack. Berikut adalah rincian fungsionalnya:</w:t>
+      </w:r>
+    </w:p>
+    <w:p>
+      <w:pPr>
+        <w:pStyle w:val="Heading2"/>
+        <w:keepNext/>
+        <w:spacing w:before="240" w:after="120"/>
+      </w:pPr>
+      <w:r>
+        <w:rPr>
+          <w:b/>
+          <w:color w:val="2E75B5"/>
+          <w:sz w:val="24"/>
+        </w:rPr>
+        <w:t>8.1 Penjelasan Detail 8 Tabel Inti MedTrack</w:t>
+      </w:r>
+    </w:p>
+    <w:p>
+      <w:pPr>
+        <w:spacing w:after="120" w:line="276" w:lineRule="auto"/>
+      </w:pPr>
+      <w:r>
+        <w:rPr>
+          <w:b/>
+        </w:rPr>
+        <w:t xml:space="preserve">1. Tabel m_user (Data Pengguna / Staff): </w:t>
+      </w:r>
+      <w:r>
+        <w:t xml:space="preserve"> - Menyimpan data pengguna sistem yang terbagi menjadi role Admin_IPSRS, Staf_IPSRS, Staf_Logistik, dan Unit_RS. Menyimpan ID ruangan (id_ruang) sebagai foreign key yang merelasikan user ke unit kerjanya.</w:t>
+      </w:r>
+    </w:p>
+    <w:p>
+      <w:pPr>
+        <w:pStyle w:val="ListBullet"/>
+        <w:spacing w:after="80" w:line="276" w:lineRule="auto"/>
+        <w:ind w:left="360"/>
+      </w:pPr>
+      <w:r>
+        <w:t>Primary Key: id_user</w:t>
+      </w:r>
+    </w:p>
+    <w:p>
+      <w:pPr>
+        <w:pStyle w:val="ListBullet"/>
+        <w:spacing w:after="80" w:line="276" w:lineRule="auto"/>
+        <w:ind w:left="360"/>
+      </w:pPr>
+      <w:r>
+        <w:t>Foreign Key: id_ruang -&gt; m_ruangan(id_ruang) untuk relasi penugasan ruangan staff.</w:t>
+      </w:r>
+    </w:p>
+    <w:p>
+      <w:pPr>
+        <w:spacing w:after="120" w:line="276" w:lineRule="auto"/>
+      </w:pPr>
+      <w:r>
+        <w:rPr>
+          <w:b/>
+        </w:rPr>
+        <w:t xml:space="preserve">2. Tabel m_ruangan (Data Unit Ruangan): </w:t>
+      </w:r>
+      <w:r>
+        <w:t xml:space="preserve"> - Menyimpan seluruh daftar unit/ruangan rumah sakit (seperti ICU, IGD, OK, Poli, Logistik, IPSRS).</w:t>
+      </w:r>
+    </w:p>
+    <w:p>
+      <w:pPr>
+        <w:pStyle w:val="ListBullet"/>
+        <w:spacing w:after="80" w:line="276" w:lineRule="auto"/>
+        <w:ind w:left="360"/>
+      </w:pPr>
+      <w:r>
+        <w:t>Primary Key: id_ruang</w:t>
+      </w:r>
+    </w:p>
+    <w:p>
+      <w:pPr>
+        <w:pStyle w:val="ListBullet"/>
+        <w:spacing w:after="80" w:line="276" w:lineRule="auto"/>
+        <w:ind w:left="360"/>
+      </w:pPr>
+      <w:r>
+        <w:t>Unique Key: nama_ruang (untuk mencegah duplikasi nama ruangan).</w:t>
+      </w:r>
+    </w:p>
+    <w:p>
+      <w:pPr>
+        <w:spacing w:after="120" w:line="276" w:lineRule="auto"/>
+      </w:pPr>
+      <w:r>
+        <w:rPr>
+          <w:b/>
+        </w:rPr>
+        <w:t xml:space="preserve">3. Tabel t_aset (Data Alat Medis): </w:t>
+      </w:r>
+      <w:r>
+        <w:t xml:space="preserve"> - Menyimpan katalog inventaris alat medis beserta detail kelaikan operasional, nomor seri, dan koordinat tracking posisi GPS.</w:t>
+      </w:r>
+    </w:p>
+    <w:p>
+      <w:pPr>
+        <w:pStyle w:val="ListBullet"/>
+        <w:spacing w:after="80" w:line="276" w:lineRule="auto"/>
+        <w:ind w:left="360"/>
+      </w:pPr>
+      <w:r>
+        <w:t>Primary Key: id_aset</w:t>
+      </w:r>
+    </w:p>
+    <w:p>
+      <w:pPr>
+        <w:pStyle w:val="ListBullet"/>
+        <w:spacing w:after="80" w:line="276" w:lineRule="auto"/>
+        <w:ind w:left="360"/>
+      </w:pPr>
+      <w:r>
+        <w:t>Unique Key: kode_label (contoh: MED-001, MED-002)</w:t>
+      </w:r>
+    </w:p>
+    <w:p>
+      <w:pPr>
+        <w:pStyle w:val="ListBullet"/>
+        <w:spacing w:after="80" w:line="276" w:lineRule="auto"/>
+        <w:ind w:left="360"/>
+      </w:pPr>
+      <w:r>
+        <w:t>Foreign Key: id_ruang_saat_ini -&gt; m_ruangan(id_ruang) untuk melacak lokasi terkini alat.</w:t>
+      </w:r>
+    </w:p>
+    <w:p>
+      <w:pPr>
+        <w:pStyle w:val="ListBullet"/>
+        <w:spacing w:after="80" w:line="276" w:lineRule="auto"/>
+        <w:ind w:left="360"/>
+      </w:pPr>
+      <w:r>
+        <w:t>Kolom Tracking: latitude, longitude (menyimpan koordinat GPS dari sensor mobile).</w:t>
+      </w:r>
+    </w:p>
+    <w:p>
+      <w:pPr>
+        <w:pStyle w:val="ListBullet"/>
+        <w:spacing w:after="80" w:line="276" w:lineRule="auto"/>
+        <w:ind w:left="360"/>
+      </w:pPr>
+      <w:r>
+        <w:t>Kolom Kalibrasi: tgl_kalibrasi_terakhir, tgl_kalibrasi_berikutnya, tgl_kadaluarsa_sertif.</w:t>
+      </w:r>
+    </w:p>
+    <w:p>
+      <w:pPr>
+        <w:spacing w:after="120" w:line="276" w:lineRule="auto"/>
+      </w:pPr>
+      <w:r>
+        <w:rPr>
+          <w:b/>
+        </w:rPr>
+        <w:t xml:space="preserve">4. Tabel t_mutasi (Log Perpindahan Aset): </w:t>
+      </w:r>
+      <w:r>
+        <w:t xml:space="preserve"> - Mencatat riwayat pemindahan alat medis antar-ruangan untuk kebutuhan inventaris.</w:t>
+      </w:r>
+    </w:p>
+    <w:p>
+      <w:pPr>
+        <w:pStyle w:val="ListBullet"/>
+        <w:spacing w:after="80" w:line="276" w:lineRule="auto"/>
+        <w:ind w:left="360"/>
+      </w:pPr>
+      <w:r>
+        <w:t>Primary Key: id_mutasi</w:t>
+      </w:r>
+    </w:p>
+    <w:p>
+      <w:pPr>
+        <w:pStyle w:val="ListBullet"/>
+        <w:spacing w:after="80" w:line="276" w:lineRule="auto"/>
+        <w:ind w:left="360"/>
+      </w:pPr>
+      <w:r>
+        <w:t>Foreign Keys: id_aset -&gt; t_aset(id_aset), id_ruang_asal -&gt; m_ruangan(id_ruang), id_ruang_tujuan -&gt; m_ruangan(id_ruang), user_id -&gt; m_user(id_user).</w:t>
+      </w:r>
+    </w:p>
+    <w:p>
+      <w:pPr>
+        <w:pStyle w:val="ListBullet"/>
+        <w:spacing w:after="80" w:line="276" w:lineRule="auto"/>
+        <w:ind w:left="360"/>
+      </w:pPr>
+      <w:r>
+        <w:t>Status: status_mutasi (Menunggu_Verifikasi, Disetujui, Ditolak).</w:t>
+      </w:r>
+    </w:p>
+    <w:p>
+      <w:pPr>
+        <w:spacing w:after="120" w:line="276" w:lineRule="auto"/>
+      </w:pPr>
+      <w:r>
+        <w:rPr>
+          <w:b/>
+        </w:rPr>
+        <w:t xml:space="preserve">5. Tabel t_troubleshoot (Tiket Laporan Kerusakan): </w:t>
+      </w:r>
+      <w:r>
+        <w:t xml:space="preserve"> - Menyimpan tiket aduan kerusakan alat medis (Work Order) yang diajukan oleh unit medis.</w:t>
+      </w:r>
+    </w:p>
+    <w:p>
+      <w:pPr>
+        <w:pStyle w:val="ListBullet"/>
+        <w:spacing w:after="80" w:line="276" w:lineRule="auto"/>
+        <w:ind w:left="360"/>
+      </w:pPr>
+      <w:r>
+        <w:t>Primary Key: id_ticket</w:t>
+      </w:r>
+    </w:p>
+    <w:p>
+      <w:pPr>
+        <w:pStyle w:val="ListBullet"/>
+        <w:spacing w:after="80" w:line="276" w:lineRule="auto"/>
+        <w:ind w:left="360"/>
+      </w:pPr>
+      <w:r>
+        <w:t>Foreign Keys: id_aset -&gt; t_aset(id_aset), id_user_pelapor -&gt; m_user(id_user), id_teknisi_penanggungjawab -&gt; m_user(id_user).</w:t>
+      </w:r>
+    </w:p>
+    <w:p>
+      <w:pPr>
+        <w:pStyle w:val="ListBullet"/>
+        <w:spacing w:after="80" w:line="276" w:lineRule="auto"/>
+        <w:ind w:left="360"/>
+      </w:pPr>
+      <w:r>
+        <w:t>Status: status_ticket (Open, Pengecekan, Dikerjakan, Menunggu Sign-Off, Closed).</w:t>
+      </w:r>
+    </w:p>
+    <w:p>
+      <w:pPr>
+        <w:spacing w:after="120" w:line="276" w:lineRule="auto"/>
+      </w:pPr>
+      <w:r>
+        <w:rPr>
+          <w:b/>
+        </w:rPr>
+        <w:t xml:space="preserve">6. Tabel t_troubleshoot_log (Riwayat Progress Tiket): </w:t>
+      </w:r>
+      <w:r>
+        <w:t xml:space="preserve"> - Mencatat kronologis perubahan status pengerjaan tiket kerusakan secara transaksional untuk audit trail log.</w:t>
+      </w:r>
+    </w:p>
+    <w:p>
+      <w:pPr>
+        <w:pStyle w:val="ListBullet"/>
+        <w:spacing w:after="80" w:line="276" w:lineRule="auto"/>
+        <w:ind w:left="360"/>
+      </w:pPr>
+      <w:r>
+        <w:t>Primary Key: id_log</w:t>
+      </w:r>
+    </w:p>
+    <w:p>
+      <w:pPr>
+        <w:pStyle w:val="ListBullet"/>
+        <w:spacing w:after="80" w:line="276" w:lineRule="auto"/>
+        <w:ind w:left="360"/>
+      </w:pPr>
+      <w:r>
+        <w:t>Foreign Keys: id_ticket -&gt; t_troubleshoot(id_ticket), diubah_oleh -&gt; m_user(id_user).</w:t>
+      </w:r>
+    </w:p>
+    <w:p>
+      <w:pPr>
+        <w:spacing w:after="120" w:line="276" w:lineRule="auto"/>
+      </w:pPr>
+      <w:r>
+        <w:rPr>
+          <w:b/>
+        </w:rPr>
+        <w:t xml:space="preserve">7. Tabel m_pemeliharaan &amp; t_pemeliharaan_log (Penjadwalan PM): </w:t>
+      </w:r>
+      <w:r>
+        <w:t xml:space="preserve"> - Menyimpan jadwal pemeliharaan preventif (Preventative Maintenance) berkala untuk masing-masing aset.</w:t>
+      </w:r>
+    </w:p>
+    <w:p>
+      <w:pPr>
+        <w:pStyle w:val="ListBullet"/>
+        <w:spacing w:after="80" w:line="276" w:lineRule="auto"/>
+        <w:ind w:left="360"/>
+      </w:pPr>
+      <w:r>
+        <w:t>Primary Key: id_pemeliharaan &amp; id_log_pemeliharaan</w:t>
+      </w:r>
+    </w:p>
+    <w:p>
+      <w:pPr>
+        <w:pStyle w:val="ListBullet"/>
+        <w:spacing w:after="80" w:line="276" w:lineRule="auto"/>
+        <w:ind w:left="360"/>
+      </w:pPr>
+      <w:r>
+        <w:t>Foreign Keys: id_aset -&gt; t_aset(id_aset).</w:t>
+      </w:r>
+    </w:p>
+    <w:p>
+      <w:pPr>
+        <w:spacing w:after="120" w:line="276" w:lineRule="auto"/>
+      </w:pPr>
+      <w:r>
+        <w:rPr>
+          <w:b/>
+        </w:rPr>
+        <w:t xml:space="preserve">8. Tabel m_dokumen_mutu (Arsip Laporan &amp; PDF): </w:t>
+      </w:r>
+      <w:r>
+        <w:t xml:space="preserve"> - Menyimpan berkas laporan bulanan mutu dan performa sarana prasarana yang diunggah dalam format PDF.</w:t>
+      </w:r>
+    </w:p>
+    <w:p>
+      <w:pPr>
+        <w:pStyle w:val="ListBullet"/>
+        <w:spacing w:after="80" w:line="276" w:lineRule="auto"/>
+        <w:ind w:left="360"/>
+      </w:pPr>
+      <w:r>
+        <w:t>Primary Key: id_dokumen</w:t>
+      </w:r>
+    </w:p>
+    <w:p>
+      <w:pPr>
+        <w:pStyle w:val="Heading2"/>
+        <w:keepNext/>
+        <w:spacing w:before="240" w:after="120"/>
+      </w:pPr>
+      <w:r>
+        <w:rPr>
+          <w:b/>
+          <w:color w:val="2E75B5"/>
+          <w:sz w:val="24"/>
+        </w:rPr>
+        <w:t>8.2 Hubungan Relasional Antar-Tabel (Database Relationships)</w:t>
+      </w:r>
+    </w:p>
+    <w:p>
+      <w:pPr>
+        <w:pStyle w:val="ListBullet"/>
+        <w:spacing w:after="80" w:line="276" w:lineRule="auto"/>
+        <w:ind w:left="360"/>
+      </w:pPr>
+      <w:r>
+        <w:t>One-to-Many (Ruangan ke Aset): Satu ruangan dapat memiliki banyak alat medis. Direlasikan melalui foreign key id_ruang_saat_ini di tabel t_aset.</w:t>
+      </w:r>
+    </w:p>
+    <w:p>
+      <w:pPr>
+        <w:pStyle w:val="ListBullet"/>
+        <w:spacing w:after="80" w:line="276" w:lineRule="auto"/>
+        <w:ind w:left="360"/>
+      </w:pPr>
+      <w:r>
+        <w:t>One-to-Many (Aset ke Troubleshoot): Satu alat medis dapat memiliki banyak catatan aduan kerusakan sepanjang masa pakainya. Direlasikan via foreign key id_aset di tabel t_troubleshoot.</w:t>
+      </w:r>
+    </w:p>
+    <w:p>
+      <w:pPr>
+        <w:pStyle w:val="ListBullet"/>
+        <w:spacing w:after="80" w:line="276" w:lineRule="auto"/>
+        <w:ind w:left="360"/>
+      </w:pPr>
+      <w:r>
+        <w:t>Many-to-One (Troubleshoot ke User): Banyak tiket kerusakan dapat dilaporkan oleh satu user pelapor (Unit_RS) atau ditangani oleh satu user teknisi (Staf_IPSRS).</w:t>
+      </w:r>
+    </w:p>
+    <w:p>
+      <w:pPr>
+        <w:pStyle w:val="ListBullet"/>
+        <w:spacing w:after="80" w:line="276" w:lineRule="auto"/>
+        <w:ind w:left="360"/>
+      </w:pPr>
+      <w:r>
+        <w:t>One-to-Many (Troubleshoot ke TroubleshootLog): Satu tiket kerusakan memiliki banyak log progres penanganan dari awal tiket dibuka hingga ditutup.</w:t>
       </w:r>
     </w:p>
     <w:sectPr>

</xml_diff>

<commit_message>
Docs: Update presentation guides with detailed database-to-file data lifecycle flow analysis
</commit_message>
<xml_diff>
--- a/Poin Poin dan Pemahaman Untuk Presentasi (Hasil Edit).docx
+++ b/Poin Poin dan Pemahaman Untuk Presentasi (Hasil Edit).docx
@@ -812,14 +812,6 @@
     </w:p>
     <w:p>
       <w:pPr>
-        <w:spacing w:after="120" w:line="276" w:lineRule="auto"/>
-      </w:pPr>
-      <w:r>
-        <w:t>Controller ini melayani rute halaman Aset web. Dosen biasanya menanyakan bagaimana validasi peran dan query databasenya bekerja di sini:</w:t>
-      </w:r>
-    </w:p>
-    <w:p>
-      <w:pPr>
         <w:pStyle w:val="ListBullet"/>
         <w:spacing w:after="80" w:line="276" w:lineRule="auto"/>
         <w:ind w:left="360"/>
@@ -1030,14 +1022,6 @@
     </w:p>
     <w:p>
       <w:pPr>
-        <w:spacing w:after="120" w:line="276" w:lineRule="auto"/>
-      </w:pPr>
-      <w:r>
-        <w:t>Laravel adalah framework PHP MVC (Model-View-Controller) yang dirancang untuk mempermudah pengembangan aplikasi web yang aman, terstruktur, dan mudah dirawat. Konsep penting yang harus dipahami:</w:t>
-      </w:r>
-    </w:p>
-    <w:p>
-      <w:pPr>
         <w:pStyle w:val="ListBullet"/>
         <w:spacing w:after="80" w:line="276" w:lineRule="auto"/>
         <w:ind w:left="360"/>
@@ -1093,14 +1077,6 @@
     </w:p>
     <w:p>
       <w:pPr>
-        <w:spacing w:after="120" w:line="276" w:lineRule="auto"/>
-      </w:pPr>
-      <w:r>
-        <w:t>React.js adalah library JavaScript yang dikembangkan oleh Meta untuk membangun antarmuka pengguna (UI) yang dinamis, cepat, dan interaktif. Konsep penting yang harus dipahami:</w:t>
-      </w:r>
-    </w:p>
-    <w:p>
-      <w:pPr>
         <w:pStyle w:val="ListBullet"/>
         <w:spacing w:after="80" w:line="276" w:lineRule="auto"/>
         <w:ind w:left="360"/>
@@ -1156,14 +1132,6 @@
     </w:p>
     <w:p>
       <w:pPr>
-        <w:spacing w:after="120" w:line="276" w:lineRule="auto"/>
-      </w:pPr>
-      <w:r>
-        <w:t>REST (Representational State Transfer) API adalah standar arsitektur komunikasi data antara sistem yang berbeda (dalam proyek ini antara backend Laravel dengan klien mobile Android Kotlin) dengan menggunakan protokol HTTP. Konsep penting yang harus dipahami:</w:t>
-      </w:r>
-    </w:p>
-    <w:p>
-      <w:pPr>
         <w:pStyle w:val="ListBullet"/>
         <w:spacing w:after="80" w:line="276" w:lineRule="auto"/>
         <w:ind w:left="360"/>
@@ -1435,14 +1403,6 @@
     </w:p>
     <w:p>
       <w:pPr>
-        <w:spacing w:after="120" w:line="276" w:lineRule="auto"/>
-      </w:pPr>
-      <w:r>
-        <w:t>Session adalah mekanisme penyimpanan informasi sementara di sisi server untuk melacak status login pengguna di web browser. Cara kerjanya:</w:t>
-      </w:r>
-    </w:p>
-    <w:p>
-      <w:pPr>
         <w:pStyle w:val="ListBullet"/>
         <w:spacing w:after="80" w:line="276" w:lineRule="auto"/>
         <w:ind w:left="360"/>
@@ -1488,14 +1448,6 @@
     </w:p>
     <w:p>
       <w:pPr>
-        <w:spacing w:after="120" w:line="276" w:lineRule="auto"/>
-      </w:pPr>
-      <w:r>
-        <w:t>Token adalah string acak unik yang digunakan untuk mengautentikasi pengguna pada REST API (mobile Android Kotlin). Cara kerjanya:</w:t>
-      </w:r>
-    </w:p>
-    <w:p>
-      <w:pPr>
         <w:pStyle w:val="ListBullet"/>
         <w:spacing w:after="80" w:line="276" w:lineRule="auto"/>
         <w:ind w:left="360"/>
@@ -1657,7 +1609,9 @@
     </w:p>
     <w:p>
       <w:pPr>
-        <w:spacing w:after="120" w:line="276" w:lineRule="auto"/>
+        <w:pStyle w:val="ListBullet"/>
+        <w:spacing w:after="80" w:line="276" w:lineRule="auto"/>
+        <w:ind w:left="360"/>
       </w:pPr>
       <w:r>
         <w:rPr>
@@ -1666,14 +1620,14 @@
         <w:t xml:space="preserve">1. Tabel m_user (Data Pengguna / Staff): </w:t>
       </w:r>
       <w:r>
-        <w:t xml:space="preserve"> - Menyimpan data pengguna sistem yang terbagi menjadi role Admin_IPSRS, Staf_IPSRS, Staf_Logistik, dan Unit_RS. Menyimpan ID ruangan (id_ruang) sebagai foreign key yang merelasikan user ke unit kerjanya.</w:t>
+        <w:t>Menyimpan data pengguna sistem yang terbagi menjadi role Admin_IPSRS, Staf_IPSRS, Staf_Logistik, dan Unit_RS. Menyimpan ID ruangan (id_ruang) sebagai foreign key yang merelasikan user ke unit kerjanya.</w:t>
       </w:r>
     </w:p>
     <w:p>
       <w:pPr>
         <w:pStyle w:val="ListBullet"/>
         <w:spacing w:after="80" w:line="276" w:lineRule="auto"/>
-        <w:ind w:left="360"/>
+        <w:ind w:left="720"/>
       </w:pPr>
       <w:r>
         <w:t>Primary Key: id_user</w:t>
@@ -1683,7 +1637,7 @@
       <w:pPr>
         <w:pStyle w:val="ListBullet"/>
         <w:spacing w:after="80" w:line="276" w:lineRule="auto"/>
-        <w:ind w:left="360"/>
+        <w:ind w:left="720"/>
       </w:pPr>
       <w:r>
         <w:t>Foreign Key: id_ruang -&gt; m_ruangan(id_ruang) untuk relasi penugasan ruangan staff.</w:t>
@@ -1691,7 +1645,9 @@
     </w:p>
     <w:p>
       <w:pPr>
-        <w:spacing w:after="120" w:line="276" w:lineRule="auto"/>
+        <w:pStyle w:val="ListBullet"/>
+        <w:spacing w:after="80" w:line="276" w:lineRule="auto"/>
+        <w:ind w:left="360"/>
       </w:pPr>
       <w:r>
         <w:rPr>
@@ -1700,14 +1656,14 @@
         <w:t xml:space="preserve">2. Tabel m_ruangan (Data Unit Ruangan): </w:t>
       </w:r>
       <w:r>
-        <w:t xml:space="preserve"> - Menyimpan seluruh daftar unit/ruangan rumah sakit (seperti ICU, IGD, OK, Poli, Logistik, IPSRS).</w:t>
+        <w:t>Menyimpan daftar unit kerja (IGD, ICU, OK, Poli, Logistik, IPSRS).</w:t>
       </w:r>
     </w:p>
     <w:p>
       <w:pPr>
         <w:pStyle w:val="ListBullet"/>
         <w:spacing w:after="80" w:line="276" w:lineRule="auto"/>
-        <w:ind w:left="360"/>
+        <w:ind w:left="720"/>
       </w:pPr>
       <w:r>
         <w:t>Primary Key: id_ruang</w:t>
@@ -1717,7 +1673,7 @@
       <w:pPr>
         <w:pStyle w:val="ListBullet"/>
         <w:spacing w:after="80" w:line="276" w:lineRule="auto"/>
-        <w:ind w:left="360"/>
+        <w:ind w:left="720"/>
       </w:pPr>
       <w:r>
         <w:t>Unique Key: nama_ruang (untuk mencegah duplikasi nama ruangan).</w:t>
@@ -1725,7 +1681,9 @@
     </w:p>
     <w:p>
       <w:pPr>
-        <w:spacing w:after="120" w:line="276" w:lineRule="auto"/>
+        <w:pStyle w:val="ListBullet"/>
+        <w:spacing w:after="80" w:line="276" w:lineRule="auto"/>
+        <w:ind w:left="360"/>
       </w:pPr>
       <w:r>
         <w:rPr>
@@ -1734,14 +1692,14 @@
         <w:t xml:space="preserve">3. Tabel t_aset (Data Alat Medis): </w:t>
       </w:r>
       <w:r>
-        <w:t xml:space="preserve"> - Menyimpan katalog inventaris alat medis beserta detail kelaikan operasional, nomor seri, dan koordinat tracking posisi GPS.</w:t>
+        <w:t>Menyimpan katalog inventaris aset medis beserta detail kelaikan operasional, nomor seri, dan koordinat tracking posisi GPS.</w:t>
       </w:r>
     </w:p>
     <w:p>
       <w:pPr>
         <w:pStyle w:val="ListBullet"/>
         <w:spacing w:after="80" w:line="276" w:lineRule="auto"/>
-        <w:ind w:left="360"/>
+        <w:ind w:left="720"/>
       </w:pPr>
       <w:r>
         <w:t>Primary Key: id_aset</w:t>
@@ -1751,7 +1709,7 @@
       <w:pPr>
         <w:pStyle w:val="ListBullet"/>
         <w:spacing w:after="80" w:line="276" w:lineRule="auto"/>
-        <w:ind w:left="360"/>
+        <w:ind w:left="720"/>
       </w:pPr>
       <w:r>
         <w:t>Unique Key: kode_label (contoh: MED-001, MED-002)</w:t>
@@ -1761,7 +1719,7 @@
       <w:pPr>
         <w:pStyle w:val="ListBullet"/>
         <w:spacing w:after="80" w:line="276" w:lineRule="auto"/>
-        <w:ind w:left="360"/>
+        <w:ind w:left="720"/>
       </w:pPr>
       <w:r>
         <w:t>Foreign Key: id_ruang_saat_ini -&gt; m_ruangan(id_ruang) untuk melacak lokasi terkini alat.</w:t>
@@ -1771,7 +1729,7 @@
       <w:pPr>
         <w:pStyle w:val="ListBullet"/>
         <w:spacing w:after="80" w:line="276" w:lineRule="auto"/>
-        <w:ind w:left="360"/>
+        <w:ind w:left="720"/>
       </w:pPr>
       <w:r>
         <w:t>Kolom Tracking: latitude, longitude (menyimpan koordinat GPS dari sensor mobile).</w:t>
@@ -1781,7 +1739,7 @@
       <w:pPr>
         <w:pStyle w:val="ListBullet"/>
         <w:spacing w:after="80" w:line="276" w:lineRule="auto"/>
-        <w:ind w:left="360"/>
+        <w:ind w:left="720"/>
       </w:pPr>
       <w:r>
         <w:t>Kolom Kalibrasi: tgl_kalibrasi_terakhir, tgl_kalibrasi_berikutnya, tgl_kadaluarsa_sertif.</w:t>
@@ -1789,7 +1747,9 @@
     </w:p>
     <w:p>
       <w:pPr>
-        <w:spacing w:after="120" w:line="276" w:lineRule="auto"/>
+        <w:pStyle w:val="ListBullet"/>
+        <w:spacing w:after="80" w:line="276" w:lineRule="auto"/>
+        <w:ind w:left="360"/>
       </w:pPr>
       <w:r>
         <w:rPr>
@@ -1798,14 +1758,14 @@
         <w:t xml:space="preserve">4. Tabel t_mutasi (Log Perpindahan Aset): </w:t>
       </w:r>
       <w:r>
-        <w:t xml:space="preserve"> - Mencatat riwayat pemindahan alat medis antar-ruangan untuk kebutuhan inventaris.</w:t>
+        <w:t>Mencatat riwayat pemindahan alat medis antar-ruangan untuk kebutuhan inventaris.</w:t>
       </w:r>
     </w:p>
     <w:p>
       <w:pPr>
         <w:pStyle w:val="ListBullet"/>
         <w:spacing w:after="80" w:line="276" w:lineRule="auto"/>
-        <w:ind w:left="360"/>
+        <w:ind w:left="720"/>
       </w:pPr>
       <w:r>
         <w:t>Primary Key: id_mutasi</w:t>
@@ -1815,7 +1775,7 @@
       <w:pPr>
         <w:pStyle w:val="ListBullet"/>
         <w:spacing w:after="80" w:line="276" w:lineRule="auto"/>
-        <w:ind w:left="360"/>
+        <w:ind w:left="720"/>
       </w:pPr>
       <w:r>
         <w:t>Foreign Keys: id_aset -&gt; t_aset(id_aset), id_ruang_asal -&gt; m_ruangan(id_ruang), id_ruang_tujuan -&gt; m_ruangan(id_ruang), user_id -&gt; m_user(id_user).</w:t>
@@ -1825,7 +1785,7 @@
       <w:pPr>
         <w:pStyle w:val="ListBullet"/>
         <w:spacing w:after="80" w:line="276" w:lineRule="auto"/>
-        <w:ind w:left="360"/>
+        <w:ind w:left="720"/>
       </w:pPr>
       <w:r>
         <w:t>Status: status_mutasi (Menunggu_Verifikasi, Disetujui, Ditolak).</w:t>
@@ -1833,7 +1793,9 @@
     </w:p>
     <w:p>
       <w:pPr>
-        <w:spacing w:after="120" w:line="276" w:lineRule="auto"/>
+        <w:pStyle w:val="ListBullet"/>
+        <w:spacing w:after="80" w:line="276" w:lineRule="auto"/>
+        <w:ind w:left="360"/>
       </w:pPr>
       <w:r>
         <w:rPr>
@@ -1842,14 +1804,14 @@
         <w:t xml:space="preserve">5. Tabel t_troubleshoot (Tiket Laporan Kerusakan): </w:t>
       </w:r>
       <w:r>
-        <w:t xml:space="preserve"> - Menyimpan tiket aduan kerusakan alat medis (Work Order) yang diajukan oleh unit medis.</w:t>
+        <w:t>Menyimpan tiket aduan kerusakan alat medis (Work Order) yang diajukan oleh unit medis.</w:t>
       </w:r>
     </w:p>
     <w:p>
       <w:pPr>
         <w:pStyle w:val="ListBullet"/>
         <w:spacing w:after="80" w:line="276" w:lineRule="auto"/>
-        <w:ind w:left="360"/>
+        <w:ind w:left="720"/>
       </w:pPr>
       <w:r>
         <w:t>Primary Key: id_ticket</w:t>
@@ -1859,7 +1821,7 @@
       <w:pPr>
         <w:pStyle w:val="ListBullet"/>
         <w:spacing w:after="80" w:line="276" w:lineRule="auto"/>
-        <w:ind w:left="360"/>
+        <w:ind w:left="720"/>
       </w:pPr>
       <w:r>
         <w:t>Foreign Keys: id_aset -&gt; t_aset(id_aset), id_user_pelapor -&gt; m_user(id_user), id_teknisi_penanggungjawab -&gt; m_user(id_user).</w:t>
@@ -1869,7 +1831,7 @@
       <w:pPr>
         <w:pStyle w:val="ListBullet"/>
         <w:spacing w:after="80" w:line="276" w:lineRule="auto"/>
-        <w:ind w:left="360"/>
+        <w:ind w:left="720"/>
       </w:pPr>
       <w:r>
         <w:t>Status: status_ticket (Open, Pengecekan, Dikerjakan, Menunggu Sign-Off, Closed).</w:t>
@@ -1877,7 +1839,9 @@
     </w:p>
     <w:p>
       <w:pPr>
-        <w:spacing w:after="120" w:line="276" w:lineRule="auto"/>
+        <w:pStyle w:val="ListBullet"/>
+        <w:spacing w:after="80" w:line="276" w:lineRule="auto"/>
+        <w:ind w:left="360"/>
       </w:pPr>
       <w:r>
         <w:rPr>
@@ -1886,14 +1850,14 @@
         <w:t xml:space="preserve">6. Tabel t_troubleshoot_log (Riwayat Progress Tiket): </w:t>
       </w:r>
       <w:r>
-        <w:t xml:space="preserve"> - Mencatat kronologis perubahan status pengerjaan tiket kerusakan secara transaksional untuk audit trail log.</w:t>
+        <w:t>Mencatat kronologis perubahan status pengerjaan tiket kerusakan secara transaksional untuk audit trail log.</w:t>
       </w:r>
     </w:p>
     <w:p>
       <w:pPr>
         <w:pStyle w:val="ListBullet"/>
         <w:spacing w:after="80" w:line="276" w:lineRule="auto"/>
-        <w:ind w:left="360"/>
+        <w:ind w:left="720"/>
       </w:pPr>
       <w:r>
         <w:t>Primary Key: id_log</w:t>
@@ -1903,7 +1867,7 @@
       <w:pPr>
         <w:pStyle w:val="ListBullet"/>
         <w:spacing w:after="80" w:line="276" w:lineRule="auto"/>
-        <w:ind w:left="360"/>
+        <w:ind w:left="720"/>
       </w:pPr>
       <w:r>
         <w:t>Foreign Keys: id_ticket -&gt; t_troubleshoot(id_ticket), diubah_oleh -&gt; m_user(id_user).</w:t>
@@ -1911,7 +1875,9 @@
     </w:p>
     <w:p>
       <w:pPr>
-        <w:spacing w:after="120" w:line="276" w:lineRule="auto"/>
+        <w:pStyle w:val="ListBullet"/>
+        <w:spacing w:after="80" w:line="276" w:lineRule="auto"/>
+        <w:ind w:left="360"/>
       </w:pPr>
       <w:r>
         <w:rPr>
@@ -1920,14 +1886,14 @@
         <w:t xml:space="preserve">7. Tabel m_pemeliharaan &amp; t_pemeliharaan_log (Penjadwalan PM): </w:t>
       </w:r>
       <w:r>
-        <w:t xml:space="preserve"> - Menyimpan jadwal pemeliharaan preventif (Preventative Maintenance) berkala untuk masing-masing aset.</w:t>
+        <w:t>Menyimpan jadwal pemeliharaan preventif (Preventative Maintenance) berkala untuk masing-masing aset.</w:t>
       </w:r>
     </w:p>
     <w:p>
       <w:pPr>
         <w:pStyle w:val="ListBullet"/>
         <w:spacing w:after="80" w:line="276" w:lineRule="auto"/>
-        <w:ind w:left="360"/>
+        <w:ind w:left="720"/>
       </w:pPr>
       <w:r>
         <w:t>Primary Key: id_pemeliharaan &amp; id_log_pemeliharaan</w:t>
@@ -1937,7 +1903,7 @@
       <w:pPr>
         <w:pStyle w:val="ListBullet"/>
         <w:spacing w:after="80" w:line="276" w:lineRule="auto"/>
-        <w:ind w:left="360"/>
+        <w:ind w:left="720"/>
       </w:pPr>
       <w:r>
         <w:t>Foreign Keys: id_aset -&gt; t_aset(id_aset).</w:t>
@@ -1945,7 +1911,9 @@
     </w:p>
     <w:p>
       <w:pPr>
-        <w:spacing w:after="120" w:line="276" w:lineRule="auto"/>
+        <w:pStyle w:val="ListBullet"/>
+        <w:spacing w:after="80" w:line="276" w:lineRule="auto"/>
+        <w:ind w:left="360"/>
       </w:pPr>
       <w:r>
         <w:rPr>
@@ -1954,14 +1922,14 @@
         <w:t xml:space="preserve">8. Tabel m_dokumen_mutu (Arsip Laporan &amp; PDF): </w:t>
       </w:r>
       <w:r>
-        <w:t xml:space="preserve"> - Menyimpan berkas laporan bulanan mutu dan performa sarana prasarana yang diunggah dalam format PDF.</w:t>
+        <w:t>Menyimpan berkas laporan bulanan mutu dan performa sarana prasarana yang diunggah dalam format PDF.</w:t>
       </w:r>
     </w:p>
     <w:p>
       <w:pPr>
         <w:pStyle w:val="ListBullet"/>
         <w:spacing w:after="80" w:line="276" w:lineRule="auto"/>
-        <w:ind w:left="360"/>
+        <w:ind w:left="720"/>
       </w:pPr>
       <w:r>
         <w:t>Primary Key: id_dokumen</w:t>
@@ -2020,6 +1988,179 @@
       </w:pPr>
       <w:r>
         <w:t>One-to-Many (Troubleshoot ke TroubleshootLog): Satu tiket kerusakan memiliki banyak log progres penanganan dari awal tiket dibuka hingga ditutup.</w:t>
+      </w:r>
+    </w:p>
+    <w:p>
+      <w:pPr>
+        <w:pStyle w:val="Heading1"/>
+        <w:keepNext/>
+        <w:spacing w:before="360" w:after="160"/>
+      </w:pPr>
+      <w:r>
+        <w:rPr>
+          <w:b/>
+          <w:color w:val="1F4E79"/>
+          <w:sz w:val="28"/>
+        </w:rPr>
+        <w:t>BAB IX: SIRKULASI ALIRAN DATA ANTARA BERKAS KODE (FILE) DAN TABEL DATABASE</w:t>
+      </w:r>
+    </w:p>
+    <w:p>
+      <w:pPr>
+        <w:spacing w:after="120" w:line="276" w:lineRule="auto"/>
+      </w:pPr>
+      <w:r>
+        <w:t>Untuk memahami cara kerja framework secara utuh, berikut adalah sirkulasi/siklus aliran data yang menggambarkan bagaimana berkas kode program (View, Controller, Model) berinteraksi dengan database MySQL:</w:t>
+      </w:r>
+    </w:p>
+    <w:p>
+      <w:pPr>
+        <w:pStyle w:val="Heading2"/>
+        <w:keepNext/>
+        <w:spacing w:before="240" w:after="120"/>
+      </w:pPr>
+      <w:r>
+        <w:rPr>
+          <w:b/>
+          <w:color w:val="2E75B5"/>
+          <w:sz w:val="24"/>
+        </w:rPr>
+        <w:t>9.1 Sirkulasi Aliran Data pada Fitur Pelaporan Kerusakan (Work Order)</w:t>
+      </w:r>
+    </w:p>
+    <w:p>
+      <w:pPr>
+        <w:pStyle w:val="ListBullet"/>
+        <w:spacing w:after="80" w:line="276" w:lineRule="auto"/>
+        <w:ind w:left="360"/>
+      </w:pPr>
+      <w:r>
+        <w:t>Frontend (View): Staf medis (Unit_RS) mengisi formulir laporan kerusakan di berkas resources/js/Pages/WorkOrder/Create.jsx, mengunggah foto bukti kerusakan, dan menekan tombol 'Kirim'. Request dikirim melalui Inertia.post('/workorder').</w:t>
+      </w:r>
+    </w:p>
+    <w:p>
+      <w:pPr>
+        <w:pStyle w:val="ListBullet"/>
+        <w:spacing w:after="80" w:line="276" w:lineRule="auto"/>
+        <w:ind w:left="360"/>
+      </w:pPr>
+      <w:r>
+        <w:t>Routing: Rute URL /workorder ditangkap oleh berkas routes/web.php dan diteruskan ke method store() pada berkas app/Http/Controllers/Web/WorkOrderController.php.</w:t>
+      </w:r>
+    </w:p>
+    <w:p>
+      <w:pPr>
+        <w:pStyle w:val="ListBullet"/>
+        <w:spacing w:after="80" w:line="276" w:lineRule="auto"/>
+        <w:ind w:left="360"/>
+      </w:pPr>
+      <w:r>
+        <w:t>Controller (Logika Backend): WorkOrderController memvalidasi data masukan (id_aset, deskripsi_kerusakan). Kemudian, Controller memanggil model Troubleshoot.php untuk menyimpan data.</w:t>
+      </w:r>
+    </w:p>
+    <w:p>
+      <w:pPr>
+        <w:pStyle w:val="ListBullet"/>
+        <w:spacing w:after="80" w:line="276" w:lineRule="auto"/>
+        <w:ind w:left="360"/>
+      </w:pPr>
+      <w:r>
+        <w:t>Model &amp; Database: Berkas app/Models/Troubleshoot.php melakukan kueri INSERT ke tabel t_troubleshoot di MySQL untuk mencatat baris data baru dengan status_ticket = 'Open'.</w:t>
+      </w:r>
+    </w:p>
+    <w:p>
+      <w:pPr>
+        <w:pStyle w:val="ListBullet"/>
+        <w:spacing w:after="80" w:line="276" w:lineRule="auto"/>
+        <w:ind w:left="360"/>
+      </w:pPr>
+      <w:r>
+        <w:t>Umpan Balik (Response): Controller mengembalikan rute redirect kembali ke halaman index Work Order dengan menyertakan flash message sukses. Berkas resources/js/Pages/WorkOrder/Index.jsx menerima shared props, me-reload tabel secara reaktif, dan menampilkan tiket baru tersebut di daftar.</w:t>
+      </w:r>
+    </w:p>
+    <w:p>
+      <w:pPr>
+        <w:pStyle w:val="Heading2"/>
+        <w:keepNext/>
+        <w:spacing w:before="240" w:after="120"/>
+      </w:pPr>
+      <w:r>
+        <w:rPr>
+          <w:b/>
+          <w:color w:val="2E75B5"/>
+          <w:sz w:val="24"/>
+        </w:rPr>
+        <w:t>9.2 Sirkulasi Aliran Data pada Fitur Pengajuan Mutasi Aset</w:t>
+      </w:r>
+    </w:p>
+    <w:p>
+      <w:pPr>
+        <w:pStyle w:val="ListBullet"/>
+        <w:spacing w:after="80" w:line="276" w:lineRule="auto"/>
+        <w:ind w:left="360"/>
+      </w:pPr>
+      <w:r>
+        <w:t>Frontend (View): Pengguna Unit_RS membuka berkas resources/js/Pages/Mutasi/Create.jsx, memilih alat medis yang ingin dimutasi, memilih unit ruangan tujuan, dan mengklik tombol 'Ajukan Mutasi'.</w:t>
+      </w:r>
+    </w:p>
+    <w:p>
+      <w:pPr>
+        <w:pStyle w:val="ListBullet"/>
+        <w:spacing w:after="80" w:line="276" w:lineRule="auto"/>
+        <w:ind w:left="360"/>
+      </w:pPr>
+      <w:r>
+        <w:t>Routing &amp; Controller: Request POST dikirim ke rute /mutasi dan diolah oleh MutasiController@store. Berkas ini berinteraksi dengan model Mutasi.php untuk membuat record log baru dengan status 'Menunggu_Verifikasi' pada tabel t_mutasi.</w:t>
+      </w:r>
+    </w:p>
+    <w:p>
+      <w:pPr>
+        <w:pStyle w:val="ListBullet"/>
+        <w:spacing w:after="80" w:line="276" w:lineRule="auto"/>
+        <w:ind w:left="360"/>
+      </w:pPr>
+      <w:r>
+        <w:t>IPSRS Verifikasi (Approval): Admin IPSRS membuka halaman resources/js/Pages/Mutasi/Index.jsx, melihat status pending, dan menekan tombol 'Approve'.</w:t>
+      </w:r>
+    </w:p>
+    <w:p>
+      <w:pPr>
+        <w:pStyle w:val="ListBullet"/>
+        <w:spacing w:after="80" w:line="276" w:lineRule="auto"/>
+        <w:ind w:left="360"/>
+      </w:pPr>
+      <w:r>
+        <w:t>Database Transaction: Request persetujuan dikirim ke MutasiController@verify. Di dalam blok DB::transaction():</w:t>
+      </w:r>
+    </w:p>
+    <w:p>
+      <w:pPr>
+        <w:pStyle w:val="ListBullet"/>
+        <w:spacing w:after="80" w:line="276" w:lineRule="auto"/>
+        <w:ind w:left="720"/>
+      </w:pPr>
+      <w:r>
+        <w:t>Model Aset.php diinstruksikan untuk memperbarui kolom id_ruang_saat_ini pada tabel t_aset (mengubah lokasi fisik alat medis).</w:t>
+      </w:r>
+    </w:p>
+    <w:p>
+      <w:pPr>
+        <w:pStyle w:val="ListBullet"/>
+        <w:spacing w:after="80" w:line="276" w:lineRule="auto"/>
+        <w:ind w:left="720"/>
+      </w:pPr>
+      <w:r>
+        <w:t>Model Mutasi.php memperbarui status_mutasi di tabel t_mutasi menjadi 'Disetujui'.</w:t>
+      </w:r>
+    </w:p>
+    <w:p>
+      <w:pPr>
+        <w:pStyle w:val="ListBullet"/>
+        <w:spacing w:after="80" w:line="276" w:lineRule="auto"/>
+        <w:ind w:left="360"/>
+      </w:pPr>
+      <w:r>
+        <w:t>Selesai &amp; Render: DB::commit() menyimpan perubahan secara permanen, dan Inertia memicu re-render halaman sehingga status di layar berubah menjadi Approved dan lokasi aset terbarui secara real-time.</w:t>
       </w:r>
     </w:p>
     <w:sectPr>

</xml_diff>

<commit_message>
Docs: Complete 10-chapter guide with Inertia communications protocol and RBAC security analysis
</commit_message>
<xml_diff>
--- a/Poin Poin dan Pemahaman Untuk Presentasi (Hasil Edit).docx
+++ b/Poin Poin dan Pemahaman Untuk Presentasi (Hasil Edit).docx
@@ -1057,7 +1057,7 @@
         <w:ind w:left="360"/>
       </w:pPr>
       <w:r>
-        <w:t>Database Transactions: Mekanisme pengelompokan beberapa perintah database (insert/update/delete) menjadi satu kesatuan (unit of work). Jika salah satu perintah gagal, semua perintah dibatalkan secara otomatis (rollback) menggunakan DB::rollBack(). Jika semuanya sukses, data disimpan permanen menggunakan DB::commit(). Ini menjaga integritas data.</w:t>
+        <w:t>Database Transactions: Pengelompokan beberapa perintah database (insert/update/delete) menjadi satu kesatuan (unit of work). Jika salah satu perintah gagal, semua perintah dibatalkan secara otomatis (rollback) menggunakan DB::rollBack(). Jika semuanya sukses, data disimpan permanen menggunakan DB::commit(). Ini menjaga integritas data.</w:t>
       </w:r>
     </w:p>
     <w:p>
@@ -1082,7 +1082,7 @@
         <w:ind w:left="360"/>
       </w:pPr>
       <w:r>
-        <w:t>Component-based Architecture: Aplikasi dipecah menjadi bagian-bagian kecil yang mandiri (reusable components). Contoh: Navbar, Sidebar, dan FormModal dibuat sekali dan dipanggil berulang-ulang di halaman yang berbeda.</w:t>
+        <w:t>Component-based Architecture: UI dipecah menjadi bagian-bagian kecil yang mandiri (reusable components). Contoh: Navbar, Sidebar, dan FormModal dibuat sekali dan dipanggil berulang-ulang di halaman yang berbeda.</w:t>
       </w:r>
     </w:p>
     <w:p>
@@ -2161,6 +2161,150 @@
       </w:pPr>
       <w:r>
         <w:t>Selesai &amp; Render: DB::commit() menyimpan perubahan secara permanen, dan Inertia memicu re-render halaman sehingga status di layar berubah menjadi Approved dan lokasi aset terbarui secara real-time.</w:t>
+      </w:r>
+    </w:p>
+    <w:p>
+      <w:pPr>
+        <w:pStyle w:val="Heading1"/>
+        <w:keepNext/>
+        <w:spacing w:before="360" w:after="160"/>
+      </w:pPr>
+      <w:r>
+        <w:rPr>
+          <w:b/>
+          <w:color w:val="1F4E79"/>
+          <w:sz w:val="28"/>
+        </w:rPr>
+        <w:t>BAB X: BEDAH DETAIL KONSEPTUAL DAN PROTOKOL KUNCI FRAMEWORK</w:t>
+      </w:r>
+    </w:p>
+    <w:p>
+      <w:pPr>
+        <w:pStyle w:val="Heading2"/>
+        <w:keepNext/>
+        <w:spacing w:before="240" w:after="120"/>
+      </w:pPr>
+      <w:r>
+        <w:rPr>
+          <w:b/>
+          <w:color w:val="2E75B5"/>
+          <w:sz w:val="24"/>
+        </w:rPr>
+        <w:t>10.1 Protokol Komunikasi Inertia.js (Bridges Between Backend and Frontend)</w:t>
+      </w:r>
+    </w:p>
+    <w:p>
+      <w:pPr>
+        <w:spacing w:after="120" w:line="276" w:lineRule="auto"/>
+      </w:pPr>
+      <w:r>
+        <w:t>Inertia.js menghilangkan kebutuhan pembuatan endpoint API JSON manual untuk klien web. Protokol ini bekerja dengan mengirimkan header request khusus:</w:t>
+      </w:r>
+    </w:p>
+    <w:p>
+      <w:pPr>
+        <w:pStyle w:val="ListBullet"/>
+        <w:spacing w:after="80" w:line="276" w:lineRule="auto"/>
+        <w:ind w:left="360"/>
+      </w:pPr>
+      <w:r>
+        <w:t>X-Inertia: true -&gt; Header HTTP yang dikirimkan oleh browser untuk memberi tahu backend Laravel bahwa ini adalah request dinamis dari React, bukan request halaman biasa.</w:t>
+      </w:r>
+    </w:p>
+    <w:p>
+      <w:pPr>
+        <w:pStyle w:val="ListBullet"/>
+        <w:spacing w:after="80" w:line="276" w:lineRule="auto"/>
+        <w:ind w:left="360"/>
+      </w:pPr>
+      <w:r>
+        <w:t>Jika header X-Inertia bernilai true, Laravel melalui middleware Inertia akan membatalkan rendering file view Blade HTML mentah, dan sebaliknya mengembalikan representasi payload JSON murni yang berisi nama komponen Page React dan array props data.</w:t>
+      </w:r>
+    </w:p>
+    <w:p>
+      <w:pPr>
+        <w:pStyle w:val="ListBullet"/>
+        <w:spacing w:after="80" w:line="276" w:lineRule="auto"/>
+        <w:ind w:left="360"/>
+      </w:pPr>
+      <w:r>
+        <w:t>Jika pengguna memasukkan URL secara manual di browser (request biasa pertama kali), Laravel akan menyajikan halaman Blade utama (app.blade.php) yang memuat file bundler JavaScript (vite/app.jsx), lalu Inertia akan me-mount halaman React yang sesuai di dalam elemen div root.</w:t>
+      </w:r>
+    </w:p>
+    <w:p>
+      <w:pPr>
+        <w:pStyle w:val="Heading2"/>
+        <w:keepNext/>
+        <w:spacing w:before="240" w:after="120"/>
+      </w:pPr>
+      <w:r>
+        <w:rPr>
+          <w:b/>
+          <w:color w:val="2E75B5"/>
+          <w:sz w:val="24"/>
+        </w:rPr>
+        <w:t>10.2 Keamanan Otorisasi Berbasis Peran (Role-Based Access Control / RBAC) di Laravel</w:t>
+      </w:r>
+    </w:p>
+    <w:p>
+      <w:pPr>
+        <w:spacing w:after="120" w:line="276" w:lineRule="auto"/>
+      </w:pPr>
+      <w:r>
+        <w:t>Sistem keamanan MedTrack memadukan pengamanan berlapis:</w:t>
+      </w:r>
+    </w:p>
+    <w:p>
+      <w:pPr>
+        <w:pStyle w:val="ListBullet"/>
+        <w:spacing w:after="80" w:line="276" w:lineRule="auto"/>
+        <w:ind w:left="360"/>
+      </w:pPr>
+      <w:r>
+        <w:t>Middleware 'auth' Session -&gt; Memastikan pengguna sudah login di level web browser sebelum rute routes/web.php diproses.</w:t>
+      </w:r>
+    </w:p>
+    <w:p>
+      <w:pPr>
+        <w:pStyle w:val="ListBullet"/>
+        <w:spacing w:after="80" w:line="276" w:lineRule="auto"/>
+        <w:ind w:left="360"/>
+      </w:pPr>
+      <w:r>
+        <w:t>Logic-Level Authorization -&gt; Di dalam controller, hak akses CRUD diuji ketat menggunakan fungsi abort(403) jika user tidak memiliki role yang diizinkan, sehingga mencegah eksploitasi URL (seperti memanggil edit aset menggunakan URL POST manual).</w:t>
+      </w:r>
+    </w:p>
+    <w:p>
+      <w:pPr>
+        <w:pStyle w:val="Heading2"/>
+        <w:keepNext/>
+        <w:spacing w:before="240" w:after="120"/>
+      </w:pPr>
+      <w:r>
+        <w:rPr>
+          <w:b/>
+          <w:color w:val="2E75B5"/>
+          <w:sz w:val="24"/>
+        </w:rPr>
+        <w:t>10.3 State Synchronization dan React Reactivity</w:t>
+      </w:r>
+    </w:p>
+    <w:p>
+      <w:pPr>
+        <w:spacing w:after="120" w:line="276" w:lineRule="auto"/>
+      </w:pPr>
+      <w:r>
+        <w:t>Saat form disubmit menggunakan Inertia (misalnya router.post('/aset', data)), Inertia secara otomatis mengelola siklus state React:</w:t>
+      </w:r>
+    </w:p>
+    <w:p>
+      <w:pPr>
+        <w:pStyle w:val="ListBullet"/>
+        <w:spacing w:after="80" w:line="276" w:lineRule="auto"/>
+        <w:ind w:left="360"/>
+      </w:pPr>
+      <w:r>
+        <w:t>Inertia mengirim request POST -&gt; Laravel memproses dan melakukan redirect kembali -&gt; Inertia di sisi frontend menangkap redirect tersebut, memperbarui properti props komponen secara dinamis di memori, dan memicu Virtual DOM React untuk me-render ulang elemen-elemen UI yang berubah saja tanpa melakukan full page refresh.</w:t>
       </w:r>
     </w:p>
     <w:sectPr>

</xml_diff>